<commit_message>
v2: revised Lesson 4 cleft sentences
Changes:
- Part 1: Two proofreading paragraphs (technology & laziness) with 5 errors each
  covering relative clauses, inverted patterns and nominalisation
- Removed Part 2 gap-fill warm-up
- Part 2 (was Part 3): 4 cleft patterns with plain/formal tables + demo paragraphs
  (technology & communication theme); removed paragraph openers section
- Part 3 (was Part 4): 8 practice sets; sets 1-4 straightforward, sets 5-8 require
  part-of-speech changes
- Part 4 (was Part 5): Writing task on AI influence + recommendation
</commit_message>
<xml_diff>
--- a/Lesson 4 - Cleft sentences (Student's).docx
+++ b/Lesson 4 - Cleft sentences (Student's).docx
@@ -101,157 +101,31 @@
         <w:rPr>
           <w:rFonts w:cs="Times New Roman"/>
         </w:rPr>
-        <w:t xml:space="preserve">Each sentence contains TWO errors: one in the form of a word (noun or adjective) and one in an inverted structure. Proofread the sentences.</w:t>
+        <w:t xml:space="preserve">Each paragraph contains FIVE errors. The errors include relative clauses, inverted patterns and nominalisation. Proofread the paragraphs.</w:t>
       </w:r>
     </w:p>
-    <w:tbl>
-      <w:tblPr>
-        <w:tblStyle w:val="TableGrid"/>
-        <w:tblW w:w="0" w:type="auto"/>
-        <w:tblLook w:val="04A0" w:firstRow="1" w:lastRow="0" w:firstColumn="1" w:lastColumn="0" w:noHBand="0" w:noVBand="1"/>
-      </w:tblPr>
-      <w:tblGrid>
-        <w:gridCol w:w="9350"/>
-      </w:tblGrid>
-      <w:tr>
-        <w:tc>
-          <w:tcPr>
-            <w:tcW w:w="9350" w:type="dxa"/>
-          </w:tcPr>
-          <w:p>
-            <w:pPr>
-              <w:pStyle w:val="ListParagraph"/>
-              <w:numPr>
-                <w:ilvl w:val="0"/>
-                <w:numId w:val="10"/>
-              </w:numPr>
-              <w:spacing w:before="240" w:line="276" w:lineRule="auto"/>
-            </w:pPr>
-            <w:r>
-              <w:rPr>
-                <w:rFonts w:cs="Times New Roman"/>
-              </w:rPr>
-              <w:t xml:space="preserve">Not only the new canteen is convenient for students, but the convenient of its online ordering system also attracts busy teachers.</w:t>
-            </w:r>
-          </w:p>
-        </w:tc>
-      </w:tr>
-      <w:tr>
-        <w:tc>
-          <w:tcPr>
-            <w:tcW w:w="9350" w:type="dxa"/>
-          </w:tcPr>
-          <w:p>
-            <w:pPr>
-              <w:pStyle w:val="ListParagraph"/>
-              <w:numPr>
-                <w:ilvl w:val="0"/>
-                <w:numId w:val="10"/>
-              </w:numPr>
-              <w:spacing w:before="240" w:line="276" w:lineRule="auto"/>
-            </w:pPr>
-            <w:r>
-              <w:rPr>
-                <w:rFonts w:cs="Times New Roman"/>
-              </w:rPr>
-              <w:t xml:space="preserve">Only by eating breakfast students can keep their energy up, yet many teenagers do not realise the important of a proper diet.</w:t>
-            </w:r>
-          </w:p>
-        </w:tc>
-      </w:tr>
-      <w:tr>
-        <w:tc>
-          <w:tcPr>
-            <w:tcW w:w="9350" w:type="dxa"/>
-          </w:tcPr>
-          <w:p>
-            <w:pPr>
-              <w:pStyle w:val="ListParagraph"/>
-              <w:numPr>
-                <w:ilvl w:val="0"/>
-                <w:numId w:val="10"/>
-              </w:numPr>
-              <w:spacing w:before="240" w:line="276" w:lineRule="auto"/>
-            </w:pPr>
-            <w:r>
-              <w:rPr>
-                <w:rFonts w:cs="Times New Roman"/>
-              </w:rPr>
-              <w:t xml:space="preserve">Never the school has displayed its old photographs in the hall, although the significant of that history is obvious to former students.</w:t>
-            </w:r>
-          </w:p>
-        </w:tc>
-      </w:tr>
-      <w:tr>
-        <w:tc>
-          <w:tcPr>
-            <w:tcW w:w="9350" w:type="dxa"/>
-          </w:tcPr>
-          <w:p>
-            <w:pPr>
-              <w:pStyle w:val="ListParagraph"/>
-              <w:numPr>
-                <w:ilvl w:val="0"/>
-                <w:numId w:val="10"/>
-              </w:numPr>
-              <w:spacing w:before="240" w:line="276" w:lineRule="auto"/>
-            </w:pPr>
-            <w:r>
-              <w:rPr>
-                <w:rFonts w:cs="Times New Roman"/>
-              </w:rPr>
-              <w:t xml:space="preserve">Only by showing customers how their products are made shops can prove the authentic of their products.</w:t>
-            </w:r>
-          </w:p>
-        </w:tc>
-      </w:tr>
-      <w:tr>
-        <w:tc>
-          <w:tcPr>
-            <w:tcW w:w="9350" w:type="dxa"/>
-          </w:tcPr>
-          <w:p>
-            <w:pPr>
-              <w:pStyle w:val="ListParagraph"/>
-              <w:numPr>
-                <w:ilvl w:val="0"/>
-                <w:numId w:val="10"/>
-              </w:numPr>
-              <w:spacing w:before="240" w:line="276" w:lineRule="auto"/>
-            </w:pPr>
-            <w:r>
-              <w:rPr>
-                <w:rFonts w:cs="Times New Roman"/>
-              </w:rPr>
-              <w:t xml:space="preserve">Not only losing sleep affects students’ test results, but the lose of concentration in class is also a serious problem.</w:t>
-            </w:r>
-          </w:p>
-        </w:tc>
-      </w:tr>
-      <w:tr>
-        <w:tc>
-          <w:tcPr>
-            <w:tcW w:w="9350" w:type="dxa"/>
-          </w:tcPr>
-          <w:p>
-            <w:pPr>
-              <w:pStyle w:val="ListParagraph"/>
-              <w:numPr>
-                <w:ilvl w:val="0"/>
-                <w:numId w:val="10"/>
-              </w:numPr>
-              <w:spacing w:before="240" w:line="276" w:lineRule="auto"/>
-            </w:pPr>
-            <w:r>
-              <w:rPr>
-                <w:rFonts w:cs="Times New Roman"/>
-              </w:rPr>
-              <w:t xml:space="preserve">Never students should feel afraid of making mistakes when they speak English, because the confident to speak comes from practice.</w:t>
-            </w:r>
-          </w:p>
-        </w:tc>
-      </w:tr>
-    </w:tbl>
+    <w:p>
+      <w:pPr>
+        <w:spacing w:line="360" w:lineRule="auto"/>
+      </w:pPr>
+      <w:r>
+        <w:rPr>
+          <w:rFonts w:cs="Times New Roman"/>
+        </w:rPr>
+        <w:t xml:space="preserve">Technology has undoubtedly made our generation lazier. Not only we spend hours scrolling through social media, but we also order every meal through delivery apps, which means we never leave the house. Students, which live near school, still take the bus because walking seems too much effort. Rarely teenagers read a book when they can watch a video summary in five minutes. The important of exercising regularly is something that many of us have forgotten. Only by admitting the problem we can start to build healthier habits.</w:t>
+      </w:r>
+    </w:p>
+    <w:p>
+      <w:pPr>
+        <w:spacing w:line="360" w:lineRule="auto"/>
+      </w:pPr>
+      <w:r>
+        <w:rPr>
+          <w:rFonts w:cs="Times New Roman"/>
+        </w:rPr>
+        <w:t xml:space="preserve">Technology has not made us lazier; it has simply changed the way we work. What critics fail to understand is that apps save us time for more valuable activities. Not only students can complete their homework faster with online tools, but they also use the time they save to learn new skills, that explains why so many teenagers now know how to edit videos. The belief that young people do nothing meaningful on their phones is wrong, because many of them, which run successful online businesses, started from nothing. The significant of these digital skills should not be ignored, as they prepare us for the modern workplace. Only when we accept that technology is a tool we can stop blaming it for our own lack of discipline.</w:t>
+      </w:r>
+    </w:p>
     <w:p>
       <w:pPr>
         <w:spacing w:line="360" w:lineRule="auto"/>
@@ -272,7 +146,7 @@
           <w:sz w:val="22"/>
           <w:szCs w:val="22"/>
         </w:rPr>
-        <w:t xml:space="preserve">Part 2: Building a cleft sentence</w:t>
+        <w:t xml:space="preserve">Part 2: Cleft sentences in formal writing</w:t>
       </w:r>
     </w:p>
     <w:p>
@@ -283,817 +157,7 @@
         <w:rPr>
           <w:rFonts w:cs="Times New Roman"/>
         </w:rPr>
-        <w:t xml:space="preserve">Complete each cleft sentence with ONE word (it / is / was / that / who / what / until / when).</w:t>
-      </w:r>
-    </w:p>
-    <w:tbl>
-      <w:tblPr>
-        <w:tblStyle w:val="TableGrid"/>
-        <w:tblW w:w="9350" w:type="dxa"/>
-        <w:tblLayout w:type="fixed"/>
-        <w:tblLook w:val="04A0" w:firstRow="1" w:lastRow="0" w:firstColumn="1" w:lastColumn="0" w:noHBand="0" w:noVBand="1"/>
-      </w:tblPr>
-      <w:tblGrid>
-        <w:gridCol w:w="7350"/>
-        <w:gridCol w:w="2000"/>
-      </w:tblGrid>
-      <w:tr>
-        <w:tc>
-          <w:tcPr>
-            <w:tcW w:w="7350" w:type="dxa"/>
-          </w:tcPr>
-          <w:p>
-            <w:pPr>
-              <w:spacing w:after="0" w:line="276" w:lineRule="auto"/>
-              <w:rPr>
-                <w:rFonts w:cs="Times New Roman"/>
-                <w:b/>
-              </w:rPr>
-            </w:pPr>
-            <w:r>
-              <w:rPr>
-                <w:rFonts w:cs="Times New Roman"/>
-                <w:b/>
-              </w:rPr>
-              <w:t xml:space="preserve">Sentence</w:t>
-            </w:r>
-          </w:p>
-        </w:tc>
-        <w:tc>
-          <w:tcPr>
-            <w:tcW w:w="2000" w:type="dxa"/>
-          </w:tcPr>
-          <w:p>
-            <w:pPr>
-              <w:spacing w:after="0" w:line="276" w:lineRule="auto"/>
-              <w:rPr>
-                <w:rFonts w:cs="Times New Roman"/>
-                <w:b/>
-              </w:rPr>
-            </w:pPr>
-            <w:r>
-              <w:rPr>
-                <w:rFonts w:cs="Times New Roman"/>
-                <w:b/>
-              </w:rPr>
-              <w:t xml:space="preserve">Missing word</w:t>
-            </w:r>
-          </w:p>
-        </w:tc>
-      </w:tr>
-      <w:tr>
-        <w:tc>
-          <w:tcPr>
-            <w:tcW w:w="7350" w:type="dxa"/>
-          </w:tcPr>
-          <w:p>
-            <w:pPr>
-              <w:spacing w:after="0" w:line="276" w:lineRule="auto"/>
-              <w:rPr>
-                <w:rFonts w:cs="Times New Roman"/>
-              </w:rPr>
-            </w:pPr>
-            <w:r>
-              <w:rPr>
-                <w:rFonts w:cs="Times New Roman"/>
-              </w:rPr>
-              <w:t xml:space="preserve">1. ___ is peer pressure that pushes teenagers to join in online bullying.</w:t>
-            </w:r>
-          </w:p>
-        </w:tc>
-        <w:tc>
-          <w:tcPr>
-            <w:tcW w:w="2000" w:type="dxa"/>
-          </w:tcPr>
-          <w:p>
-            <w:pPr>
-              <w:spacing w:after="0" w:line="276" w:lineRule="auto"/>
-              <w:rPr>
-                <w:rFonts w:cs="Times New Roman"/>
-              </w:rPr>
-            </w:pPr>
-          </w:p>
-        </w:tc>
-      </w:tr>
-      <w:tr>
-        <w:tc>
-          <w:tcPr>
-            <w:tcW w:w="7350" w:type="dxa"/>
-          </w:tcPr>
-          <w:p>
-            <w:pPr>
-              <w:spacing w:after="0" w:line="276" w:lineRule="auto"/>
-              <w:rPr>
-                <w:rFonts w:cs="Times New Roman"/>
-              </w:rPr>
-            </w:pPr>
-            <w:r>
-              <w:rPr>
-                <w:rFonts w:cs="Times New Roman"/>
-              </w:rPr>
-              <w:t xml:space="preserve">2. It ___ the promise of a quick laugh that makes cruel posts so tempting to share.</w:t>
-            </w:r>
-          </w:p>
-        </w:tc>
-        <w:tc>
-          <w:tcPr>
-            <w:tcW w:w="2000" w:type="dxa"/>
-          </w:tcPr>
-          <w:p>
-            <w:pPr>
-              <w:spacing w:after="0" w:line="276" w:lineRule="auto"/>
-              <w:rPr>
-                <w:rFonts w:cs="Times New Roman"/>
-              </w:rPr>
-            </w:pPr>
-          </w:p>
-        </w:tc>
-      </w:tr>
-      <w:tr>
-        <w:tc>
-          <w:tcPr>
-            <w:tcW w:w="7350" w:type="dxa"/>
-          </w:tcPr>
-          <w:p>
-            <w:pPr>
-              <w:spacing w:after="0" w:line="276" w:lineRule="auto"/>
-              <w:rPr>
-                <w:rFonts w:cs="Times New Roman"/>
-              </w:rPr>
-            </w:pPr>
-            <w:r>
-              <w:rPr>
-                <w:rFonts w:cs="Times New Roman"/>
-              </w:rPr>
-              <w:t xml:space="preserve">3. It was the school newspaper ___ first reported the story.</w:t>
-            </w:r>
-          </w:p>
-        </w:tc>
-        <w:tc>
-          <w:tcPr>
-            <w:tcW w:w="2000" w:type="dxa"/>
-          </w:tcPr>
-          <w:p>
-            <w:pPr>
-              <w:spacing w:after="0" w:line="276" w:lineRule="auto"/>
-              <w:rPr>
-                <w:rFonts w:cs="Times New Roman"/>
-              </w:rPr>
-            </w:pPr>
-          </w:p>
-        </w:tc>
-      </w:tr>
-      <w:tr>
-        <w:tc>
-          <w:tcPr>
-            <w:tcW w:w="7350" w:type="dxa"/>
-          </w:tcPr>
-          <w:p>
-            <w:pPr>
-              <w:spacing w:after="0" w:line="276" w:lineRule="auto"/>
-              <w:rPr>
-                <w:rFonts w:cs="Times New Roman"/>
-              </w:rPr>
-            </w:pPr>
-            <w:r>
-              <w:rPr>
-                <w:rFonts w:cs="Times New Roman"/>
-              </w:rPr>
-              <w:t xml:space="preserve">4. ___ drives a teenager to keep scrolling is the fear of missing out.</w:t>
-            </w:r>
-          </w:p>
-        </w:tc>
-        <w:tc>
-          <w:tcPr>
-            <w:tcW w:w="2000" w:type="dxa"/>
-          </w:tcPr>
-          <w:p>
-            <w:pPr>
-              <w:spacing w:after="0" w:line="276" w:lineRule="auto"/>
-              <w:rPr>
-                <w:rFonts w:cs="Times New Roman"/>
-              </w:rPr>
-            </w:pPr>
-          </w:p>
-        </w:tc>
-      </w:tr>
-      <w:tr>
-        <w:tc>
-          <w:tcPr>
-            <w:tcW w:w="7350" w:type="dxa"/>
-          </w:tcPr>
-          <w:p>
-            <w:pPr>
-              <w:spacing w:after="0" w:line="276" w:lineRule="auto"/>
-              <w:rPr>
-                <w:rFonts w:cs="Times New Roman"/>
-              </w:rPr>
-            </w:pPr>
-            <w:r>
-              <w:rPr>
-                <w:rFonts w:cs="Times New Roman"/>
-              </w:rPr>
-              <w:t xml:space="preserve">5. It is teachers ___ first notice the change in a student’s behaviour.</w:t>
-            </w:r>
-          </w:p>
-        </w:tc>
-        <w:tc>
-          <w:tcPr>
-            <w:tcW w:w="2000" w:type="dxa"/>
-          </w:tcPr>
-          <w:p>
-            <w:pPr>
-              <w:spacing w:after="0" w:line="276" w:lineRule="auto"/>
-              <w:rPr>
-                <w:rFonts w:cs="Times New Roman"/>
-              </w:rPr>
-            </w:pPr>
-          </w:p>
-        </w:tc>
-      </w:tr>
-      <w:tr>
-        <w:tc>
-          <w:tcPr>
-            <w:tcW w:w="7350" w:type="dxa"/>
-          </w:tcPr>
-          <w:p>
-            <w:pPr>
-              <w:spacing w:after="0" w:line="276" w:lineRule="auto"/>
-              <w:rPr>
-                <w:rFonts w:cs="Times New Roman"/>
-              </w:rPr>
-            </w:pPr>
-            <w:r>
-              <w:rPr>
-                <w:rFonts w:cs="Times New Roman"/>
-              </w:rPr>
-              <w:t xml:space="preserve">6. All the school needs to do ___ train staff to spot the warning signs.</w:t>
-            </w:r>
-          </w:p>
-        </w:tc>
-        <w:tc>
-          <w:tcPr>
-            <w:tcW w:w="2000" w:type="dxa"/>
-          </w:tcPr>
-          <w:p>
-            <w:pPr>
-              <w:spacing w:after="0" w:line="276" w:lineRule="auto"/>
-              <w:rPr>
-                <w:rFonts w:cs="Times New Roman"/>
-              </w:rPr>
-            </w:pPr>
-          </w:p>
-        </w:tc>
-      </w:tr>
-      <w:tr>
-        <w:tc>
-          <w:tcPr>
-            <w:tcW w:w="7350" w:type="dxa"/>
-          </w:tcPr>
-          <w:p>
-            <w:pPr>
-              <w:spacing w:after="0" w:line="276" w:lineRule="auto"/>
-              <w:rPr>
-                <w:rFonts w:cs="Times New Roman"/>
-              </w:rPr>
-            </w:pPr>
-            <w:r>
-              <w:rPr>
-                <w:rFonts w:cs="Times New Roman"/>
-              </w:rPr>
-              <w:t xml:space="preserve">7. ___ many parents fail to realise is how quickly cruel posts spread.</w:t>
-            </w:r>
-          </w:p>
-        </w:tc>
-        <w:tc>
-          <w:tcPr>
-            <w:tcW w:w="2000" w:type="dxa"/>
-          </w:tcPr>
-          <w:p>
-            <w:pPr>
-              <w:spacing w:after="0" w:line="276" w:lineRule="auto"/>
-              <w:rPr>
-                <w:rFonts w:cs="Times New Roman"/>
-              </w:rPr>
-            </w:pPr>
-          </w:p>
-        </w:tc>
-      </w:tr>
-      <w:tr>
-        <w:tc>
-          <w:tcPr>
-            <w:tcW w:w="7350" w:type="dxa"/>
-          </w:tcPr>
-          <w:p>
-            <w:pPr>
-              <w:spacing w:after="0" w:line="276" w:lineRule="auto"/>
-              <w:rPr>
-                <w:rFonts w:cs="Times New Roman"/>
-              </w:rPr>
-            </w:pPr>
-            <w:r>
-              <w:rPr>
-                <w:rFonts w:cs="Times New Roman"/>
-              </w:rPr>
-              <w:t xml:space="preserve">8. It ___ the lack of clear rules that allowed the rumours to spread.</w:t>
-            </w:r>
-          </w:p>
-        </w:tc>
-        <w:tc>
-          <w:tcPr>
-            <w:tcW w:w="2000" w:type="dxa"/>
-          </w:tcPr>
-          <w:p>
-            <w:pPr>
-              <w:spacing w:after="0" w:line="276" w:lineRule="auto"/>
-              <w:rPr>
-                <w:rFonts w:cs="Times New Roman"/>
-              </w:rPr>
-            </w:pPr>
-          </w:p>
-        </w:tc>
-      </w:tr>
-      <w:tr>
-        <w:tc>
-          <w:tcPr>
-            <w:tcW w:w="7350" w:type="dxa"/>
-          </w:tcPr>
-          <w:p>
-            <w:pPr>
-              <w:spacing w:after="0" w:line="276" w:lineRule="auto"/>
-              <w:rPr>
-                <w:rFonts w:cs="Times New Roman"/>
-              </w:rPr>
-            </w:pPr>
-            <w:r>
-              <w:rPr>
-                <w:rFonts w:cs="Times New Roman"/>
-              </w:rPr>
-              <w:t xml:space="preserve">9. It was not ___ parents complained to the principal that the bullying was investigated.</w:t>
-            </w:r>
-          </w:p>
-        </w:tc>
-        <w:tc>
-          <w:tcPr>
-            <w:tcW w:w="2000" w:type="dxa"/>
-          </w:tcPr>
-          <w:p>
-            <w:pPr>
-              <w:spacing w:after="0" w:line="276" w:lineRule="auto"/>
-              <w:rPr>
-                <w:rFonts w:cs="Times New Roman"/>
-              </w:rPr>
-            </w:pPr>
-          </w:p>
-        </w:tc>
-      </w:tr>
-      <w:tr>
-        <w:tc>
-          <w:tcPr>
-            <w:tcW w:w="7350" w:type="dxa"/>
-          </w:tcPr>
-          <w:p>
-            <w:pPr>
-              <w:spacing w:after="0" w:line="276" w:lineRule="auto"/>
-              <w:rPr>
-                <w:rFonts w:cs="Times New Roman"/>
-              </w:rPr>
-            </w:pPr>
-            <w:r>
-              <w:rPr>
-                <w:rFonts w:cs="Times New Roman"/>
-              </w:rPr>
-              <w:t xml:space="preserve">10. What worries counsellors most ___ the silence of the students who see it happen.</w:t>
-            </w:r>
-          </w:p>
-        </w:tc>
-        <w:tc>
-          <w:tcPr>
-            <w:tcW w:w="2000" w:type="dxa"/>
-          </w:tcPr>
-          <w:p>
-            <w:pPr>
-              <w:spacing w:after="0" w:line="276" w:lineRule="auto"/>
-              <w:rPr>
-                <w:rFonts w:cs="Times New Roman"/>
-              </w:rPr>
-            </w:pPr>
-          </w:p>
-        </w:tc>
-      </w:tr>
-      <w:tr>
-        <w:tc>
-          <w:tcPr>
-            <w:tcW w:w="7350" w:type="dxa"/>
-          </w:tcPr>
-          <w:p>
-            <w:pPr>
-              <w:spacing w:after="0" w:line="276" w:lineRule="auto"/>
-              <w:rPr>
-                <w:rFonts w:cs="Times New Roman"/>
-              </w:rPr>
-            </w:pPr>
-            <w:r>
-              <w:rPr>
-                <w:rFonts w:cs="Times New Roman"/>
-              </w:rPr>
-              <w:t xml:space="preserve">11. It is the victims of online bullying ___ often suffer in silence.</w:t>
-            </w:r>
-          </w:p>
-        </w:tc>
-        <w:tc>
-          <w:tcPr>
-            <w:tcW w:w="2000" w:type="dxa"/>
-          </w:tcPr>
-          <w:p>
-            <w:pPr>
-              <w:spacing w:after="0" w:line="276" w:lineRule="auto"/>
-              <w:rPr>
-                <w:rFonts w:cs="Times New Roman"/>
-              </w:rPr>
-            </w:pPr>
-          </w:p>
-        </w:tc>
-      </w:tr>
-      <w:tr>
-        <w:tc>
-          <w:tcPr>
-            <w:tcW w:w="7350" w:type="dxa"/>
-          </w:tcPr>
-          <w:p>
-            <w:pPr>
-              <w:spacing w:after="0" w:line="276" w:lineRule="auto"/>
-              <w:rPr>
-                <w:rFonts w:cs="Times New Roman"/>
-              </w:rPr>
-            </w:pPr>
-            <w:r>
-              <w:rPr>
-                <w:rFonts w:cs="Times New Roman"/>
-              </w:rPr>
-              <w:t xml:space="preserve">12. ___ is not the phone itself, but the endless notifications, that distract students.</w:t>
-            </w:r>
-          </w:p>
-        </w:tc>
-        <w:tc>
-          <w:tcPr>
-            <w:tcW w:w="2000" w:type="dxa"/>
-          </w:tcPr>
-          <w:p>
-            <w:pPr>
-              <w:spacing w:after="0" w:line="276" w:lineRule="auto"/>
-              <w:rPr>
-                <w:rFonts w:cs="Times New Roman"/>
-              </w:rPr>
-            </w:pPr>
-          </w:p>
-        </w:tc>
-      </w:tr>
-      <w:tr>
-        <w:tc>
-          <w:tcPr>
-            <w:tcW w:w="7350" w:type="dxa"/>
-          </w:tcPr>
-          <w:p>
-            <w:pPr>
-              <w:spacing w:after="0" w:line="276" w:lineRule="auto"/>
-              <w:rPr>
-                <w:rFonts w:cs="Times New Roman"/>
-              </w:rPr>
-            </w:pPr>
-            <w:r>
-              <w:rPr>
-                <w:rFonts w:cs="Times New Roman"/>
-              </w:rPr>
-              <w:t xml:space="preserve">13. All it takes ___ five minutes of checking before you share a post.</w:t>
-            </w:r>
-          </w:p>
-        </w:tc>
-        <w:tc>
-          <w:tcPr>
-            <w:tcW w:w="2000" w:type="dxa"/>
-          </w:tcPr>
-          <w:p>
-            <w:pPr>
-              <w:spacing w:after="0" w:line="276" w:lineRule="auto"/>
-              <w:rPr>
-                <w:rFonts w:cs="Times New Roman"/>
-              </w:rPr>
-            </w:pPr>
-          </w:p>
-        </w:tc>
-      </w:tr>
-      <w:tr>
-        <w:tc>
-          <w:tcPr>
-            <w:tcW w:w="7350" w:type="dxa"/>
-          </w:tcPr>
-          <w:p>
-            <w:pPr>
-              <w:spacing w:after="0" w:line="276" w:lineRule="auto"/>
-              <w:rPr>
-                <w:rFonts w:cs="Times New Roman"/>
-              </w:rPr>
-            </w:pPr>
-            <w:r>
-              <w:rPr>
-                <w:rFonts w:cs="Times New Roman"/>
-              </w:rPr>
-              <w:t xml:space="preserve">14. It was only ___ the school posted the facts that the rumours stopped.</w:t>
-            </w:r>
-          </w:p>
-        </w:tc>
-        <w:tc>
-          <w:tcPr>
-            <w:tcW w:w="2000" w:type="dxa"/>
-          </w:tcPr>
-          <w:p>
-            <w:pPr>
-              <w:spacing w:after="0" w:line="276" w:lineRule="auto"/>
-              <w:rPr>
-                <w:rFonts w:cs="Times New Roman"/>
-              </w:rPr>
-            </w:pPr>
-          </w:p>
-        </w:tc>
-      </w:tr>
-      <w:tr>
-        <w:tc>
-          <w:tcPr>
-            <w:tcW w:w="7350" w:type="dxa"/>
-          </w:tcPr>
-          <w:p>
-            <w:pPr>
-              <w:spacing w:after="0" w:line="276" w:lineRule="auto"/>
-              <w:rPr>
-                <w:rFonts w:cs="Times New Roman"/>
-              </w:rPr>
-            </w:pPr>
-            <w:r>
-              <w:rPr>
-                <w:rFonts w:cs="Times New Roman"/>
-              </w:rPr>
-              <w:t xml:space="preserve">15. ___ struck the teachers most was how fast a single post can reach the whole year group.</w:t>
-            </w:r>
-          </w:p>
-        </w:tc>
-        <w:tc>
-          <w:tcPr>
-            <w:tcW w:w="2000" w:type="dxa"/>
-          </w:tcPr>
-          <w:p>
-            <w:pPr>
-              <w:spacing w:after="0" w:line="276" w:lineRule="auto"/>
-              <w:rPr>
-                <w:rFonts w:cs="Times New Roman"/>
-              </w:rPr>
-            </w:pPr>
-          </w:p>
-        </w:tc>
-      </w:tr>
-      <w:tr>
-        <w:tc>
-          <w:tcPr>
-            <w:tcW w:w="7350" w:type="dxa"/>
-          </w:tcPr>
-          <w:p>
-            <w:pPr>
-              <w:spacing w:after="0" w:line="276" w:lineRule="auto"/>
-              <w:rPr>
-                <w:rFonts w:cs="Times New Roman"/>
-              </w:rPr>
-            </w:pPr>
-            <w:r>
-              <w:rPr>
-                <w:rFonts w:cs="Times New Roman"/>
-              </w:rPr>
-              <w:t xml:space="preserve">16. It is careless sharing, rather than social media itself, ___ spreads rumours so fast.</w:t>
-            </w:r>
-          </w:p>
-        </w:tc>
-        <w:tc>
-          <w:tcPr>
-            <w:tcW w:w="2000" w:type="dxa"/>
-          </w:tcPr>
-          <w:p>
-            <w:pPr>
-              <w:spacing w:after="0" w:line="276" w:lineRule="auto"/>
-              <w:rPr>
-                <w:rFonts w:cs="Times New Roman"/>
-              </w:rPr>
-            </w:pPr>
-          </w:p>
-        </w:tc>
-      </w:tr>
-      <w:tr>
-        <w:tc>
-          <w:tcPr>
-            <w:tcW w:w="7350" w:type="dxa"/>
-          </w:tcPr>
-          <w:p>
-            <w:pPr>
-              <w:spacing w:after="0" w:line="276" w:lineRule="auto"/>
-              <w:rPr>
-                <w:rFonts w:cs="Times New Roman"/>
-              </w:rPr>
-            </w:pPr>
-            <w:r>
-              <w:rPr>
-                <w:rFonts w:cs="Times New Roman"/>
-              </w:rPr>
-              <w:t xml:space="preserve">17. What the panel recommends ___ a clearer policy on reporting abuse.</w:t>
-            </w:r>
-          </w:p>
-        </w:tc>
-        <w:tc>
-          <w:tcPr>
-            <w:tcW w:w="2000" w:type="dxa"/>
-          </w:tcPr>
-          <w:p>
-            <w:pPr>
-              <w:spacing w:after="0" w:line="276" w:lineRule="auto"/>
-              <w:rPr>
-                <w:rFonts w:cs="Times New Roman"/>
-              </w:rPr>
-            </w:pPr>
-          </w:p>
-        </w:tc>
-      </w:tr>
-      <w:tr>
-        <w:tc>
-          <w:tcPr>
-            <w:tcW w:w="7350" w:type="dxa"/>
-          </w:tcPr>
-          <w:p>
-            <w:pPr>
-              <w:spacing w:after="0" w:line="276" w:lineRule="auto"/>
-              <w:rPr>
-                <w:rFonts w:cs="Times New Roman"/>
-              </w:rPr>
-            </w:pPr>
-            <w:r>
-              <w:rPr>
-                <w:rFonts w:cs="Times New Roman"/>
-              </w:rPr>
-              <w:t xml:space="preserve">18. It is one trusted adult, more than any new policy, ___ makes the biggest difference to a victim.</w:t>
-            </w:r>
-          </w:p>
-        </w:tc>
-        <w:tc>
-          <w:tcPr>
-            <w:tcW w:w="2000" w:type="dxa"/>
-          </w:tcPr>
-          <w:p>
-            <w:pPr>
-              <w:spacing w:after="0" w:line="276" w:lineRule="auto"/>
-              <w:rPr>
-                <w:rFonts w:cs="Times New Roman"/>
-              </w:rPr>
-            </w:pPr>
-          </w:p>
-        </w:tc>
-      </w:tr>
-      <w:tr>
-        <w:tc>
-          <w:tcPr>
-            <w:tcW w:w="7350" w:type="dxa"/>
-          </w:tcPr>
-          <w:p>
-            <w:pPr>
-              <w:spacing w:after="0" w:line="276" w:lineRule="auto"/>
-              <w:rPr>
-                <w:rFonts w:cs="Times New Roman"/>
-              </w:rPr>
-            </w:pPr>
-            <w:r>
-              <w:rPr>
-                <w:rFonts w:cs="Times New Roman"/>
-              </w:rPr>
-              <w:t xml:space="preserve">19. ___ matters most is that victims know someone is on their side.</w:t>
-            </w:r>
-          </w:p>
-        </w:tc>
-        <w:tc>
-          <w:tcPr>
-            <w:tcW w:w="2000" w:type="dxa"/>
-          </w:tcPr>
-          <w:p>
-            <w:pPr>
-              <w:spacing w:after="0" w:line="276" w:lineRule="auto"/>
-              <w:rPr>
-                <w:rFonts w:cs="Times New Roman"/>
-              </w:rPr>
-            </w:pPr>
-          </w:p>
-        </w:tc>
-      </w:tr>
-      <w:tr>
-        <w:tc>
-          <w:tcPr>
-            <w:tcW w:w="7350" w:type="dxa"/>
-          </w:tcPr>
-          <w:p>
-            <w:pPr>
-              <w:spacing w:after="0" w:line="276" w:lineRule="auto"/>
-              <w:rPr>
-                <w:rFonts w:cs="Times New Roman"/>
-              </w:rPr>
-            </w:pPr>
-            <w:r>
-              <w:rPr>
-                <w:rFonts w:cs="Times New Roman"/>
-              </w:rPr>
-              <w:t xml:space="preserve">20. It is the way a school responds ___ decides whether victims ever report again.</w:t>
-            </w:r>
-          </w:p>
-        </w:tc>
-        <w:tc>
-          <w:tcPr>
-            <w:tcW w:w="2000" w:type="dxa"/>
-          </w:tcPr>
-          <w:p>
-            <w:pPr>
-              <w:spacing w:after="0" w:line="276" w:lineRule="auto"/>
-              <w:rPr>
-                <w:rFonts w:cs="Times New Roman"/>
-              </w:rPr>
-            </w:pPr>
-          </w:p>
-        </w:tc>
-      </w:tr>
-    </w:tbl>
-    <w:p>
-      <w:pPr>
-        <w:pStyle w:val="Heading2"/>
-        <w:spacing w:line="360" w:lineRule="auto"/>
-        <w:rPr>
-          <w:sz w:val="22"/>
-          <w:szCs w:val="22"/>
-        </w:rPr>
-      </w:pPr>
-      <w:r>
-        <w:rPr>
-          <w:rFonts w:ascii="Times New Roman" w:hAnsi="Times New Roman" w:cs="Times New Roman"/>
-          <w:sz w:val="22"/>
-          <w:szCs w:val="22"/>
-        </w:rPr>
-        <w:t xml:space="preserve">Part 3: Cleft sentences in formal writing</w:t>
-      </w:r>
-    </w:p>
-    <w:p>
-      <w:pPr>
-        <w:spacing w:line="360" w:lineRule="auto"/>
-      </w:pPr>
-      <w:r>
-        <w:rPr>
-          <w:rFonts w:cs="Times New Roman"/>
-        </w:rPr>
-        <w:t xml:space="preserve">A cleft sentence takes one idea and puts it into two parts, so that the most important information stands alone: </w:t>
-      </w:r>
-      <w:r>
-        <w:rPr>
-          <w:rFonts w:cs="Times New Roman"/>
-          <w:b/>
-          <w:bCs/>
-          <w:u w:val="single"/>
-        </w:rPr>
-        <w:t xml:space="preserve">Peer pressure causes online bullying</w:t>
-      </w:r>
-      <w:r>
-        <w:rPr>
-          <w:rFonts w:cs="Times New Roman"/>
-        </w:rPr>
-        <w:t xml:space="preserve"> becomes </w:t>
-      </w:r>
-      <w:r>
-        <w:rPr>
-          <w:rFonts w:cs="Times New Roman"/>
-          <w:b/>
-          <w:bCs/>
-          <w:u w:val="single"/>
-        </w:rPr>
-        <w:t xml:space="preserve">It is peer pressure that causes online bullying</w:t>
-      </w:r>
-      <w:r>
-        <w:rPr>
-          <w:rFonts w:cs="Times New Roman"/>
-        </w:rPr>
-        <w:t xml:space="preserve"> or </w:t>
-      </w:r>
-      <w:r>
-        <w:rPr>
-          <w:rFonts w:cs="Times New Roman"/>
-          <w:b/>
-          <w:bCs/>
-          <w:u w:val="single"/>
-        </w:rPr>
-        <w:t xml:space="preserve">What causes online bullying is peer pressure</w:t>
-      </w:r>
-      <w:r>
-        <w:rPr>
-          <w:rFonts w:cs="Times New Roman"/>
-        </w:rPr>
-        <w:t xml:space="preserve">. The word order is broken on purpose, so the emphasis lands exactly where you want it. In formal writing, one or two clefts show the marker that you can control sentence patterns beyond the ordinary subject–verb order, and they can also carry an idea from one sentence into the next.</w:t>
+        <w:t xml:space="preserve">A cleft sentence breaks one idea into two parts so the most important information stands out. Study the patterns below.</w:t>
       </w:r>
     </w:p>
     <w:p>
@@ -1144,7 +208,7 @@
               <w:rPr>
                 <w:rFonts w:cs="Times New Roman"/>
               </w:rPr>
-              <w:t xml:space="preserve">People post cruel comments because they are anonymous.</w:t>
+              <w:t xml:space="preserve">People communicate less because they use messaging apps.</w:t>
             </w:r>
           </w:p>
         </w:tc>
@@ -1174,7 +238,7 @@
               <w:rPr>
                 <w:rFonts w:cs="Times New Roman"/>
               </w:rPr>
-              <w:t xml:space="preserve">It is anonymity that encourages people to post cruel comments.</w:t>
+              <w:t xml:space="preserve">It is messaging apps that make people communicate less.</w:t>
             </w:r>
           </w:p>
         </w:tc>
@@ -1194,7 +258,7 @@
         <w:rPr>
           <w:rFonts w:cs="Times New Roman"/>
         </w:rPr>
-        <w:t xml:space="preserve">It is anonymity that encourages people to post cruel comments. Behind a screen, nobody has to face the person they are hurting, so the usual restraint of a face-to-face conversation disappears. Asking students to use their own names on the school forum would remove that cover entirely.</w:t>
+        <w:t xml:space="preserve">Young people used to meet at the park after school, but now everyone sends messages from their bedrooms. A quick text is easier than a real conversation, so face-to-face friendships have become rare. It is messaging apps that make people communicate less, and this change will only grow deeper as technology advances.</w:t>
       </w:r>
     </w:p>
     <w:p>
@@ -1245,7 +309,7 @@
               <w:rPr>
                 <w:rFonts w:cs="Times New Roman"/>
               </w:rPr>
-              <w:t xml:space="preserve">Many people blame violent games, but the silence of bystanders does the real damage.</w:t>
+              <w:t xml:space="preserve">Some people blame social media, but smartphones cause the real problem.</w:t>
             </w:r>
           </w:p>
         </w:tc>
@@ -1275,7 +339,7 @@
               <w:rPr>
                 <w:rFonts w:cs="Times New Roman"/>
               </w:rPr>
-              <w:t xml:space="preserve">While many people blame violent games, it is the silence of bystanders that does the real damage.</w:t>
+              <w:t xml:space="preserve">While some people blame social media, it is smartphones that cause the real problem.</w:t>
             </w:r>
           </w:p>
         </w:tc>
@@ -1295,7 +359,7 @@
         <w:rPr>
           <w:rFonts w:cs="Times New Roman"/>
         </w:rPr>
-        <w:t xml:space="preserve">While many people blame violent games, it is the silence of bystanders that does the real damage. A cruel post can stay online for days because nobody bothers to report it. Teaching students to speak up matters more than banning one more game.</w:t>
+        <w:t xml:space="preserve">Every day there are news stories about the dangers of social media. While some people blame social media, it is smartphones that cause the real problem. Without a phone in their pocket, teenagers could not check their accounts every five minutes.</w:t>
       </w:r>
     </w:p>
     <w:p>
@@ -1346,7 +410,7 @@
               <w:rPr>
                 <w:rFonts w:cs="Times New Roman"/>
               </w:rPr>
-              <w:t xml:space="preserve">The school should make it easier for victims to report bullying.</w:t>
+              <w:t xml:space="preserve">Schools should teach students how to communicate face to face.</w:t>
             </w:r>
           </w:p>
         </w:tc>
@@ -1376,7 +440,7 @@
               <w:rPr>
                 <w:rFonts w:cs="Times New Roman"/>
               </w:rPr>
-              <w:t xml:space="preserve">What the school should do is make it easier for victims to report bullying.</w:t>
+              <w:t xml:space="preserve">What schools should do is teach students how to communicate face to face.</w:t>
             </w:r>
           </w:p>
         </w:tc>
@@ -1396,7 +460,7 @@
         <w:rPr>
           <w:rFonts w:cs="Times New Roman"/>
         </w:rPr>
-        <w:t xml:space="preserve">What the school should do is make it easier for victims to report bullying. One anonymous form on the school website would take an afternoon to set up. Once students know that a report will be read, the silence that protects bullies begins to disappear.</w:t>
+        <w:t xml:space="preserve">Many teachers complain that their students cannot hold a proper conversation. What schools should do is teach students how to communicate face to face. A single workshop on active listening would help teenagers rebuild the skills that messaging apps have quietly taken away.</w:t>
       </w:r>
     </w:p>
     <w:p>
@@ -1447,7 +511,7 @@
               <w:rPr>
                 <w:rFonts w:cs="Times New Roman"/>
               </w:rPr>
-              <w:t xml:space="preserve">The school only has to post one clear rule about online behaviour.</w:t>
+              <w:t xml:space="preserve">Teenagers only need one real conversation to remember the value of talking.</w:t>
             </w:r>
           </w:p>
         </w:tc>
@@ -1477,7 +541,7 @@
               <w:rPr>
                 <w:rFonts w:cs="Times New Roman"/>
               </w:rPr>
-              <w:t xml:space="preserve">All the school has to do is post one clear rule about online behaviour.</w:t>
+              <w:t xml:space="preserve">All teenagers need is one real conversation to remember the value of talking.</w:t>
             </w:r>
           </w:p>
         </w:tc>
@@ -1497,173 +561,8 @@
         <w:rPr>
           <w:rFonts w:cs="Times New Roman"/>
         </w:rPr>
-        <w:t xml:space="preserve">All the school has to do is post one clear rule about online behaviour. A single sentence in the student handbook would tell everyone what is expected of them. Such a small step would show victims that the school takes the problem seriously, and more of them would come forward.</w:t>
+        <w:t xml:space="preserve">Parents often buy expensive devices or hire tutors to help their children socially. All teenagers need is one real conversation to remember the value of talking. Once they experience the warmth of genuine human connection, the cold comfort of emojis will seem far less appealing.</w:t>
       </w:r>
-    </w:p>
-    <w:p>
-      <w:pPr>
-        <w:pStyle w:val="Heading3"/>
-        <w:spacing w:line="360" w:lineRule="auto"/>
-      </w:pPr>
-      <w:r>
-        <w:rPr>
-          <w:rFonts w:ascii="Times New Roman" w:hAnsi="Times New Roman" w:cs="Times New Roman"/>
-          <w:sz w:val="22"/>
-        </w:rPr>
-        <w:t xml:space="preserve">Clefts as paragraph openers</w:t>
-      </w:r>
-    </w:p>
-    <w:p>
-      <w:pPr>
-        <w:spacing w:line="360" w:lineRule="auto"/>
-      </w:pPr>
-      <w:r>
-        <w:rPr>
-          <w:rFonts w:cs="Times New Roman"/>
-        </w:rPr>
-        <w:t xml:space="preserve">Clefts are also useful at the start of a paragraph, an article or a speech: they decide what the reader notices first. Put the it-cleft in your thesis statement, the wh-cleft in your recommendation, and the all-cleft in your closing line.</w:t>
-      </w:r>
-    </w:p>
-    <w:tbl>
-      <w:tblPr>
-        <w:tblStyle w:val="TableGrid"/>
-        <w:tblW w:w="0" w:type="auto"/>
-        <w:tblLook w:val="04A0" w:firstRow="1" w:lastRow="0" w:firstColumn="1" w:lastColumn="0" w:noHBand="0" w:noVBand="1"/>
-      </w:tblPr>
-      <w:tblGrid>
-        <w:gridCol w:w="2605"/>
-        <w:gridCol w:w="6745"/>
-      </w:tblGrid>
-      <w:tr>
-        <w:tc>
-          <w:tcPr>
-            <w:tcW w:w="2605" w:type="dxa"/>
-            <w:shd w:val="clear" w:color="auto" w:fill="DEEBF7"/>
-          </w:tcPr>
-          <w:p>
-            <w:r>
-              <w:rPr>
-                <w:rFonts w:cs="Times New Roman"/>
-              </w:rPr>
-              <w:t xml:space="preserve">Plain:</w:t>
-            </w:r>
-          </w:p>
-        </w:tc>
-        <w:tc>
-          <w:tcPr>
-            <w:tcW w:w="6745" w:type="dxa"/>
-            <w:shd w:val="clear" w:color="auto" w:fill="DEEBF7"/>
-          </w:tcPr>
-          <w:p>
-            <w:r>
-              <w:rPr>
-                <w:rFonts w:cs="Times New Roman"/>
-              </w:rPr>
-              <w:t xml:space="preserve">Social media affects teenagers’ self-esteem very strongly.</w:t>
-            </w:r>
-          </w:p>
-        </w:tc>
-      </w:tr>
-      <w:tr>
-        <w:tc>
-          <w:tcPr>
-            <w:tcW w:w="2605" w:type="dxa"/>
-            <w:shd w:val="clear" w:color="auto" w:fill="DEEBF7"/>
-          </w:tcPr>
-          <w:p>
-            <w:r>
-              <w:rPr>
-                <w:rFonts w:cs="Times New Roman"/>
-              </w:rPr>
-              <w:t xml:space="preserve">Cleft opener (What … is …):</w:t>
-            </w:r>
-          </w:p>
-        </w:tc>
-        <w:tc>
-          <w:tcPr>
-            <w:tcW w:w="6745" w:type="dxa"/>
-            <w:shd w:val="clear" w:color="auto" w:fill="DEEBF7"/>
-          </w:tcPr>
-          <w:p>
-            <w:r>
-              <w:rPr>
-                <w:rFonts w:cs="Times New Roman"/>
-              </w:rPr>
-              <w:t xml:space="preserve">What many adults fail to realise is how strongly social media affects teenagers’ self-esteem.</w:t>
-            </w:r>
-          </w:p>
-        </w:tc>
-      </w:tr>
-      <w:tr>
-        <w:tc>
-          <w:tcPr>
-            <w:tcW w:w="2605" w:type="dxa"/>
-            <w:shd w:val="clear" w:color="auto" w:fill="DEEBF7"/>
-          </w:tcPr>
-          <w:p>
-            <w:r>
-              <w:rPr>
-                <w:rFonts w:cs="Times New Roman"/>
-              </w:rPr>
-              <w:t xml:space="preserve">Plain:</w:t>
-            </w:r>
-          </w:p>
-        </w:tc>
-        <w:tc>
-          <w:tcPr>
-            <w:tcW w:w="6745" w:type="dxa"/>
-            <w:shd w:val="clear" w:color="auto" w:fill="DEEBF7"/>
-          </w:tcPr>
-          <w:p>
-            <w:r>
-              <w:rPr>
-                <w:rFonts w:cs="Times New Roman"/>
-              </w:rPr>
-              <w:t xml:space="preserve">Most teenagers only need one adult who will listen without judging them.</w:t>
-            </w:r>
-          </w:p>
-        </w:tc>
-      </w:tr>
-      <w:tr>
-        <w:tc>
-          <w:tcPr>
-            <w:tcW w:w="2605" w:type="dxa"/>
-            <w:shd w:val="clear" w:color="auto" w:fill="DEEBF7"/>
-          </w:tcPr>
-          <w:p>
-            <w:r>
-              <w:rPr>
-                <w:rFonts w:cs="Times New Roman"/>
-              </w:rPr>
-              <w:t xml:space="preserve">Cleft opener (All … is …):</w:t>
-            </w:r>
-          </w:p>
-        </w:tc>
-        <w:tc>
-          <w:tcPr>
-            <w:tcW w:w="6745" w:type="dxa"/>
-            <w:shd w:val="clear" w:color="auto" w:fill="DEEBF7"/>
-          </w:tcPr>
-          <w:p>
-            <w:r>
-              <w:rPr>
-                <w:rFonts w:cs="Times New Roman"/>
-              </w:rPr>
-              <w:t xml:space="preserve">All most teenagers need is one adult who will listen without judging them.</w:t>
-            </w:r>
-          </w:p>
-        </w:tc>
-      </w:tr>
-    </w:tbl>
-    <w:p>
-      <w:pPr>
-        <w:spacing w:line="360" w:lineRule="auto"/>
-      </w:pPr>
-    </w:p>
-    <w:p>
-      <w:pPr>
-        <w:spacing w:line="360" w:lineRule="auto"/>
-      </w:pPr>
     </w:p>
     <w:p>
       <w:pPr>
@@ -1680,7 +579,7 @@
           <w:sz w:val="22"/>
           <w:szCs w:val="22"/>
         </w:rPr>
-        <w:t xml:space="preserve">Part 4: Practice sets</w:t>
+        <w:t xml:space="preserve">Part 3: Practice sets</w:t>
       </w:r>
     </w:p>
     <w:p>
@@ -1691,7 +590,7 @@
         <w:rPr>
           <w:rFonts w:cs="Times New Roman"/>
         </w:rPr>
-        <w:t xml:space="preserve">Rewrite each simple sentence as a cleft sentence. The sentences are about life online, so keep the register formal. The later sets (4–8) are more challenging.</w:t>
+        <w:t xml:space="preserve">Rewrite each simple sentence as a cleft sentence. The sentences are about technology and communication, so keep the register formal. Sets 1–4 are straightforward; sets 5–8 require you to change the part of speech.</w:t>
       </w:r>
     </w:p>
     <w:p>
@@ -1740,7 +639,7 @@
               <w:rPr>
                 <w:rFonts w:cs="Times New Roman"/>
               </w:rPr>
-              <w:t xml:space="preserve">Teenagers copy the cruel comments of their friends because they are afraid of being left out.</w:t>
+              <w:t xml:space="preserve">Teenagers send short messages because they are afraid of real conversations.</w:t>
             </w:r>
           </w:p>
         </w:tc>
@@ -1769,7 +668,7 @@
                 <w:rFonts w:cs="Times New Roman"/>
                 <w:i/>
               </w:rPr>
-              <w:t xml:space="preserve">Begin with ‘It is the fear of being left out …’.</w:t>
+              <w:t xml:space="preserve">Begin with ‘It is the fear of real conversations …’.</w:t>
             </w:r>
           </w:p>
         </w:tc>
@@ -1831,7 +730,7 @@
               <w:rPr>
                 <w:rFonts w:cs="Times New Roman"/>
               </w:rPr>
-              <w:t xml:space="preserve">Victims of online bullying need an adult they can trust.</w:t>
+              <w:t xml:space="preserve">Students need to practise face-to-face communication.</w:t>
             </w:r>
           </w:p>
         </w:tc>
@@ -1860,7 +759,7 @@
                 <w:rFonts w:cs="Times New Roman"/>
                 <w:i/>
               </w:rPr>
-              <w:t xml:space="preserve">Begin with ‘What victims of online bullying need …’.</w:t>
+              <w:t xml:space="preserve">Begin with ‘What students need to do …’.</w:t>
             </w:r>
           </w:p>
         </w:tc>
@@ -1886,7 +785,7 @@
           <w:rFonts w:ascii="Times New Roman" w:hAnsi="Times New Roman" w:cs="Times New Roman"/>
           <w:sz w:val="22"/>
         </w:rPr>
-        <w:t xml:space="preserve">Example Set 3 (It-cleft – the person responsible)</w:t>
+        <w:t xml:space="preserve">Example Set 3 (It-cleft – the contrast)</w:t>
       </w:r>
     </w:p>
     <w:tbl>
@@ -1922,7 +821,7 @@
               <w:rPr>
                 <w:rFonts w:cs="Times New Roman"/>
               </w:rPr>
-              <w:t xml:space="preserve">School counsellors, not the discipline team, should handle bullying cases.</w:t>
+              <w:t xml:space="preserve">People blame social media, but modern phones are the real problem.</w:t>
             </w:r>
           </w:p>
         </w:tc>
@@ -1951,7 +850,7 @@
                 <w:rFonts w:cs="Times New Roman"/>
                 <w:i/>
               </w:rPr>
-              <w:t xml:space="preserve">Begin with ‘It is school counsellors …’ and use ‘who’.</w:t>
+              <w:t xml:space="preserve">Begin with ‘While people blame social media …’.</w:t>
             </w:r>
           </w:p>
         </w:tc>
@@ -1977,7 +876,7 @@
           <w:rFonts w:ascii="Times New Roman" w:hAnsi="Times New Roman" w:cs="Times New Roman"/>
           <w:sz w:val="22"/>
         </w:rPr>
-        <w:t xml:space="preserve">Example Set 4 (It-cleft – the contrast)</w:t>
+        <w:t xml:space="preserve">Example Set 4 (All-cleft – the only thing needed)</w:t>
       </w:r>
     </w:p>
     <w:tbl>
@@ -2013,7 +912,7 @@
               <w:rPr>
                 <w:rFonts w:cs="Times New Roman"/>
               </w:rPr>
-              <w:t xml:space="preserve">Teachers blame social media for the bullying, but the school’s slow response makes it worse.</w:t>
+              <w:t xml:space="preserve">Teenagers only need one proper conversation to understand the value of talking.</w:t>
             </w:r>
           </w:p>
         </w:tc>
@@ -2042,7 +941,7 @@
                 <w:rFonts w:cs="Times New Roman"/>
                 <w:i/>
               </w:rPr>
-              <w:t xml:space="preserve">Begin with ‘While teachers blame social media for the bullying …’.</w:t>
+              <w:t xml:space="preserve">Begin with ‘All teenagers need …’.</w:t>
             </w:r>
           </w:p>
         </w:tc>
@@ -2068,7 +967,7 @@
           <w:rFonts w:ascii="Times New Roman" w:hAnsi="Times New Roman" w:cs="Times New Roman"/>
           <w:sz w:val="22"/>
         </w:rPr>
-        <w:t xml:space="preserve">Example Set 5 (Wh-cleft – the recommendation)</w:t>
+        <w:t xml:space="preserve">Example Set 5 (It-cleft – the cause, word-form change)</w:t>
       </w:r>
     </w:p>
     <w:tbl>
@@ -2104,7 +1003,7 @@
               <w:rPr>
                 <w:rFonts w:cs="Times New Roman"/>
               </w:rPr>
-              <w:t xml:space="preserve">The government should make platforms remove cruel posts within 24 hours.</w:t>
+              <w:t xml:space="preserve">People feel brave when they insult others online because they are anonymous.</w:t>
             </w:r>
           </w:p>
         </w:tc>
@@ -2133,7 +1032,7 @@
                 <w:rFonts w:cs="Times New Roman"/>
                 <w:i/>
               </w:rPr>
-              <w:t xml:space="preserve">Begin with ‘What the government should do …’.</w:t>
+              <w:t xml:space="preserve">Begin with ‘It is the anonymity …’.</w:t>
             </w:r>
           </w:p>
         </w:tc>
@@ -2159,7 +1058,7 @@
           <w:rFonts w:ascii="Times New Roman" w:hAnsi="Times New Roman" w:cs="Times New Roman"/>
           <w:sz w:val="22"/>
         </w:rPr>
-        <w:t xml:space="preserve">Example Set 6 (All-cleft – the only thing needed)</w:t>
+        <w:t xml:space="preserve">Example Set 6 (It-cleft – the contrast, word-form change)</w:t>
       </w:r>
     </w:p>
     <w:tbl>
@@ -2195,7 +1094,7 @@
               <w:rPr>
                 <w:rFonts w:cs="Times New Roman"/>
               </w:rPr>
-              <w:t xml:space="preserve">To keep victims safe, the school only has to provide a safe place for them at break time.</w:t>
+              <w:t xml:space="preserve">People think technology is convenient, but it actually destroys our patience.</w:t>
             </w:r>
           </w:p>
         </w:tc>
@@ -2224,7 +1123,7 @@
                 <w:rFonts w:cs="Times New Roman"/>
                 <w:i/>
               </w:rPr>
-              <w:t xml:space="preserve">Begin with ‘All the school needs to do …’.</w:t>
+              <w:t xml:space="preserve">Begin with ‘While people think technology is convenient …’.</w:t>
             </w:r>
           </w:p>
         </w:tc>
@@ -2250,7 +1149,7 @@
           <w:rFonts w:ascii="Times New Roman" w:hAnsi="Times New Roman" w:cs="Times New Roman"/>
           <w:sz w:val="22"/>
         </w:rPr>
-        <w:t xml:space="preserve">Example Set 7 (Wh-cleft – the hook)</w:t>
+        <w:t xml:space="preserve">Example Set 7 (Wh-cleft – the recommendation, word-form change)</w:t>
       </w:r>
     </w:p>
     <w:tbl>
@@ -2286,7 +1185,7 @@
               <w:rPr>
                 <w:rFonts w:cs="Times New Roman"/>
               </w:rPr>
-              <w:t xml:space="preserve">Adults say teenagers should just ignore cruel comments, but that is impossible.</w:t>
+              <w:t xml:space="preserve">Schools should make students aware that talking face to face is important.</w:t>
             </w:r>
           </w:p>
         </w:tc>
@@ -2315,7 +1214,7 @@
                 <w:rFonts w:cs="Times New Roman"/>
                 <w:i/>
               </w:rPr>
-              <w:t xml:space="preserve">Begin with ‘What adults fail to understand …’.</w:t>
+              <w:t xml:space="preserve">Begin with ‘What schools should do …’.</w:t>
             </w:r>
           </w:p>
         </w:tc>
@@ -2341,7 +1240,7 @@
           <w:rFonts w:ascii="Times New Roman" w:hAnsi="Times New Roman" w:cs="Times New Roman"/>
           <w:sz w:val="22"/>
         </w:rPr>
-        <w:t xml:space="preserve">Example Set 8 (It-cleft – the turning point)</w:t>
+        <w:t xml:space="preserve">Example Set 8 (All-cleft – the only thing needed, word-form change)</w:t>
       </w:r>
     </w:p>
     <w:tbl>
@@ -2377,7 +1276,7 @@
               <w:rPr>
                 <w:rFonts w:cs="Times New Roman"/>
               </w:rPr>
-              <w:t xml:space="preserve">The school only understood how serious the bullying was after a student stayed away.</w:t>
+              <w:t xml:space="preserve">Teenagers only need to be confident for one minute to start a real conversation.</w:t>
             </w:r>
           </w:p>
         </w:tc>
@@ -2406,7 +1305,7 @@
                 <w:rFonts w:cs="Times New Roman"/>
                 <w:i/>
               </w:rPr>
-              <w:t xml:space="preserve">Begin with ‘It was not until …’.</w:t>
+              <w:t xml:space="preserve">Begin with ‘All teenagers need …’.</w:t>
             </w:r>
           </w:p>
         </w:tc>
@@ -2437,7 +1336,7 @@
           <w:sz w:val="22"/>
           <w:szCs w:val="22"/>
         </w:rPr>
-        <w:t xml:space="preserve">Part 5: Writing Task</w:t>
+        <w:t xml:space="preserve">Part 4: Writing Task</w:t>
       </w:r>
     </w:p>
     <w:p>
@@ -2477,7 +1376,7 @@
         <w:rPr>
           <w:rFonts w:cs="Times New Roman"/>
         </w:rPr>
-        <w:t xml:space="preserve">1. Write ONE paragraph (about 80 words) explaining why online bullying is hard for teenagers to escape, and suggesting ONE thing schools could do to help.</w:t>
+        <w:t xml:space="preserve">1. Write ONE paragraph (about 80 words) explaining the influence of artificial intelligence on students, and suggesting ONE thing schools could do to help.</w:t>
       </w:r>
     </w:p>
     <w:p>

</xml_diff>

<commit_message>
v4: revised structure and content
- Part 1: Two debate paragraphs with better logical flow.
  Para A (YES lazy): 3 inversions + 1 subtle relative ('that' after comma) + 1 nominalisation
  Para B (NO + beliefs): 3 inversions + 1 relative ('The reason because') + 1 nominalisation
  More inversions, fewer nominalisations, subtler relative errors.

- Part 2: Wh-clefts introduced FIRST (What-cleft + All-cleft), then It-clefts.
  Each pattern followed by 2 class questions (easy + harder).

- Part 3: Only 4 independent practice sets, no opening-word hints.
  Prompts simply state 'Use an IT-cleft' / 'Use a WHAT-cleft' etc.

- Part 4: Writing task on AI (unchanged).
</commit_message>
<xml_diff>
--- a/Lesson 4 - Cleft sentences (Student's).docx
+++ b/Lesson 4 - Cleft sentences (Student's).docx
@@ -112,7 +112,7 @@
         <w:rPr>
           <w:rFonts w:cs="Times New Roman"/>
         </w:rPr>
-        <w:t xml:space="preserve">Can anyone seriously deny that technology has made us lazier? Not only teenagers waste entire afternoons watching videos, but they also order every meal through delivery apps who bring food to their door within minutes. Apps, which are designed to help with homework, are frequently used for gaming instead. Students which live within walking distance still take the bus because moving feels like an unnecessary burden. The important of physical activity is something that our generation has completely forgotten. Only when someone hides their phone they can remember what life used to be like.</w:t>
+        <w:t xml:space="preserve">Everyone claims that technology makes life easier, but the truth is far less pleasant. Not only teenagers order food instead of cooking, but they also replace real conversations with emoji-filled messages. They sit for hours on apps, that were designed to save time, and end up achieving nothing meaningful. The convenient of instant delivery has destroyed any reason to walk to the shops. Rarely parents notice that their children have forgotten how to hold a proper conversation. Only when someone removes every screen from the house the family remembers what silence feels like.</w:t>
       </w:r>
     </w:p>
     <w:p>
@@ -123,7 +123,7 @@
         <w:rPr>
           <w:rFonts w:cs="Times New Roman"/>
         </w:rPr>
-        <w:t xml:space="preserve">Has technology truly destroyed our work ethic, or are we simply judging a new generation by outdated beliefs? Many adults, which grew up without smartphones, accuse young people of laziness simply because their work happens on a screen. Never parents admit that teenagers today run online businesses and solve problems that older generations could not. What they fail to see is the significant of these new skills for the modern workplace. They also miss the possible that young people can be productive while holding a phone. In fact, technology has merely challenged the believe that hard work must always look physical.</w:t>
+        <w:t xml:space="preserve">Has technology really destroyed our generation, or have older adults simply misunderstood how we work? What they refuse to accept is that young people today manage schoolwork alongside online projects they could never have completed without the internet. Not only teenagers of the past lacked these tools, but they also missed the opportunities that digital platforms create. The believe that real work must involve physical sweat ignores the fact that running a website demands just as much effort. Rarely critics acknowledge that a teenager editing videos is working just as hard as someone lifting boxes. The reason because teenagers seem distracted is not laziness but the creative work they are doing on their phones. Only when adults look at the results of their work they can understand what teenagers actually achieve.</w:t>
       </w:r>
     </w:p>
     <w:p>
@@ -170,7 +170,573 @@
           <w:rFonts w:ascii="Times New Roman" w:hAnsi="Times New Roman" w:cs="Times New Roman"/>
           <w:sz w:val="22"/>
         </w:rPr>
-        <w:t xml:space="preserve">Example 1: It-cleft – focusing on the cause</w:t>
+        <w:t xml:space="preserve">Example 1: Wh-cleft – presenting a recommendation</w:t>
+      </w:r>
+    </w:p>
+    <w:tbl>
+      <w:tblPr>
+        <w:tblStyle w:val="TableGrid"/>
+        <w:tblW w:w="0" w:type="auto"/>
+        <w:tblLook w:val="04A0" w:firstRow="1" w:lastRow="0" w:firstColumn="1" w:lastColumn="0" w:noHBand="0" w:noVBand="1"/>
+      </w:tblPr>
+      <w:tblGrid>
+        <w:gridCol w:w="2605"/>
+        <w:gridCol w:w="6745"/>
+      </w:tblGrid>
+      <w:tr>
+        <w:tc>
+          <w:tcPr>
+            <w:tcW w:w="2605" w:type="dxa"/>
+            <w:shd w:val="clear" w:color="auto" w:fill="DEEBF7"/>
+          </w:tcPr>
+          <w:p>
+            <w:r>
+              <w:rPr>
+                <w:rFonts w:cs="Times New Roman"/>
+              </w:rPr>
+              <w:t xml:space="preserve">Plain:</w:t>
+            </w:r>
+          </w:p>
+        </w:tc>
+        <w:tc>
+          <w:tcPr>
+            <w:tcW w:w="6745" w:type="dxa"/>
+            <w:shd w:val="clear" w:color="auto" w:fill="DEEBF7"/>
+          </w:tcPr>
+          <w:p>
+            <w:r>
+              <w:rPr>
+                <w:rFonts w:cs="Times New Roman"/>
+              </w:rPr>
+              <w:t xml:space="preserve">Schools should teach students how to communicate face to face.</w:t>
+            </w:r>
+          </w:p>
+        </w:tc>
+      </w:tr>
+      <w:tr>
+        <w:tc>
+          <w:tcPr>
+            <w:tcW w:w="2605" w:type="dxa"/>
+            <w:shd w:val="clear" w:color="auto" w:fill="DEEBF7"/>
+          </w:tcPr>
+          <w:p>
+            <w:r>
+              <w:rPr>
+                <w:rFonts w:cs="Times New Roman"/>
+              </w:rPr>
+              <w:t xml:space="preserve">More formal:</w:t>
+            </w:r>
+          </w:p>
+        </w:tc>
+        <w:tc>
+          <w:tcPr>
+            <w:tcW w:w="6745" w:type="dxa"/>
+            <w:shd w:val="clear" w:color="auto" w:fill="DEEBF7"/>
+          </w:tcPr>
+          <w:p>
+            <w:r>
+              <w:rPr>
+                <w:rFonts w:cs="Times New Roman"/>
+              </w:rPr>
+              <w:t xml:space="preserve">What schools should do is teach students how to communicate face to face.</w:t>
+            </w:r>
+          </w:p>
+        </w:tc>
+      </w:tr>
+    </w:tbl>
+    <w:p>
+      <w:pPr>
+        <w:pBdr>
+          <w:top w:val="single" w:sz="4" w:space="4" w:color="auto"/>
+          <w:left w:val="single" w:sz="4" w:space="4" w:color="auto"/>
+          <w:bottom w:val="single" w:sz="4" w:space="4" w:color="auto"/>
+          <w:right w:val="single" w:sz="4" w:space="4" w:color="auto"/>
+        </w:pBdr>
+        <w:spacing w:line="360" w:lineRule="auto"/>
+      </w:pPr>
+      <w:r>
+        <w:rPr>
+          <w:rFonts w:cs="Times New Roman"/>
+        </w:rPr>
+        <w:t xml:space="preserve">Many teachers complain that their students cannot hold a proper conversation. What schools should do is teach students how to communicate face to face. A single workshop on active listening would help teenagers rebuild the skills that messaging apps have quietly taken away.</w:t>
+      </w:r>
+    </w:p>
+    <w:p>
+      <w:pPr>
+        <w:pStyle w:val="Heading3"/>
+        <w:spacing w:line="360" w:lineRule="auto"/>
+      </w:pPr>
+      <w:r>
+        <w:rPr>
+          <w:rFonts w:ascii="Times New Roman" w:hAnsi="Times New Roman" w:cs="Times New Roman"/>
+          <w:sz w:val="22"/>
+        </w:rPr>
+        <w:t xml:space="preserve">Class question 1 (Easy): Wh-cleft – recommendation</w:t>
+      </w:r>
+    </w:p>
+    <w:tbl>
+      <w:tblPr>
+        <w:tblStyle w:val="TableGrid"/>
+        <w:tblW w:w="0" w:type="auto"/>
+        <w:tblLook w:val="04A0" w:firstRow="1" w:lastRow="0" w:firstColumn="1" w:lastColumn="0" w:noHBand="0" w:noVBand="1"/>
+      </w:tblPr>
+      <w:tblGrid>
+        <w:gridCol w:w="2605"/>
+        <w:gridCol w:w="6745"/>
+      </w:tblGrid>
+      <w:tr>
+        <w:tc>
+          <w:tcPr>
+            <w:tcW w:w="2605" w:type="dxa"/>
+          </w:tcPr>
+          <w:p>
+            <w:r>
+              <w:rPr>
+                <w:rFonts w:cs="Times New Roman"/>
+              </w:rPr>
+              <w:t>Simple sentence:</w:t>
+            </w:r>
+          </w:p>
+        </w:tc>
+        <w:tc>
+          <w:tcPr>
+            <w:tcW w:w="6745" w:type="dxa"/>
+          </w:tcPr>
+          <w:p>
+            <w:r>
+              <w:rPr>
+                <w:rFonts w:cs="Times New Roman"/>
+              </w:rPr>
+              <w:t xml:space="preserve">Schools should teach students how to start a real conversation.</w:t>
+            </w:r>
+          </w:p>
+        </w:tc>
+      </w:tr>
+      <w:tr>
+        <w:tc>
+          <w:tcPr>
+            <w:tcW w:w="2605" w:type="dxa"/>
+          </w:tcPr>
+          <w:p>
+            <w:r>
+              <w:rPr>
+                <w:rFonts w:cs="Times New Roman"/>
+              </w:rPr>
+              <w:t>Prompt:</w:t>
+            </w:r>
+          </w:p>
+        </w:tc>
+        <w:tc>
+          <w:tcPr>
+            <w:tcW w:w="6745" w:type="dxa"/>
+          </w:tcPr>
+          <w:p>
+            <w:r>
+              <w:rPr>
+                <w:rFonts w:cs="Times New Roman"/>
+                <w:i/>
+              </w:rPr>
+              <w:t xml:space="preserve">Begin with ‘What schools should do …’.</w:t>
+            </w:r>
+          </w:p>
+        </w:tc>
+      </w:tr>
+      <w:tr>
+        <w:tc>
+          <w:tcPr>
+            <w:tcW w:w="9350" w:type="dxa"/>
+            <w:gridSpan w:val="2"/>
+          </w:tcPr>
+          <w:p/>
+          <w:p/>
+        </w:tc>
+      </w:tr>
+    </w:tbl>
+    <w:p>
+      <w:pPr>
+        <w:pStyle w:val="Heading3"/>
+        <w:spacing w:line="360" w:lineRule="auto"/>
+      </w:pPr>
+      <w:r>
+        <w:rPr>
+          <w:rFonts w:ascii="Times New Roman" w:hAnsi="Times New Roman" w:cs="Times New Roman"/>
+          <w:sz w:val="22"/>
+        </w:rPr>
+        <w:t xml:space="preserve">Class question 2 (Harder): Wh-cleft – recommendation</w:t>
+      </w:r>
+    </w:p>
+    <w:tbl>
+      <w:tblPr>
+        <w:tblStyle w:val="TableGrid"/>
+        <w:tblW w:w="0" w:type="auto"/>
+        <w:tblLook w:val="04A0" w:firstRow="1" w:lastRow="0" w:firstColumn="1" w:lastColumn="0" w:noHBand="0" w:noVBand="1"/>
+      </w:tblPr>
+      <w:tblGrid>
+        <w:gridCol w:w="2605"/>
+        <w:gridCol w:w="6745"/>
+      </w:tblGrid>
+      <w:tr>
+        <w:tc>
+          <w:tcPr>
+            <w:tcW w:w="2605" w:type="dxa"/>
+          </w:tcPr>
+          <w:p>
+            <w:r>
+              <w:rPr>
+                <w:rFonts w:cs="Times New Roman"/>
+              </w:rPr>
+              <w:t>Simple sentence:</w:t>
+            </w:r>
+          </w:p>
+        </w:tc>
+        <w:tc>
+          <w:tcPr>
+            <w:tcW w:w="6745" w:type="dxa"/>
+          </w:tcPr>
+          <w:p>
+            <w:r>
+              <w:rPr>
+                <w:rFonts w:cs="Times New Roman"/>
+              </w:rPr>
+              <w:t xml:space="preserve">Teenagers need a safe space to practise speaking in groups.</w:t>
+            </w:r>
+          </w:p>
+        </w:tc>
+      </w:tr>
+      <w:tr>
+        <w:tc>
+          <w:tcPr>
+            <w:tcW w:w="2605" w:type="dxa"/>
+          </w:tcPr>
+          <w:p>
+            <w:r>
+              <w:rPr>
+                <w:rFonts w:cs="Times New Roman"/>
+              </w:rPr>
+              <w:t>Prompt:</w:t>
+            </w:r>
+          </w:p>
+        </w:tc>
+        <w:tc>
+          <w:tcPr>
+            <w:tcW w:w="6745" w:type="dxa"/>
+          </w:tcPr>
+          <w:p>
+            <w:r>
+              <w:rPr>
+                <w:rFonts w:cs="Times New Roman"/>
+                <w:i/>
+              </w:rPr>
+              <w:t xml:space="preserve">Begin with ‘What teenagers need …’.</w:t>
+            </w:r>
+          </w:p>
+        </w:tc>
+      </w:tr>
+      <w:tr>
+        <w:tc>
+          <w:tcPr>
+            <w:tcW w:w="9350" w:type="dxa"/>
+            <w:gridSpan w:val="2"/>
+          </w:tcPr>
+          <w:p/>
+          <w:p/>
+        </w:tc>
+      </w:tr>
+    </w:tbl>
+    <w:p>
+      <w:pPr>
+        <w:pStyle w:val="Heading3"/>
+        <w:spacing w:line="360" w:lineRule="auto"/>
+      </w:pPr>
+      <w:r>
+        <w:rPr>
+          <w:rFonts w:ascii="Times New Roman" w:hAnsi="Times New Roman" w:cs="Times New Roman"/>
+          <w:sz w:val="22"/>
+        </w:rPr>
+        <w:t xml:space="preserve">Example 2: All-cleft – naming the only thing needed</w:t>
+      </w:r>
+    </w:p>
+    <w:tbl>
+      <w:tblPr>
+        <w:tblStyle w:val="TableGrid"/>
+        <w:tblW w:w="0" w:type="auto"/>
+        <w:tblLook w:val="04A0" w:firstRow="1" w:lastRow="0" w:firstColumn="1" w:lastColumn="0" w:noHBand="0" w:noVBand="1"/>
+      </w:tblPr>
+      <w:tblGrid>
+        <w:gridCol w:w="2605"/>
+        <w:gridCol w:w="6745"/>
+      </w:tblGrid>
+      <w:tr>
+        <w:tc>
+          <w:tcPr>
+            <w:tcW w:w="2605" w:type="dxa"/>
+            <w:shd w:val="clear" w:color="auto" w:fill="DEEBF7"/>
+          </w:tcPr>
+          <w:p>
+            <w:r>
+              <w:rPr>
+                <w:rFonts w:cs="Times New Roman"/>
+              </w:rPr>
+              <w:t xml:space="preserve">Plain:</w:t>
+            </w:r>
+          </w:p>
+        </w:tc>
+        <w:tc>
+          <w:tcPr>
+            <w:tcW w:w="6745" w:type="dxa"/>
+            <w:shd w:val="clear" w:color="auto" w:fill="DEEBF7"/>
+          </w:tcPr>
+          <w:p>
+            <w:r>
+              <w:rPr>
+                <w:rFonts w:cs="Times New Roman"/>
+              </w:rPr>
+              <w:t xml:space="preserve">Teenagers only need one real conversation to remember the value of talking.</w:t>
+            </w:r>
+          </w:p>
+        </w:tc>
+      </w:tr>
+      <w:tr>
+        <w:tc>
+          <w:tcPr>
+            <w:tcW w:w="2605" w:type="dxa"/>
+            <w:shd w:val="clear" w:color="auto" w:fill="DEEBF7"/>
+          </w:tcPr>
+          <w:p>
+            <w:r>
+              <w:rPr>
+                <w:rFonts w:cs="Times New Roman"/>
+              </w:rPr>
+              <w:t xml:space="preserve">More formal:</w:t>
+            </w:r>
+          </w:p>
+        </w:tc>
+        <w:tc>
+          <w:tcPr>
+            <w:tcW w:w="6745" w:type="dxa"/>
+            <w:shd w:val="clear" w:color="auto" w:fill="DEEBF7"/>
+          </w:tcPr>
+          <w:p>
+            <w:r>
+              <w:rPr>
+                <w:rFonts w:cs="Times New Roman"/>
+              </w:rPr>
+              <w:t xml:space="preserve">All teenagers need is one real conversation to remember the value of talking.</w:t>
+            </w:r>
+          </w:p>
+        </w:tc>
+      </w:tr>
+    </w:tbl>
+    <w:p>
+      <w:pPr>
+        <w:pBdr>
+          <w:top w:val="single" w:sz="4" w:space="4" w:color="auto"/>
+          <w:left w:val="single" w:sz="4" w:space="4" w:color="auto"/>
+          <w:bottom w:val="single" w:sz="4" w:space="4" w:color="auto"/>
+          <w:right w:val="single" w:sz="4" w:space="4" w:color="auto"/>
+        </w:pBdr>
+        <w:spacing w:line="360" w:lineRule="auto"/>
+      </w:pPr>
+      <w:r>
+        <w:rPr>
+          <w:rFonts w:cs="Times New Roman"/>
+        </w:rPr>
+        <w:t xml:space="preserve">Parents often buy expensive devices or hire tutors to help their children socially. All teenagers need is one real conversation to remember the value of talking. Once they experience the warmth of genuine human connection, the cold comfort of emojis will seem far less appealing.</w:t>
+      </w:r>
+    </w:p>
+    <w:p>
+      <w:pPr>
+        <w:pStyle w:val="Heading3"/>
+        <w:spacing w:line="360" w:lineRule="auto"/>
+      </w:pPr>
+      <w:r>
+        <w:rPr>
+          <w:rFonts w:ascii="Times New Roman" w:hAnsi="Times New Roman" w:cs="Times New Roman"/>
+          <w:sz w:val="22"/>
+        </w:rPr>
+        <w:t xml:space="preserve">Class question 1 (Easy): All-cleft</w:t>
+      </w:r>
+    </w:p>
+    <w:tbl>
+      <w:tblPr>
+        <w:tblStyle w:val="TableGrid"/>
+        <w:tblW w:w="0" w:type="auto"/>
+        <w:tblLook w:val="04A0" w:firstRow="1" w:lastRow="0" w:firstColumn="1" w:lastColumn="0" w:noHBand="0" w:noVBand="1"/>
+      </w:tblPr>
+      <w:tblGrid>
+        <w:gridCol w:w="2605"/>
+        <w:gridCol w:w="6745"/>
+      </w:tblGrid>
+      <w:tr>
+        <w:tc>
+          <w:tcPr>
+            <w:tcW w:w="2605" w:type="dxa"/>
+          </w:tcPr>
+          <w:p>
+            <w:r>
+              <w:rPr>
+                <w:rFonts w:cs="Times New Roman"/>
+              </w:rPr>
+              <w:t>Simple sentence:</w:t>
+            </w:r>
+          </w:p>
+        </w:tc>
+        <w:tc>
+          <w:tcPr>
+            <w:tcW w:w="6745" w:type="dxa"/>
+          </w:tcPr>
+          <w:p>
+            <w:r>
+              <w:rPr>
+                <w:rFonts w:cs="Times New Roman"/>
+              </w:rPr>
+              <w:t xml:space="preserve">Teenagers only need one supportive friend to feel understood.</w:t>
+            </w:r>
+          </w:p>
+        </w:tc>
+      </w:tr>
+      <w:tr>
+        <w:tc>
+          <w:tcPr>
+            <w:tcW w:w="2605" w:type="dxa"/>
+          </w:tcPr>
+          <w:p>
+            <w:r>
+              <w:rPr>
+                <w:rFonts w:cs="Times New Roman"/>
+              </w:rPr>
+              <w:t>Prompt:</w:t>
+            </w:r>
+          </w:p>
+        </w:tc>
+        <w:tc>
+          <w:tcPr>
+            <w:tcW w:w="6745" w:type="dxa"/>
+          </w:tcPr>
+          <w:p>
+            <w:r>
+              <w:rPr>
+                <w:rFonts w:cs="Times New Roman"/>
+                <w:i/>
+              </w:rPr>
+              <w:t xml:space="preserve">Begin with ‘All teenagers need …’.</w:t>
+            </w:r>
+          </w:p>
+        </w:tc>
+      </w:tr>
+      <w:tr>
+        <w:tc>
+          <w:tcPr>
+            <w:tcW w:w="9350" w:type="dxa"/>
+            <w:gridSpan w:val="2"/>
+          </w:tcPr>
+          <w:p/>
+          <w:p/>
+        </w:tc>
+      </w:tr>
+    </w:tbl>
+    <w:p>
+      <w:pPr>
+        <w:pStyle w:val="Heading3"/>
+        <w:spacing w:line="360" w:lineRule="auto"/>
+      </w:pPr>
+      <w:r>
+        <w:rPr>
+          <w:rFonts w:ascii="Times New Roman" w:hAnsi="Times New Roman" w:cs="Times New Roman"/>
+          <w:sz w:val="22"/>
+        </w:rPr>
+        <w:t xml:space="preserve">Class question 2 (Harder): All-cleft</w:t>
+      </w:r>
+    </w:p>
+    <w:tbl>
+      <w:tblPr>
+        <w:tblStyle w:val="TableGrid"/>
+        <w:tblW w:w="0" w:type="auto"/>
+        <w:tblLook w:val="04A0" w:firstRow="1" w:lastRow="0" w:firstColumn="1" w:lastColumn="0" w:noHBand="0" w:noVBand="1"/>
+      </w:tblPr>
+      <w:tblGrid>
+        <w:gridCol w:w="2605"/>
+        <w:gridCol w:w="6745"/>
+      </w:tblGrid>
+      <w:tr>
+        <w:tc>
+          <w:tcPr>
+            <w:tcW w:w="2605" w:type="dxa"/>
+          </w:tcPr>
+          <w:p>
+            <w:r>
+              <w:rPr>
+                <w:rFonts w:cs="Times New Roman"/>
+              </w:rPr>
+              <w:t>Simple sentence:</w:t>
+            </w:r>
+          </w:p>
+        </w:tc>
+        <w:tc>
+          <w:tcPr>
+            <w:tcW w:w="6745" w:type="dxa"/>
+          </w:tcPr>
+          <w:p>
+            <w:r>
+              <w:rPr>
+                <w:rFonts w:cs="Times New Roman"/>
+              </w:rPr>
+              <w:t xml:space="preserve">Teenagers only need to feel brave for a moment to speak to a stranger.</w:t>
+            </w:r>
+          </w:p>
+        </w:tc>
+      </w:tr>
+      <w:tr>
+        <w:tc>
+          <w:tcPr>
+            <w:tcW w:w="2605" w:type="dxa"/>
+          </w:tcPr>
+          <w:p>
+            <w:r>
+              <w:rPr>
+                <w:rFonts w:cs="Times New Roman"/>
+              </w:rPr>
+              <w:t>Prompt:</w:t>
+            </w:r>
+          </w:p>
+        </w:tc>
+        <w:tc>
+          <w:tcPr>
+            <w:tcW w:w="6745" w:type="dxa"/>
+          </w:tcPr>
+          <w:p>
+            <w:r>
+              <w:rPr>
+                <w:rFonts w:cs="Times New Roman"/>
+                <w:i/>
+              </w:rPr>
+              <w:t xml:space="preserve">Begin with ‘All teenagers need …’.</w:t>
+            </w:r>
+          </w:p>
+        </w:tc>
+      </w:tr>
+      <w:tr>
+        <w:tc>
+          <w:tcPr>
+            <w:tcW w:w="9350" w:type="dxa"/>
+            <w:gridSpan w:val="2"/>
+          </w:tcPr>
+          <w:p/>
+          <w:p/>
+        </w:tc>
+      </w:tr>
+    </w:tbl>
+    <w:p>
+      <w:pPr>
+        <w:pStyle w:val="Heading3"/>
+        <w:spacing w:line="360" w:lineRule="auto"/>
+      </w:pPr>
+      <w:r>
+        <w:rPr>
+          <w:rFonts w:ascii="Times New Roman" w:hAnsi="Times New Roman" w:cs="Times New Roman"/>
+          <w:sz w:val="22"/>
+        </w:rPr>
+        <w:t xml:space="preserve">Example 3: It-cleft – focusing on the cause</w:t>
       </w:r>
     </w:p>
     <w:tbl>
@@ -453,7 +1019,7 @@
           <w:rFonts w:ascii="Times New Roman" w:hAnsi="Times New Roman" w:cs="Times New Roman"/>
           <w:sz w:val="22"/>
         </w:rPr>
-        <w:t xml:space="preserve">Example 2: It-cleft – setting up a contrast</w:t>
+        <w:t xml:space="preserve">Example 4: It-cleft – setting up a contrast</w:t>
       </w:r>
     </w:p>
     <w:tbl>
@@ -728,572 +1294,6 @@
     </w:tbl>
     <w:p>
       <w:pPr>
-        <w:pStyle w:val="Heading3"/>
-        <w:spacing w:line="360" w:lineRule="auto"/>
-      </w:pPr>
-      <w:r>
-        <w:rPr>
-          <w:rFonts w:ascii="Times New Roman" w:hAnsi="Times New Roman" w:cs="Times New Roman"/>
-          <w:sz w:val="22"/>
-        </w:rPr>
-        <w:t xml:space="preserve">Example 3: Wh-cleft – presenting a recommendation</w:t>
-      </w:r>
-    </w:p>
-    <w:tbl>
-      <w:tblPr>
-        <w:tblStyle w:val="TableGrid"/>
-        <w:tblW w:w="0" w:type="auto"/>
-        <w:tblLook w:val="04A0" w:firstRow="1" w:lastRow="0" w:firstColumn="1" w:lastColumn="0" w:noHBand="0" w:noVBand="1"/>
-      </w:tblPr>
-      <w:tblGrid>
-        <w:gridCol w:w="2605"/>
-        <w:gridCol w:w="6745"/>
-      </w:tblGrid>
-      <w:tr>
-        <w:tc>
-          <w:tcPr>
-            <w:tcW w:w="2605" w:type="dxa"/>
-            <w:shd w:val="clear" w:color="auto" w:fill="DEEBF7"/>
-          </w:tcPr>
-          <w:p>
-            <w:r>
-              <w:rPr>
-                <w:rFonts w:cs="Times New Roman"/>
-              </w:rPr>
-              <w:t xml:space="preserve">Plain:</w:t>
-            </w:r>
-          </w:p>
-        </w:tc>
-        <w:tc>
-          <w:tcPr>
-            <w:tcW w:w="6745" w:type="dxa"/>
-            <w:shd w:val="clear" w:color="auto" w:fill="DEEBF7"/>
-          </w:tcPr>
-          <w:p>
-            <w:r>
-              <w:rPr>
-                <w:rFonts w:cs="Times New Roman"/>
-              </w:rPr>
-              <w:t xml:space="preserve">Schools should teach students how to communicate face to face.</w:t>
-            </w:r>
-          </w:p>
-        </w:tc>
-      </w:tr>
-      <w:tr>
-        <w:tc>
-          <w:tcPr>
-            <w:tcW w:w="2605" w:type="dxa"/>
-            <w:shd w:val="clear" w:color="auto" w:fill="DEEBF7"/>
-          </w:tcPr>
-          <w:p>
-            <w:r>
-              <w:rPr>
-                <w:rFonts w:cs="Times New Roman"/>
-              </w:rPr>
-              <w:t xml:space="preserve">More formal:</w:t>
-            </w:r>
-          </w:p>
-        </w:tc>
-        <w:tc>
-          <w:tcPr>
-            <w:tcW w:w="6745" w:type="dxa"/>
-            <w:shd w:val="clear" w:color="auto" w:fill="DEEBF7"/>
-          </w:tcPr>
-          <w:p>
-            <w:r>
-              <w:rPr>
-                <w:rFonts w:cs="Times New Roman"/>
-              </w:rPr>
-              <w:t xml:space="preserve">What schools should do is teach students how to communicate face to face.</w:t>
-            </w:r>
-          </w:p>
-        </w:tc>
-      </w:tr>
-    </w:tbl>
-    <w:p>
-      <w:pPr>
-        <w:pBdr>
-          <w:top w:val="single" w:sz="4" w:space="4" w:color="auto"/>
-          <w:left w:val="single" w:sz="4" w:space="4" w:color="auto"/>
-          <w:bottom w:val="single" w:sz="4" w:space="4" w:color="auto"/>
-          <w:right w:val="single" w:sz="4" w:space="4" w:color="auto"/>
-        </w:pBdr>
-        <w:spacing w:line="360" w:lineRule="auto"/>
-      </w:pPr>
-      <w:r>
-        <w:rPr>
-          <w:rFonts w:cs="Times New Roman"/>
-        </w:rPr>
-        <w:t xml:space="preserve">Many teachers complain that their students cannot hold a proper conversation. What schools should do is teach students how to communicate face to face. A single workshop on active listening would help teenagers rebuild the skills that messaging apps have quietly taken away.</w:t>
-      </w:r>
-    </w:p>
-    <w:p>
-      <w:pPr>
-        <w:pStyle w:val="Heading3"/>
-        <w:spacing w:line="360" w:lineRule="auto"/>
-      </w:pPr>
-      <w:r>
-        <w:rPr>
-          <w:rFonts w:ascii="Times New Roman" w:hAnsi="Times New Roman" w:cs="Times New Roman"/>
-          <w:sz w:val="22"/>
-        </w:rPr>
-        <w:t xml:space="preserve">Class question 1 (Easy): Wh-cleft – recommendation</w:t>
-      </w:r>
-    </w:p>
-    <w:tbl>
-      <w:tblPr>
-        <w:tblStyle w:val="TableGrid"/>
-        <w:tblW w:w="0" w:type="auto"/>
-        <w:tblLook w:val="04A0" w:firstRow="1" w:lastRow="0" w:firstColumn="1" w:lastColumn="0" w:noHBand="0" w:noVBand="1"/>
-      </w:tblPr>
-      <w:tblGrid>
-        <w:gridCol w:w="2605"/>
-        <w:gridCol w:w="6745"/>
-      </w:tblGrid>
-      <w:tr>
-        <w:tc>
-          <w:tcPr>
-            <w:tcW w:w="2605" w:type="dxa"/>
-          </w:tcPr>
-          <w:p>
-            <w:r>
-              <w:rPr>
-                <w:rFonts w:cs="Times New Roman"/>
-              </w:rPr>
-              <w:t>Simple sentence:</w:t>
-            </w:r>
-          </w:p>
-        </w:tc>
-        <w:tc>
-          <w:tcPr>
-            <w:tcW w:w="6745" w:type="dxa"/>
-          </w:tcPr>
-          <w:p>
-            <w:r>
-              <w:rPr>
-                <w:rFonts w:cs="Times New Roman"/>
-              </w:rPr>
-              <w:t xml:space="preserve">Schools should teach students how to start a real conversation.</w:t>
-            </w:r>
-          </w:p>
-        </w:tc>
-      </w:tr>
-      <w:tr>
-        <w:tc>
-          <w:tcPr>
-            <w:tcW w:w="2605" w:type="dxa"/>
-          </w:tcPr>
-          <w:p>
-            <w:r>
-              <w:rPr>
-                <w:rFonts w:cs="Times New Roman"/>
-              </w:rPr>
-              <w:t>Prompt:</w:t>
-            </w:r>
-          </w:p>
-        </w:tc>
-        <w:tc>
-          <w:tcPr>
-            <w:tcW w:w="6745" w:type="dxa"/>
-          </w:tcPr>
-          <w:p>
-            <w:r>
-              <w:rPr>
-                <w:rFonts w:cs="Times New Roman"/>
-                <w:i/>
-              </w:rPr>
-              <w:t xml:space="preserve">Begin with ‘What schools should do …’.</w:t>
-            </w:r>
-          </w:p>
-        </w:tc>
-      </w:tr>
-      <w:tr>
-        <w:tc>
-          <w:tcPr>
-            <w:tcW w:w="9350" w:type="dxa"/>
-            <w:gridSpan w:val="2"/>
-          </w:tcPr>
-          <w:p/>
-          <w:p/>
-        </w:tc>
-      </w:tr>
-    </w:tbl>
-    <w:p>
-      <w:pPr>
-        <w:pStyle w:val="Heading3"/>
-        <w:spacing w:line="360" w:lineRule="auto"/>
-      </w:pPr>
-      <w:r>
-        <w:rPr>
-          <w:rFonts w:ascii="Times New Roman" w:hAnsi="Times New Roman" w:cs="Times New Roman"/>
-          <w:sz w:val="22"/>
-        </w:rPr>
-        <w:t xml:space="preserve">Class question 2 (Harder): Wh-cleft – recommendation</w:t>
-      </w:r>
-    </w:p>
-    <w:tbl>
-      <w:tblPr>
-        <w:tblStyle w:val="TableGrid"/>
-        <w:tblW w:w="0" w:type="auto"/>
-        <w:tblLook w:val="04A0" w:firstRow="1" w:lastRow="0" w:firstColumn="1" w:lastColumn="0" w:noHBand="0" w:noVBand="1"/>
-      </w:tblPr>
-      <w:tblGrid>
-        <w:gridCol w:w="2605"/>
-        <w:gridCol w:w="6745"/>
-      </w:tblGrid>
-      <w:tr>
-        <w:tc>
-          <w:tcPr>
-            <w:tcW w:w="2605" w:type="dxa"/>
-          </w:tcPr>
-          <w:p>
-            <w:r>
-              <w:rPr>
-                <w:rFonts w:cs="Times New Roman"/>
-              </w:rPr>
-              <w:t>Simple sentence:</w:t>
-            </w:r>
-          </w:p>
-        </w:tc>
-        <w:tc>
-          <w:tcPr>
-            <w:tcW w:w="6745" w:type="dxa"/>
-          </w:tcPr>
-          <w:p>
-            <w:r>
-              <w:rPr>
-                <w:rFonts w:cs="Times New Roman"/>
-              </w:rPr>
-              <w:t xml:space="preserve">Teenagers need a safe space to practise speaking in groups.</w:t>
-            </w:r>
-          </w:p>
-        </w:tc>
-      </w:tr>
-      <w:tr>
-        <w:tc>
-          <w:tcPr>
-            <w:tcW w:w="2605" w:type="dxa"/>
-          </w:tcPr>
-          <w:p>
-            <w:r>
-              <w:rPr>
-                <w:rFonts w:cs="Times New Roman"/>
-              </w:rPr>
-              <w:t>Prompt:</w:t>
-            </w:r>
-          </w:p>
-        </w:tc>
-        <w:tc>
-          <w:tcPr>
-            <w:tcW w:w="6745" w:type="dxa"/>
-          </w:tcPr>
-          <w:p>
-            <w:r>
-              <w:rPr>
-                <w:rFonts w:cs="Times New Roman"/>
-                <w:i/>
-              </w:rPr>
-              <w:t xml:space="preserve">Begin with ‘What teenagers need …’.</w:t>
-            </w:r>
-          </w:p>
-        </w:tc>
-      </w:tr>
-      <w:tr>
-        <w:tc>
-          <w:tcPr>
-            <w:tcW w:w="9350" w:type="dxa"/>
-            <w:gridSpan w:val="2"/>
-          </w:tcPr>
-          <w:p/>
-          <w:p/>
-        </w:tc>
-      </w:tr>
-    </w:tbl>
-    <w:p>
-      <w:pPr>
-        <w:pStyle w:val="Heading3"/>
-        <w:spacing w:line="360" w:lineRule="auto"/>
-      </w:pPr>
-      <w:r>
-        <w:rPr>
-          <w:rFonts w:ascii="Times New Roman" w:hAnsi="Times New Roman" w:cs="Times New Roman"/>
-          <w:sz w:val="22"/>
-        </w:rPr>
-        <w:t xml:space="preserve">Example 4: All-cleft – naming the only thing needed</w:t>
-      </w:r>
-    </w:p>
-    <w:tbl>
-      <w:tblPr>
-        <w:tblStyle w:val="TableGrid"/>
-        <w:tblW w:w="0" w:type="auto"/>
-        <w:tblLook w:val="04A0" w:firstRow="1" w:lastRow="0" w:firstColumn="1" w:lastColumn="0" w:noHBand="0" w:noVBand="1"/>
-      </w:tblPr>
-      <w:tblGrid>
-        <w:gridCol w:w="2605"/>
-        <w:gridCol w:w="6745"/>
-      </w:tblGrid>
-      <w:tr>
-        <w:tc>
-          <w:tcPr>
-            <w:tcW w:w="2605" w:type="dxa"/>
-            <w:shd w:val="clear" w:color="auto" w:fill="DEEBF7"/>
-          </w:tcPr>
-          <w:p>
-            <w:r>
-              <w:rPr>
-                <w:rFonts w:cs="Times New Roman"/>
-              </w:rPr>
-              <w:t xml:space="preserve">Plain:</w:t>
-            </w:r>
-          </w:p>
-        </w:tc>
-        <w:tc>
-          <w:tcPr>
-            <w:tcW w:w="6745" w:type="dxa"/>
-            <w:shd w:val="clear" w:color="auto" w:fill="DEEBF7"/>
-          </w:tcPr>
-          <w:p>
-            <w:r>
-              <w:rPr>
-                <w:rFonts w:cs="Times New Roman"/>
-              </w:rPr>
-              <w:t xml:space="preserve">Teenagers only need one real conversation to remember the value of talking.</w:t>
-            </w:r>
-          </w:p>
-        </w:tc>
-      </w:tr>
-      <w:tr>
-        <w:tc>
-          <w:tcPr>
-            <w:tcW w:w="2605" w:type="dxa"/>
-            <w:shd w:val="clear" w:color="auto" w:fill="DEEBF7"/>
-          </w:tcPr>
-          <w:p>
-            <w:r>
-              <w:rPr>
-                <w:rFonts w:cs="Times New Roman"/>
-              </w:rPr>
-              <w:t xml:space="preserve">More formal:</w:t>
-            </w:r>
-          </w:p>
-        </w:tc>
-        <w:tc>
-          <w:tcPr>
-            <w:tcW w:w="6745" w:type="dxa"/>
-            <w:shd w:val="clear" w:color="auto" w:fill="DEEBF7"/>
-          </w:tcPr>
-          <w:p>
-            <w:r>
-              <w:rPr>
-                <w:rFonts w:cs="Times New Roman"/>
-              </w:rPr>
-              <w:t xml:space="preserve">All teenagers need is one real conversation to remember the value of talking.</w:t>
-            </w:r>
-          </w:p>
-        </w:tc>
-      </w:tr>
-    </w:tbl>
-    <w:p>
-      <w:pPr>
-        <w:pBdr>
-          <w:top w:val="single" w:sz="4" w:space="4" w:color="auto"/>
-          <w:left w:val="single" w:sz="4" w:space="4" w:color="auto"/>
-          <w:bottom w:val="single" w:sz="4" w:space="4" w:color="auto"/>
-          <w:right w:val="single" w:sz="4" w:space="4" w:color="auto"/>
-        </w:pBdr>
-        <w:spacing w:line="360" w:lineRule="auto"/>
-      </w:pPr>
-      <w:r>
-        <w:rPr>
-          <w:rFonts w:cs="Times New Roman"/>
-        </w:rPr>
-        <w:t xml:space="preserve">Parents often buy expensive devices or hire tutors to help their children socially. All teenagers need is one real conversation to remember the value of talking. Once they experience the warmth of genuine human connection, the cold comfort of emojis will seem far less appealing.</w:t>
-      </w:r>
-    </w:p>
-    <w:p>
-      <w:pPr>
-        <w:pStyle w:val="Heading3"/>
-        <w:spacing w:line="360" w:lineRule="auto"/>
-      </w:pPr>
-      <w:r>
-        <w:rPr>
-          <w:rFonts w:ascii="Times New Roman" w:hAnsi="Times New Roman" w:cs="Times New Roman"/>
-          <w:sz w:val="22"/>
-        </w:rPr>
-        <w:t xml:space="preserve">Class question 1 (Easy): All-cleft</w:t>
-      </w:r>
-    </w:p>
-    <w:tbl>
-      <w:tblPr>
-        <w:tblStyle w:val="TableGrid"/>
-        <w:tblW w:w="0" w:type="auto"/>
-        <w:tblLook w:val="04A0" w:firstRow="1" w:lastRow="0" w:firstColumn="1" w:lastColumn="0" w:noHBand="0" w:noVBand="1"/>
-      </w:tblPr>
-      <w:tblGrid>
-        <w:gridCol w:w="2605"/>
-        <w:gridCol w:w="6745"/>
-      </w:tblGrid>
-      <w:tr>
-        <w:tc>
-          <w:tcPr>
-            <w:tcW w:w="2605" w:type="dxa"/>
-          </w:tcPr>
-          <w:p>
-            <w:r>
-              <w:rPr>
-                <w:rFonts w:cs="Times New Roman"/>
-              </w:rPr>
-              <w:t>Simple sentence:</w:t>
-            </w:r>
-          </w:p>
-        </w:tc>
-        <w:tc>
-          <w:tcPr>
-            <w:tcW w:w="6745" w:type="dxa"/>
-          </w:tcPr>
-          <w:p>
-            <w:r>
-              <w:rPr>
-                <w:rFonts w:cs="Times New Roman"/>
-              </w:rPr>
-              <w:t xml:space="preserve">Teenagers only need one supportive friend to feel understood.</w:t>
-            </w:r>
-          </w:p>
-        </w:tc>
-      </w:tr>
-      <w:tr>
-        <w:tc>
-          <w:tcPr>
-            <w:tcW w:w="2605" w:type="dxa"/>
-          </w:tcPr>
-          <w:p>
-            <w:r>
-              <w:rPr>
-                <w:rFonts w:cs="Times New Roman"/>
-              </w:rPr>
-              <w:t>Prompt:</w:t>
-            </w:r>
-          </w:p>
-        </w:tc>
-        <w:tc>
-          <w:tcPr>
-            <w:tcW w:w="6745" w:type="dxa"/>
-          </w:tcPr>
-          <w:p>
-            <w:r>
-              <w:rPr>
-                <w:rFonts w:cs="Times New Roman"/>
-                <w:i/>
-              </w:rPr>
-              <w:t xml:space="preserve">Begin with ‘All teenagers need …’.</w:t>
-            </w:r>
-          </w:p>
-        </w:tc>
-      </w:tr>
-      <w:tr>
-        <w:tc>
-          <w:tcPr>
-            <w:tcW w:w="9350" w:type="dxa"/>
-            <w:gridSpan w:val="2"/>
-          </w:tcPr>
-          <w:p/>
-          <w:p/>
-        </w:tc>
-      </w:tr>
-    </w:tbl>
-    <w:p>
-      <w:pPr>
-        <w:pStyle w:val="Heading3"/>
-        <w:spacing w:line="360" w:lineRule="auto"/>
-      </w:pPr>
-      <w:r>
-        <w:rPr>
-          <w:rFonts w:ascii="Times New Roman" w:hAnsi="Times New Roman" w:cs="Times New Roman"/>
-          <w:sz w:val="22"/>
-        </w:rPr>
-        <w:t xml:space="preserve">Class question 2 (Harder): All-cleft</w:t>
-      </w:r>
-    </w:p>
-    <w:tbl>
-      <w:tblPr>
-        <w:tblStyle w:val="TableGrid"/>
-        <w:tblW w:w="0" w:type="auto"/>
-        <w:tblLook w:val="04A0" w:firstRow="1" w:lastRow="0" w:firstColumn="1" w:lastColumn="0" w:noHBand="0" w:noVBand="1"/>
-      </w:tblPr>
-      <w:tblGrid>
-        <w:gridCol w:w="2605"/>
-        <w:gridCol w:w="6745"/>
-      </w:tblGrid>
-      <w:tr>
-        <w:tc>
-          <w:tcPr>
-            <w:tcW w:w="2605" w:type="dxa"/>
-          </w:tcPr>
-          <w:p>
-            <w:r>
-              <w:rPr>
-                <w:rFonts w:cs="Times New Roman"/>
-              </w:rPr>
-              <w:t>Simple sentence:</w:t>
-            </w:r>
-          </w:p>
-        </w:tc>
-        <w:tc>
-          <w:tcPr>
-            <w:tcW w:w="6745" w:type="dxa"/>
-          </w:tcPr>
-          <w:p>
-            <w:r>
-              <w:rPr>
-                <w:rFonts w:cs="Times New Roman"/>
-              </w:rPr>
-              <w:t xml:space="preserve">Teenagers only need to feel brave for a moment to speak to a stranger.</w:t>
-            </w:r>
-          </w:p>
-        </w:tc>
-      </w:tr>
-      <w:tr>
-        <w:tc>
-          <w:tcPr>
-            <w:tcW w:w="2605" w:type="dxa"/>
-          </w:tcPr>
-          <w:p>
-            <w:r>
-              <w:rPr>
-                <w:rFonts w:cs="Times New Roman"/>
-              </w:rPr>
-              <w:t>Prompt:</w:t>
-            </w:r>
-          </w:p>
-        </w:tc>
-        <w:tc>
-          <w:tcPr>
-            <w:tcW w:w="6745" w:type="dxa"/>
-          </w:tcPr>
-          <w:p>
-            <w:r>
-              <w:rPr>
-                <w:rFonts w:cs="Times New Roman"/>
-                <w:i/>
-              </w:rPr>
-              <w:t xml:space="preserve">Begin with ‘All teenagers need …’.</w:t>
-            </w:r>
-          </w:p>
-        </w:tc>
-      </w:tr>
-      <w:tr>
-        <w:tc>
-          <w:tcPr>
-            <w:tcW w:w="9350" w:type="dxa"/>
-            <w:gridSpan w:val="2"/>
-          </w:tcPr>
-          <w:p/>
-          <w:p/>
-        </w:tc>
-      </w:tr>
-    </w:tbl>
-    <w:p>
-      <w:pPr>
         <w:pStyle w:val="Heading1"/>
         <w:spacing w:line="360" w:lineRule="auto"/>
         <w:rPr>
@@ -1318,7 +1318,7 @@
         <w:rPr>
           <w:rFonts w:cs="Times New Roman"/>
         </w:rPr>
-        <w:t xml:space="preserve">Rewrite each simple sentence as a cleft sentence. The sentences are about technology and communication, so keep the register formal. Sets 1–4 are straightforward; sets 5–8 require you to change the part of speech.</w:t>
+        <w:t xml:space="preserve">Rewrite each sentence as a cleft sentence. The type of cleft to use is shown in brackets.</w:t>
       </w:r>
     </w:p>
     <w:p>
@@ -1331,7 +1331,7 @@
           <w:rFonts w:ascii="Times New Roman" w:hAnsi="Times New Roman" w:cs="Times New Roman"/>
           <w:sz w:val="22"/>
         </w:rPr>
-        <w:t xml:space="preserve">Example Set 1 (It-cleft – the cause)</w:t>
+        <w:t xml:space="preserve">Set 1: It-cleft – the cause</w:t>
       </w:r>
     </w:p>
     <w:tbl>
@@ -1396,7 +1396,7 @@
                 <w:rFonts w:cs="Times New Roman"/>
                 <w:i/>
               </w:rPr>
-              <w:t xml:space="preserve">Begin with ‘It is the fear of real conversations …’.</w:t>
+              <w:t xml:space="preserve">Use an IT-cleft.</w:t>
             </w:r>
           </w:p>
         </w:tc>
@@ -1422,7 +1422,7 @@
           <w:rFonts w:ascii="Times New Roman" w:hAnsi="Times New Roman" w:cs="Times New Roman"/>
           <w:sz w:val="22"/>
         </w:rPr>
-        <w:t xml:space="preserve">Example Set 2 (Wh-cleft – what is needed)</w:t>
+        <w:t xml:space="preserve">Set 2: Wh-cleft – the recommendation</w:t>
       </w:r>
     </w:p>
     <w:tbl>
@@ -1487,7 +1487,7 @@
                 <w:rFonts w:cs="Times New Roman"/>
                 <w:i/>
               </w:rPr>
-              <w:t xml:space="preserve">Begin with ‘What students need to do …’.</w:t>
+              <w:t xml:space="preserve">Use a WHAT-cleft.</w:t>
             </w:r>
           </w:p>
         </w:tc>
@@ -1513,7 +1513,7 @@
           <w:rFonts w:ascii="Times New Roman" w:hAnsi="Times New Roman" w:cs="Times New Roman"/>
           <w:sz w:val="22"/>
         </w:rPr>
-        <w:t xml:space="preserve">Example Set 3 (It-cleft – the contrast)</w:t>
+        <w:t xml:space="preserve">Set 3: All-cleft – the only thing needed</w:t>
       </w:r>
     </w:p>
     <w:tbl>
@@ -1549,7 +1549,7 @@
               <w:rPr>
                 <w:rFonts w:cs="Times New Roman"/>
               </w:rPr>
-              <w:t xml:space="preserve">People blame social media, but modern phones are the real problem.</w:t>
+              <w:t xml:space="preserve">Teenagers only need to be confident to start a real conversation.</w:t>
             </w:r>
           </w:p>
         </w:tc>
@@ -1578,7 +1578,7 @@
                 <w:rFonts w:cs="Times New Roman"/>
                 <w:i/>
               </w:rPr>
-              <w:t xml:space="preserve">Begin with ‘While people blame social media …’.</w:t>
+              <w:t xml:space="preserve">Use an ALL-cleft.</w:t>
             </w:r>
           </w:p>
         </w:tc>
@@ -1604,189 +1604,7 @@
           <w:rFonts w:ascii="Times New Roman" w:hAnsi="Times New Roman" w:cs="Times New Roman"/>
           <w:sz w:val="22"/>
         </w:rPr>
-        <w:t xml:space="preserve">Example Set 4 (All-cleft – the only thing needed)</w:t>
-      </w:r>
-    </w:p>
-    <w:tbl>
-      <w:tblPr>
-        <w:tblStyle w:val="TableGrid"/>
-        <w:tblW w:w="0" w:type="auto"/>
-        <w:tblLook w:val="04A0" w:firstRow="1" w:lastRow="0" w:firstColumn="1" w:lastColumn="0" w:noHBand="0" w:noVBand="1"/>
-      </w:tblPr>
-      <w:tblGrid>
-        <w:gridCol w:w="2605"/>
-        <w:gridCol w:w="6745"/>
-      </w:tblGrid>
-      <w:tr>
-        <w:tc>
-          <w:tcPr>
-            <w:tcW w:w="2605" w:type="dxa"/>
-          </w:tcPr>
-          <w:p>
-            <w:r>
-              <w:rPr>
-                <w:rFonts w:cs="Times New Roman"/>
-              </w:rPr>
-              <w:t>Simple sentence:</w:t>
-            </w:r>
-          </w:p>
-        </w:tc>
-        <w:tc>
-          <w:tcPr>
-            <w:tcW w:w="6745" w:type="dxa"/>
-          </w:tcPr>
-          <w:p>
-            <w:r>
-              <w:rPr>
-                <w:rFonts w:cs="Times New Roman"/>
-              </w:rPr>
-              <w:t xml:space="preserve">Teenagers only need one proper conversation to understand the value of talking.</w:t>
-            </w:r>
-          </w:p>
-        </w:tc>
-      </w:tr>
-      <w:tr>
-        <w:tc>
-          <w:tcPr>
-            <w:tcW w:w="2605" w:type="dxa"/>
-          </w:tcPr>
-          <w:p>
-            <w:r>
-              <w:rPr>
-                <w:rFonts w:cs="Times New Roman"/>
-              </w:rPr>
-              <w:t>Prompt:</w:t>
-            </w:r>
-          </w:p>
-        </w:tc>
-        <w:tc>
-          <w:tcPr>
-            <w:tcW w:w="6745" w:type="dxa"/>
-          </w:tcPr>
-          <w:p>
-            <w:r>
-              <w:rPr>
-                <w:rFonts w:cs="Times New Roman"/>
-                <w:i/>
-              </w:rPr>
-              <w:t xml:space="preserve">Begin with ‘All teenagers need …’.</w:t>
-            </w:r>
-          </w:p>
-        </w:tc>
-      </w:tr>
-      <w:tr>
-        <w:tc>
-          <w:tcPr>
-            <w:tcW w:w="9350" w:type="dxa"/>
-            <w:gridSpan w:val="2"/>
-          </w:tcPr>
-          <w:p/>
-          <w:p/>
-        </w:tc>
-      </w:tr>
-    </w:tbl>
-    <w:p>
-      <w:pPr>
-        <w:pStyle w:val="Heading3"/>
-        <w:spacing w:line="360" w:lineRule="auto"/>
-      </w:pPr>
-      <w:r>
-        <w:rPr>
-          <w:rFonts w:ascii="Times New Roman" w:hAnsi="Times New Roman" w:cs="Times New Roman"/>
-          <w:sz w:val="22"/>
-        </w:rPr>
-        <w:t xml:space="preserve">Example Set 5 (It-cleft – the cause, word-form change)</w:t>
-      </w:r>
-    </w:p>
-    <w:tbl>
-      <w:tblPr>
-        <w:tblStyle w:val="TableGrid"/>
-        <w:tblW w:w="0" w:type="auto"/>
-        <w:tblLook w:val="04A0" w:firstRow="1" w:lastRow="0" w:firstColumn="1" w:lastColumn="0" w:noHBand="0" w:noVBand="1"/>
-      </w:tblPr>
-      <w:tblGrid>
-        <w:gridCol w:w="2605"/>
-        <w:gridCol w:w="6745"/>
-      </w:tblGrid>
-      <w:tr>
-        <w:tc>
-          <w:tcPr>
-            <w:tcW w:w="2605" w:type="dxa"/>
-          </w:tcPr>
-          <w:p>
-            <w:r>
-              <w:rPr>
-                <w:rFonts w:cs="Times New Roman"/>
-              </w:rPr>
-              <w:t>Simple sentence:</w:t>
-            </w:r>
-          </w:p>
-        </w:tc>
-        <w:tc>
-          <w:tcPr>
-            <w:tcW w:w="6745" w:type="dxa"/>
-          </w:tcPr>
-          <w:p>
-            <w:r>
-              <w:rPr>
-                <w:rFonts w:cs="Times New Roman"/>
-              </w:rPr>
-              <w:t xml:space="preserve">People feel brave when they insult others online because they are anonymous.</w:t>
-            </w:r>
-          </w:p>
-        </w:tc>
-      </w:tr>
-      <w:tr>
-        <w:tc>
-          <w:tcPr>
-            <w:tcW w:w="2605" w:type="dxa"/>
-          </w:tcPr>
-          <w:p>
-            <w:r>
-              <w:rPr>
-                <w:rFonts w:cs="Times New Roman"/>
-              </w:rPr>
-              <w:t>Prompt:</w:t>
-            </w:r>
-          </w:p>
-        </w:tc>
-        <w:tc>
-          <w:tcPr>
-            <w:tcW w:w="6745" w:type="dxa"/>
-          </w:tcPr>
-          <w:p>
-            <w:r>
-              <w:rPr>
-                <w:rFonts w:cs="Times New Roman"/>
-                <w:i/>
-              </w:rPr>
-              <w:t xml:space="preserve">Begin with ‘It is the anonymity …’.</w:t>
-            </w:r>
-          </w:p>
-        </w:tc>
-      </w:tr>
-      <w:tr>
-        <w:tc>
-          <w:tcPr>
-            <w:tcW w:w="9350" w:type="dxa"/>
-            <w:gridSpan w:val="2"/>
-          </w:tcPr>
-          <w:p/>
-          <w:p/>
-        </w:tc>
-      </w:tr>
-    </w:tbl>
-    <w:p>
-      <w:pPr>
-        <w:pStyle w:val="Heading3"/>
-        <w:spacing w:line="360" w:lineRule="auto"/>
-      </w:pPr>
-      <w:r>
-        <w:rPr>
-          <w:rFonts w:ascii="Times New Roman" w:hAnsi="Times New Roman" w:cs="Times New Roman"/>
-          <w:sz w:val="22"/>
-        </w:rPr>
-        <w:t xml:space="preserve">Example Set 6 (It-cleft – the contrast, word-form change)</w:t>
+        <w:t xml:space="preserve">Set 4: It-cleft – the contrast</w:t>
       </w:r>
     </w:p>
     <w:tbl>
@@ -1851,189 +1669,7 @@
                 <w:rFonts w:cs="Times New Roman"/>
                 <w:i/>
               </w:rPr>
-              <w:t xml:space="preserve">Begin with ‘While people think technology is convenient …’.</w:t>
-            </w:r>
-          </w:p>
-        </w:tc>
-      </w:tr>
-      <w:tr>
-        <w:tc>
-          <w:tcPr>
-            <w:tcW w:w="9350" w:type="dxa"/>
-            <w:gridSpan w:val="2"/>
-          </w:tcPr>
-          <w:p/>
-          <w:p/>
-        </w:tc>
-      </w:tr>
-    </w:tbl>
-    <w:p>
-      <w:pPr>
-        <w:pStyle w:val="Heading3"/>
-        <w:spacing w:line="360" w:lineRule="auto"/>
-      </w:pPr>
-      <w:r>
-        <w:rPr>
-          <w:rFonts w:ascii="Times New Roman" w:hAnsi="Times New Roman" w:cs="Times New Roman"/>
-          <w:sz w:val="22"/>
-        </w:rPr>
-        <w:t xml:space="preserve">Example Set 7 (Wh-cleft – the recommendation, word-form change)</w:t>
-      </w:r>
-    </w:p>
-    <w:tbl>
-      <w:tblPr>
-        <w:tblStyle w:val="TableGrid"/>
-        <w:tblW w:w="0" w:type="auto"/>
-        <w:tblLook w:val="04A0" w:firstRow="1" w:lastRow="0" w:firstColumn="1" w:lastColumn="0" w:noHBand="0" w:noVBand="1"/>
-      </w:tblPr>
-      <w:tblGrid>
-        <w:gridCol w:w="2605"/>
-        <w:gridCol w:w="6745"/>
-      </w:tblGrid>
-      <w:tr>
-        <w:tc>
-          <w:tcPr>
-            <w:tcW w:w="2605" w:type="dxa"/>
-          </w:tcPr>
-          <w:p>
-            <w:r>
-              <w:rPr>
-                <w:rFonts w:cs="Times New Roman"/>
-              </w:rPr>
-              <w:t>Simple sentence:</w:t>
-            </w:r>
-          </w:p>
-        </w:tc>
-        <w:tc>
-          <w:tcPr>
-            <w:tcW w:w="6745" w:type="dxa"/>
-          </w:tcPr>
-          <w:p>
-            <w:r>
-              <w:rPr>
-                <w:rFonts w:cs="Times New Roman"/>
-              </w:rPr>
-              <w:t xml:space="preserve">Schools should make students aware that talking face to face is important.</w:t>
-            </w:r>
-          </w:p>
-        </w:tc>
-      </w:tr>
-      <w:tr>
-        <w:tc>
-          <w:tcPr>
-            <w:tcW w:w="2605" w:type="dxa"/>
-          </w:tcPr>
-          <w:p>
-            <w:r>
-              <w:rPr>
-                <w:rFonts w:cs="Times New Roman"/>
-              </w:rPr>
-              <w:t>Prompt:</w:t>
-            </w:r>
-          </w:p>
-        </w:tc>
-        <w:tc>
-          <w:tcPr>
-            <w:tcW w:w="6745" w:type="dxa"/>
-          </w:tcPr>
-          <w:p>
-            <w:r>
-              <w:rPr>
-                <w:rFonts w:cs="Times New Roman"/>
-                <w:i/>
-              </w:rPr>
-              <w:t xml:space="preserve">Begin with ‘What schools should do …’.</w:t>
-            </w:r>
-          </w:p>
-        </w:tc>
-      </w:tr>
-      <w:tr>
-        <w:tc>
-          <w:tcPr>
-            <w:tcW w:w="9350" w:type="dxa"/>
-            <w:gridSpan w:val="2"/>
-          </w:tcPr>
-          <w:p/>
-          <w:p/>
-        </w:tc>
-      </w:tr>
-    </w:tbl>
-    <w:p>
-      <w:pPr>
-        <w:pStyle w:val="Heading3"/>
-        <w:spacing w:line="360" w:lineRule="auto"/>
-      </w:pPr>
-      <w:r>
-        <w:rPr>
-          <w:rFonts w:ascii="Times New Roman" w:hAnsi="Times New Roman" w:cs="Times New Roman"/>
-          <w:sz w:val="22"/>
-        </w:rPr>
-        <w:t xml:space="preserve">Example Set 8 (All-cleft – the only thing needed, word-form change)</w:t>
-      </w:r>
-    </w:p>
-    <w:tbl>
-      <w:tblPr>
-        <w:tblStyle w:val="TableGrid"/>
-        <w:tblW w:w="0" w:type="auto"/>
-        <w:tblLook w:val="04A0" w:firstRow="1" w:lastRow="0" w:firstColumn="1" w:lastColumn="0" w:noHBand="0" w:noVBand="1"/>
-      </w:tblPr>
-      <w:tblGrid>
-        <w:gridCol w:w="2605"/>
-        <w:gridCol w:w="6745"/>
-      </w:tblGrid>
-      <w:tr>
-        <w:tc>
-          <w:tcPr>
-            <w:tcW w:w="2605" w:type="dxa"/>
-          </w:tcPr>
-          <w:p>
-            <w:r>
-              <w:rPr>
-                <w:rFonts w:cs="Times New Roman"/>
-              </w:rPr>
-              <w:t>Simple sentence:</w:t>
-            </w:r>
-          </w:p>
-        </w:tc>
-        <w:tc>
-          <w:tcPr>
-            <w:tcW w:w="6745" w:type="dxa"/>
-          </w:tcPr>
-          <w:p>
-            <w:r>
-              <w:rPr>
-                <w:rFonts w:cs="Times New Roman"/>
-              </w:rPr>
-              <w:t xml:space="preserve">Teenagers only need to be confident for one minute to start a real conversation.</w:t>
-            </w:r>
-          </w:p>
-        </w:tc>
-      </w:tr>
-      <w:tr>
-        <w:tc>
-          <w:tcPr>
-            <w:tcW w:w="2605" w:type="dxa"/>
-          </w:tcPr>
-          <w:p>
-            <w:r>
-              <w:rPr>
-                <w:rFonts w:cs="Times New Roman"/>
-              </w:rPr>
-              <w:t>Prompt:</w:t>
-            </w:r>
-          </w:p>
-        </w:tc>
-        <w:tc>
-          <w:tcPr>
-            <w:tcW w:w="6745" w:type="dxa"/>
-          </w:tcPr>
-          <w:p>
-            <w:r>
-              <w:rPr>
-                <w:rFonts w:cs="Times New Roman"/>
-                <w:i/>
-              </w:rPr>
-              <w:t xml:space="preserve">Begin with ‘All teenagers need …’.</w:t>
+              <w:t xml:space="preserve">Use an IT-cleft with WHILE.</w:t>
             </w:r>
           </w:p>
         </w:tc>

</xml_diff>

<commit_message>
v4.1: trim Para B, pad Para A, fix easy It-cleft question
</commit_message>
<xml_diff>
--- a/Lesson 4 - Cleft sentences (Student's).docx
+++ b/Lesson 4 - Cleft sentences (Student's).docx
@@ -112,7 +112,7 @@
         <w:rPr>
           <w:rFonts w:cs="Times New Roman"/>
         </w:rPr>
-        <w:t xml:space="preserve">Everyone claims that technology makes life easier, but the truth is far less pleasant. Not only teenagers order food instead of cooking, but they also replace real conversations with emoji-filled messages. They sit for hours on apps, that were designed to save time, and end up achieving nothing meaningful. The convenient of instant delivery has destroyed any reason to walk to the shops. Rarely parents notice that their children have forgotten how to hold a proper conversation. Only when someone removes every screen from the house the family remembers what silence feels like.</w:t>
+        <w:t xml:space="preserve">Everyone claims that technology makes life easier, but the truth is far less pleasant. Not only teenagers order food instead of cooking, but they also replace real conversations with emoji-filled messages. They sit for hours on apps, that were designed to save time, and end up achieving nothing meaningful. The convenient of instant delivery has destroyed any reason to walk to the shops. Rarely parents notice that their children have forgotten how to hold a proper conversation. Only if teenagers put down their phones the family can have a real conversation.</w:t>
       </w:r>
     </w:p>
     <w:p>
@@ -123,7 +123,7 @@
         <w:rPr>
           <w:rFonts w:cs="Times New Roman"/>
         </w:rPr>
-        <w:t xml:space="preserve">Has technology really destroyed our generation, or have older adults simply misunderstood how we work? What they refuse to accept is that young people today manage schoolwork alongside online projects they could never have completed without the internet. Not only teenagers of the past lacked these tools, but they also missed the opportunities that digital platforms create. The believe that real work must involve physical sweat ignores the fact that running a website demands just as much effort. Rarely critics acknowledge that a teenager editing videos is working just as hard as someone lifting boxes. The reason because teenagers seem distracted is not laziness but the creative work they are doing on their phones. Only when adults look at the results of their work they can understand what teenagers actually achieve.</w:t>
+        <w:t xml:space="preserve">Has technology really destroyed our generation, or have adults simply misunderstood how we work? What they refuse to accept is that young people today manage schoolwork alongside digital projects what they could never have completed alone. The believe that real work must involve physical sweat ignores the fact that running a website demands just as much effort. Rarely critics acknowledge that a teenager editing videos is working just as hard as someone lifting boxes. The reason because teenagers seem distracted is not laziness but the creative work they are doing on their phones. Only when adults look at the results of their work they can understand what teenagers actually achieve.</w:t>
       </w:r>
     </w:p>
     <w:p>
@@ -873,7 +873,7 @@
               <w:rPr>
                 <w:rFonts w:cs="Times New Roman"/>
               </w:rPr>
-              <w:t xml:space="preserve">Young people forget social skills because they text too much.</w:t>
+              <w:t xml:space="preserve">Young people forget social skills because they use messaging apps.</w:t>
             </w:r>
           </w:p>
         </w:tc>
@@ -902,7 +902,7 @@
                 <w:rFonts w:cs="Times New Roman"/>
                 <w:i/>
               </w:rPr>
-              <w:t xml:space="preserve">Begin with ‘It is the overuse of texting …’.</w:t>
+              <w:t xml:space="preserve">Begin with ‘It is messaging apps …’.</w:t>
             </w:r>
           </w:p>
         </w:tc>

</xml_diff>

<commit_message>
v5: teacher version from Helen's student docx
- Part 1: Proofreading quiz with teacher answers (10 errors across 2 paragraphs)
- Part 2: Cleft sentence structures table + popular culture examples for teacher reference
  (It-cleft: LOTR, Harry Potter, Dickens; Wh-cleft: Kelly Clarkson, Gladiator, Bacharach;
  All-cleft: Mariah Carey, LOTR, Shakespeare/Tolkien)
- Part 3A: 5 It-cleft practice with teacher answers
- Part 3B: 5 Wh/All-cleft practice with teacher answers
- Part 3C: Paragraph transformation with sample transformations
</commit_message>
<xml_diff>
--- a/Lesson 4 - Cleft sentences (Student's).docx
+++ b/Lesson 4 - Cleft sentences (Student's).docx
@@ -14,11 +14,80 @@
       </w:pPr>
       <w:r>
         <w:rPr>
+          <w:rFonts w:ascii="Trebuchet MS" w:hAnsi="Trebuchet MS"/>
+          <w:b/>
+          <w:i/>
+          <w:noProof/>
+          <w:szCs w:val="20"/>
+          <w:lang w:eastAsia="zh-TW"/>
+        </w:rPr>
+        <w:drawing>
+          <wp:anchor distT="0" distB="0" distL="114300" distR="114300" simplePos="0" relativeHeight="251659264" behindDoc="0" locked="0" layoutInCell="1" allowOverlap="1" wp14:anchorId="7570E6DD" wp14:editId="6B8AC110">
+            <wp:simplePos x="0" y="0"/>
+            <wp:positionH relativeFrom="column">
+              <wp:posOffset>4621161</wp:posOffset>
+            </wp:positionH>
+            <wp:positionV relativeFrom="paragraph">
+              <wp:posOffset>-68826</wp:posOffset>
+            </wp:positionV>
+            <wp:extent cx="1838325" cy="571500"/>
+            <wp:effectExtent l="0" t="0" r="9525" b="0"/>
+            <wp:wrapNone/>
+            <wp:docPr id="9" name="Picture 9" descr="A white rectangular object with black lines&#10;&#10;AI-generated content may be incorrect."/>
+            <wp:cNvGraphicFramePr>
+              <a:graphicFrameLocks xmlns:a="http://schemas.openxmlformats.org/drawingml/2006/main" noChangeAspect="1"/>
+            </wp:cNvGraphicFramePr>
+            <a:graphic xmlns:a="http://schemas.openxmlformats.org/drawingml/2006/main">
+              <a:graphicData uri="http://schemas.openxmlformats.org/drawingml/2006/picture">
+                <pic:pic xmlns:pic="http://schemas.openxmlformats.org/drawingml/2006/picture">
+                  <pic:nvPicPr>
+                    <pic:cNvPr id="9" name="Picture 9" descr="A white rectangular object with black lines&#10;&#10;AI-generated content may be incorrect."/>
+                    <pic:cNvPicPr>
+                      <a:picLocks noChangeAspect="1" noChangeArrowheads="1"/>
+                    </pic:cNvPicPr>
+                  </pic:nvPicPr>
+                  <pic:blipFill>
+                    <a:blip r:embed="rId8">
+                      <a:extLst>
+                        <a:ext uri="{28A0092B-C50C-407E-A947-70E740481C1C}">
+                          <a14:useLocalDpi xmlns:a14="http://schemas.microsoft.com/office/drawing/2010/main" val="0"/>
+                        </a:ext>
+                      </a:extLst>
+                    </a:blip>
+                    <a:srcRect/>
+                    <a:stretch>
+                      <a:fillRect/>
+                    </a:stretch>
+                  </pic:blipFill>
+                  <pic:spPr bwMode="auto">
+                    <a:xfrm>
+                      <a:off x="0" y="0"/>
+                      <a:ext cx="1838325" cy="571500"/>
+                    </a:xfrm>
+                    <a:prstGeom prst="rect">
+                      <a:avLst/>
+                    </a:prstGeom>
+                    <a:noFill/>
+                  </pic:spPr>
+                </pic:pic>
+              </a:graphicData>
+            </a:graphic>
+            <wp14:sizeRelH relativeFrom="page">
+              <wp14:pctWidth>0</wp14:pctWidth>
+            </wp14:sizeRelH>
+            <wp14:sizeRelV relativeFrom="page">
+              <wp14:pctHeight>0</wp14:pctHeight>
+            </wp14:sizeRelV>
+          </wp:anchor>
+        </w:drawing>
+      </w:r>
+      <w:r>
+        <w:rPr>
           <w:rFonts w:ascii="Century Gothic" w:hAnsi="Century Gothic"/>
           <w:b/>
           <w:iCs/>
         </w:rPr>
-        <w:t xml:space="preserve">St. Joseph’s Anglo-Chinese School</w:t>
+        <w:t>St. Joseph’s Anglo-Chinese School</w:t>
       </w:r>
     </w:p>
     <w:p>
@@ -37,7 +106,7 @@
           <w:b/>
           <w:iCs/>
         </w:rPr>
-        <w:t xml:space="preserve">F.5 English Language</w:t>
+        <w:t>F.5 English Language</w:t>
       </w:r>
     </w:p>
     <w:p>
@@ -58,7 +127,7 @@
           <w:b/>
           <w:iCs/>
         </w:rPr>
-        <w:t xml:space="preserve">Grammar – Lesson 4: Cleft sentences</w:t>
+        <w:t>Grammar – Lesson 4: Cleft sentences</w:t>
       </w:r>
     </w:p>
     <w:p>
@@ -72,7 +141,7 @@
           <w:b/>
           <w:shd w:val="pct15" w:color="auto" w:fill="FFFFFF"/>
         </w:rPr>
-        <w:t xml:space="preserve">Cleft sentences</w:t>
+        <w:t>Cleft sentences</w:t>
       </w:r>
     </w:p>
     <w:p>
@@ -90,87 +159,66 @@
           <w:sz w:val="22"/>
           <w:szCs w:val="22"/>
         </w:rPr>
-        <w:t xml:space="preserve">Part 1: Proofreading quiz</w:t>
+        <w:t>Part 1: Proofreading quiz</w:t>
       </w:r>
     </w:p>
     <w:p>
       <w:pPr>
         <w:spacing w:line="360" w:lineRule="auto"/>
+        <w:rPr>
+          <w:rFonts w:cs="Times New Roman"/>
+        </w:rPr>
       </w:pPr>
       <w:r>
         <w:rPr>
           <w:rFonts w:cs="Times New Roman"/>
         </w:rPr>
-        <w:t xml:space="preserve">Your teacher has put two paragraphs on the board. One argues that technology has made people lazier (Paragraph A). The other argues that technology has not made us lazier (Paragraph B). Each paragraph contains FIVE errors. The errors include relative clauses, inverted patterns and nominalisation. Proofread the paragraphs.</w:t>
+        <w:t xml:space="preserve">Each paragraph contains FIVE errors. The errors include </w:t>
       </w:r>
-    </w:p>
-    <w:p>
-      <w:pPr>
-        <w:spacing w:line="360" w:lineRule="auto"/>
-      </w:pPr>
+      <w:r>
+        <w:rPr>
+          <w:rFonts w:cs="Times New Roman"/>
+          <w:b/>
+          <w:bCs/>
+          <w:u w:val="single"/>
+        </w:rPr>
+        <w:t>relative clauses</w:t>
+      </w:r>
       <w:r>
         <w:rPr>
           <w:rFonts w:cs="Times New Roman"/>
         </w:rPr>
-        <w:t xml:space="preserve">Everyone claims that technology makes life easier, but the truth is far less pleasant. Not only teenagers order food instead of cooking, but they also replace real conversations with emoji-filled messages. They sit for hours on apps, that were designed to save time, and end up achieving nothing meaningful. The convenient of instant delivery has destroyed any reason to walk to the shops. Rarely parents notice that their children have forgotten how to hold a proper conversation. Only if teenagers put down their phones the family can have a real conversation.</w:t>
+        <w:t xml:space="preserve">, </w:t>
       </w:r>
-    </w:p>
-    <w:p>
-      <w:pPr>
-        <w:spacing w:line="360" w:lineRule="auto"/>
-      </w:pPr>
+      <w:r>
+        <w:rPr>
+          <w:rFonts w:cs="Times New Roman"/>
+          <w:b/>
+          <w:bCs/>
+          <w:u w:val="single"/>
+        </w:rPr>
+        <w:t>inverted patterns</w:t>
+      </w:r>
       <w:r>
         <w:rPr>
           <w:rFonts w:cs="Times New Roman"/>
         </w:rPr>
-        <w:t xml:space="preserve">Has technology really destroyed our generation, or have adults simply misunderstood how we work? What they refuse to accept is that young people today manage schoolwork alongside digital projects what they could never have completed alone. The believe that real work must involve physical sweat ignores the fact that running a website demands just as much effort. Rarely critics acknowledge that a teenager editing videos is working just as hard as someone lifting boxes. The reason because teenagers seem distracted is not laziness but the creative work they are doing on their phones. Only when adults look at the results of their work they can understand what teenagers actually achieve.</w:t>
+        <w:t xml:space="preserve"> and </w:t>
       </w:r>
-    </w:p>
-    <w:p>
-      <w:pPr>
-        <w:spacing w:line="360" w:lineRule="auto"/>
-      </w:pPr>
-    </w:p>
-    <w:p>
-      <w:pPr>
-        <w:pStyle w:val="Heading2"/>
-        <w:spacing w:line="360" w:lineRule="auto"/>
-        <w:rPr>
-          <w:sz w:val="22"/>
-          <w:szCs w:val="22"/>
-        </w:rPr>
-      </w:pPr>
       <w:r>
         <w:rPr>
-          <w:rFonts w:ascii="Times New Roman" w:hAnsi="Times New Roman" w:cs="Times New Roman"/>
-          <w:sz w:val="22"/>
-          <w:szCs w:val="22"/>
+          <w:rFonts w:cs="Times New Roman"/>
+          <w:b/>
+          <w:bCs/>
+          <w:u w:val="single"/>
         </w:rPr>
-        <w:t xml:space="preserve">Part 2: Cleft sentences in formal writing</w:t>
+        <w:t>parts of speech</w:t>
       </w:r>
-    </w:p>
-    <w:p>
-      <w:pPr>
-        <w:spacing w:line="360" w:lineRule="auto"/>
-      </w:pPr>
       <w:r>
         <w:rPr>
           <w:rFonts w:cs="Times New Roman"/>
         </w:rPr>
-        <w:t xml:space="preserve">A cleft sentence breaks one idea into two parts so the most important information stands out. Study the patterns below.</w:t>
-      </w:r>
-    </w:p>
-    <w:p>
-      <w:pPr>
-        <w:pStyle w:val="Heading3"/>
-        <w:spacing w:line="360" w:lineRule="auto"/>
-      </w:pPr>
-      <w:r>
-        <w:rPr>
-          <w:rFonts w:ascii="Times New Roman" w:hAnsi="Times New Roman" w:cs="Times New Roman"/>
-          <w:sz w:val="22"/>
-        </w:rPr>
-        <w:t xml:space="preserve">Example 1: Wh-cleft – presenting a recommendation</w:t>
+        <w:t>. Proofread the paragraphs.</w:t>
       </w:r>
     </w:p>
     <w:tbl>
@@ -180,163 +228,47 @@
         <w:tblLook w:val="04A0" w:firstRow="1" w:lastRow="0" w:firstColumn="1" w:lastColumn="0" w:noHBand="0" w:noVBand="1"/>
       </w:tblPr>
       <w:tblGrid>
-        <w:gridCol w:w="2605"/>
-        <w:gridCol w:w="6745"/>
+        <w:gridCol w:w="9350"/>
       </w:tblGrid>
       <w:tr>
         <w:tc>
           <w:tcPr>
-            <w:tcW w:w="2605" w:type="dxa"/>
-            <w:shd w:val="clear" w:color="auto" w:fill="DEEBF7"/>
+            <w:tcW w:w="9350" w:type="dxa"/>
           </w:tcPr>
           <w:p>
+            <w:pPr>
+              <w:spacing w:before="240" w:line="600" w:lineRule="auto"/>
+            </w:pPr>
             <w:r>
               <w:rPr>
                 <w:rFonts w:cs="Times New Roman"/>
               </w:rPr>
-              <w:t xml:space="preserve">Plain:</w:t>
+              <w:t>Argument for: Technology has made us lazier. (5 errors)</w:t>
             </w:r>
           </w:p>
-        </w:tc>
-        <w:tc>
-          <w:tcPr>
-            <w:tcW w:w="6745" w:type="dxa"/>
-            <w:shd w:val="clear" w:color="auto" w:fill="DEEBF7"/>
-          </w:tcPr>
           <w:p>
+            <w:pPr>
+              <w:spacing w:before="240" w:line="600" w:lineRule="auto"/>
+            </w:pPr>
             <w:r>
               <w:rPr>
                 <w:rFonts w:cs="Times New Roman"/>
               </w:rPr>
-              <w:t xml:space="preserve">Schools should teach students how to communicate face to face.</w:t>
+              <w:t xml:space="preserve">It is claimed that technology makes life easier, but the truth is far less pleasant. Not only teenagers order food instead of cooking, but they also replace real conversations with emoji-filled messages. They sit for hours on apps, that were designed to save </w:t>
             </w:r>
-          </w:p>
-        </w:tc>
-      </w:tr>
-      <w:tr>
-        <w:tc>
-          <w:tcPr>
-            <w:tcW w:w="2605" w:type="dxa"/>
-            <w:shd w:val="clear" w:color="auto" w:fill="DEEBF7"/>
-          </w:tcPr>
-          <w:p>
+            <w:proofErr w:type="gramStart"/>
             <w:r>
               <w:rPr>
                 <w:rFonts w:cs="Times New Roman"/>
               </w:rPr>
-              <w:t xml:space="preserve">More formal:</w:t>
+              <w:t>time, and</w:t>
             </w:r>
-          </w:p>
-        </w:tc>
-        <w:tc>
-          <w:tcPr>
-            <w:tcW w:w="6745" w:type="dxa"/>
-            <w:shd w:val="clear" w:color="auto" w:fill="DEEBF7"/>
-          </w:tcPr>
-          <w:p>
+            <w:proofErr w:type="gramEnd"/>
             <w:r>
               <w:rPr>
                 <w:rFonts w:cs="Times New Roman"/>
               </w:rPr>
-              <w:t xml:space="preserve">What schools should do is teach students how to communicate face to face.</w:t>
-            </w:r>
-          </w:p>
-        </w:tc>
-      </w:tr>
-    </w:tbl>
-    <w:p>
-      <w:pPr>
-        <w:pBdr>
-          <w:top w:val="single" w:sz="4" w:space="4" w:color="auto"/>
-          <w:left w:val="single" w:sz="4" w:space="4" w:color="auto"/>
-          <w:bottom w:val="single" w:sz="4" w:space="4" w:color="auto"/>
-          <w:right w:val="single" w:sz="4" w:space="4" w:color="auto"/>
-        </w:pBdr>
-        <w:spacing w:line="360" w:lineRule="auto"/>
-      </w:pPr>
-      <w:r>
-        <w:rPr>
-          <w:rFonts w:cs="Times New Roman"/>
-        </w:rPr>
-        <w:t xml:space="preserve">Many teachers complain that their students cannot hold a proper conversation. What schools should do is teach students how to communicate face to face. A single workshop on active listening would help teenagers rebuild the skills that messaging apps have quietly taken away.</w:t>
-      </w:r>
-    </w:p>
-    <w:p>
-      <w:pPr>
-        <w:pStyle w:val="Heading3"/>
-        <w:spacing w:line="360" w:lineRule="auto"/>
-      </w:pPr>
-      <w:r>
-        <w:rPr>
-          <w:rFonts w:ascii="Times New Roman" w:hAnsi="Times New Roman" w:cs="Times New Roman"/>
-          <w:sz w:val="22"/>
-        </w:rPr>
-        <w:t xml:space="preserve">Class question 1 (Easy): Wh-cleft – recommendation</w:t>
-      </w:r>
-    </w:p>
-    <w:tbl>
-      <w:tblPr>
-        <w:tblStyle w:val="TableGrid"/>
-        <w:tblW w:w="0" w:type="auto"/>
-        <w:tblLook w:val="04A0" w:firstRow="1" w:lastRow="0" w:firstColumn="1" w:lastColumn="0" w:noHBand="0" w:noVBand="1"/>
-      </w:tblPr>
-      <w:tblGrid>
-        <w:gridCol w:w="2605"/>
-        <w:gridCol w:w="6745"/>
-      </w:tblGrid>
-      <w:tr>
-        <w:tc>
-          <w:tcPr>
-            <w:tcW w:w="2605" w:type="dxa"/>
-          </w:tcPr>
-          <w:p>
-            <w:r>
-              <w:rPr>
-                <w:rFonts w:cs="Times New Roman"/>
-              </w:rPr>
-              <w:t>Simple sentence:</w:t>
-            </w:r>
-          </w:p>
-        </w:tc>
-        <w:tc>
-          <w:tcPr>
-            <w:tcW w:w="6745" w:type="dxa"/>
-          </w:tcPr>
-          <w:p>
-            <w:r>
-              <w:rPr>
-                <w:rFonts w:cs="Times New Roman"/>
-              </w:rPr>
-              <w:t xml:space="preserve">Schools should teach students how to start a real conversation.</w:t>
-            </w:r>
-          </w:p>
-        </w:tc>
-      </w:tr>
-      <w:tr>
-        <w:tc>
-          <w:tcPr>
-            <w:tcW w:w="2605" w:type="dxa"/>
-          </w:tcPr>
-          <w:p>
-            <w:r>
-              <w:rPr>
-                <w:rFonts w:cs="Times New Roman"/>
-              </w:rPr>
-              <w:t>Prompt:</w:t>
-            </w:r>
-          </w:p>
-        </w:tc>
-        <w:tc>
-          <w:tcPr>
-            <w:tcW w:w="6745" w:type="dxa"/>
-          </w:tcPr>
-          <w:p>
-            <w:r>
-              <w:rPr>
-                <w:rFonts w:cs="Times New Roman"/>
-                <w:i/>
-              </w:rPr>
-              <w:t xml:space="preserve">Begin with ‘What schools should do …’.</w:t>
+              <w:t xml:space="preserve"> end up achieving nothing meaningful. The convenient of instant delivery has destroyed any reason to walk to the shops. Rarely parents notice that their children have forgotten how to hold a proper conversation. Only by encouraging teenagers to put down their phones the family can have a real conversation.</w:t>
             </w:r>
           </w:p>
         </w:tc>
@@ -345,183 +277,61 @@
         <w:tc>
           <w:tcPr>
             <w:tcW w:w="9350" w:type="dxa"/>
-            <w:gridSpan w:val="2"/>
-          </w:tcPr>
-          <w:p/>
-          <w:p/>
-        </w:tc>
-      </w:tr>
-    </w:tbl>
-    <w:p>
-      <w:pPr>
-        <w:pStyle w:val="Heading3"/>
-        <w:spacing w:line="360" w:lineRule="auto"/>
-      </w:pPr>
-      <w:r>
-        <w:rPr>
-          <w:rFonts w:ascii="Times New Roman" w:hAnsi="Times New Roman" w:cs="Times New Roman"/>
-          <w:sz w:val="22"/>
-        </w:rPr>
-        <w:t xml:space="preserve">Class question 2 (Harder): Wh-cleft – recommendation</w:t>
-      </w:r>
-    </w:p>
-    <w:tbl>
-      <w:tblPr>
-        <w:tblStyle w:val="TableGrid"/>
-        <w:tblW w:w="0" w:type="auto"/>
-        <w:tblLook w:val="04A0" w:firstRow="1" w:lastRow="0" w:firstColumn="1" w:lastColumn="0" w:noHBand="0" w:noVBand="1"/>
-      </w:tblPr>
-      <w:tblGrid>
-        <w:gridCol w:w="2605"/>
-        <w:gridCol w:w="6745"/>
-      </w:tblGrid>
-      <w:tr>
-        <w:tc>
-          <w:tcPr>
-            <w:tcW w:w="2605" w:type="dxa"/>
           </w:tcPr>
           <w:p>
+            <w:pPr>
+              <w:spacing w:before="240" w:line="600" w:lineRule="auto"/>
+              <w:rPr>
+                <w:rFonts w:cs="Times New Roman"/>
+              </w:rPr>
+            </w:pPr>
             <w:r>
               <w:rPr>
                 <w:rFonts w:cs="Times New Roman"/>
               </w:rPr>
-              <w:t>Simple sentence:</w:t>
+              <w:t>Argument against: Technology has made us lazier. (5 errors)</w:t>
             </w:r>
           </w:p>
-        </w:tc>
-        <w:tc>
-          <w:tcPr>
-            <w:tcW w:w="6745" w:type="dxa"/>
-          </w:tcPr>
           <w:p>
+            <w:pPr>
+              <w:spacing w:before="240" w:line="600" w:lineRule="auto"/>
+              <w:rPr>
+                <w:rFonts w:cs="Times New Roman"/>
+              </w:rPr>
+            </w:pPr>
             <w:r>
               <w:rPr>
                 <w:rFonts w:cs="Times New Roman"/>
               </w:rPr>
-              <w:t xml:space="preserve">Teenagers need a safe space to practise speaking in groups.</w:t>
+              <w:t xml:space="preserve">Critics argue that technology has destroyed our generation. Nevertheless, the truth is that adults have simply misunderstood how we work. What they refuse to accept is that digital tools have allowed young people to accomplish more than the previous generation, for who technology was not available. The believe that real work must involve physical sweat ignores the fact that running a website demands just as much effort. Seldom critics acknowledge that a teenager editing videos is working just as hard as someone lifting boxes. The reason why teenagers seem distracted is not lazy but the creative work they are doing on their phones. Only when adults look at the results of their </w:t>
             </w:r>
-          </w:p>
-        </w:tc>
-      </w:tr>
-      <w:tr>
-        <w:tc>
-          <w:tcPr>
-            <w:tcW w:w="2605" w:type="dxa"/>
-          </w:tcPr>
-          <w:p>
+            <w:proofErr w:type="gramStart"/>
             <w:r>
               <w:rPr>
                 <w:rFonts w:cs="Times New Roman"/>
               </w:rPr>
-              <w:t>Prompt:</w:t>
+              <w:t>work</w:t>
             </w:r>
-          </w:p>
-        </w:tc>
-        <w:tc>
-          <w:tcPr>
-            <w:tcW w:w="6745" w:type="dxa"/>
-          </w:tcPr>
-          <w:p>
-            <w:r>
-              <w:rPr>
-                <w:rFonts w:cs="Times New Roman"/>
-                <w:i/>
-              </w:rPr>
-              <w:t xml:space="preserve">Begin with ‘What teenagers need …’.</w:t>
-            </w:r>
-          </w:p>
-        </w:tc>
-      </w:tr>
-      <w:tr>
-        <w:tc>
-          <w:tcPr>
-            <w:tcW w:w="9350" w:type="dxa"/>
-            <w:gridSpan w:val="2"/>
-          </w:tcPr>
-          <w:p/>
-          <w:p/>
-        </w:tc>
-      </w:tr>
-    </w:tbl>
-    <w:p>
-      <w:pPr>
-        <w:pStyle w:val="Heading3"/>
-        <w:spacing w:line="360" w:lineRule="auto"/>
-      </w:pPr>
-      <w:r>
-        <w:rPr>
-          <w:rFonts w:ascii="Times New Roman" w:hAnsi="Times New Roman" w:cs="Times New Roman"/>
-          <w:sz w:val="22"/>
-        </w:rPr>
-        <w:t xml:space="preserve">Example 2: All-cleft – naming the only thing needed</w:t>
-      </w:r>
-    </w:p>
-    <w:tbl>
-      <w:tblPr>
-        <w:tblStyle w:val="TableGrid"/>
-        <w:tblW w:w="0" w:type="auto"/>
-        <w:tblLook w:val="04A0" w:firstRow="1" w:lastRow="0" w:firstColumn="1" w:lastColumn="0" w:noHBand="0" w:noVBand="1"/>
-      </w:tblPr>
-      <w:tblGrid>
-        <w:gridCol w:w="2605"/>
-        <w:gridCol w:w="6745"/>
-      </w:tblGrid>
-      <w:tr>
-        <w:tc>
-          <w:tcPr>
-            <w:tcW w:w="2605" w:type="dxa"/>
-            <w:shd w:val="clear" w:color="auto" w:fill="DEEBF7"/>
-          </w:tcPr>
-          <w:p>
+            <w:proofErr w:type="gramEnd"/>
             <w:r>
               <w:rPr>
                 <w:rFonts w:cs="Times New Roman"/>
               </w:rPr>
-              <w:t xml:space="preserve">Plain:</w:t>
+              <w:t xml:space="preserve"> they can understand what teenagers </w:t>
             </w:r>
-          </w:p>
-        </w:tc>
-        <w:tc>
-          <w:tcPr>
-            <w:tcW w:w="6745" w:type="dxa"/>
-            <w:shd w:val="clear" w:color="auto" w:fill="DEEBF7"/>
-          </w:tcPr>
-          <w:p>
+            <w:proofErr w:type="gramStart"/>
             <w:r>
               <w:rPr>
                 <w:rFonts w:cs="Times New Roman"/>
               </w:rPr>
-              <w:t xml:space="preserve">Teenagers only need one real conversation to remember the value of talking.</w:t>
+              <w:t>actually achieve</w:t>
             </w:r>
-          </w:p>
-        </w:tc>
-      </w:tr>
-      <w:tr>
-        <w:tc>
-          <w:tcPr>
-            <w:tcW w:w="2605" w:type="dxa"/>
-            <w:shd w:val="clear" w:color="auto" w:fill="DEEBF7"/>
-          </w:tcPr>
-          <w:p>
+            <w:proofErr w:type="gramEnd"/>
             <w:r>
               <w:rPr>
                 <w:rFonts w:cs="Times New Roman"/>
               </w:rPr>
-              <w:t xml:space="preserve">More formal:</w:t>
-            </w:r>
-          </w:p>
-        </w:tc>
-        <w:tc>
-          <w:tcPr>
-            <w:tcW w:w="6745" w:type="dxa"/>
-            <w:shd w:val="clear" w:color="auto" w:fill="DEEBF7"/>
-          </w:tcPr>
-          <w:p>
-            <w:r>
-              <w:rPr>
-                <w:rFonts w:cs="Times New Roman"/>
-              </w:rPr>
-              <w:t xml:space="preserve">All teenagers need is one real conversation to remember the value of talking.</w:t>
+              <w:t>.</w:t>
             </w:r>
           </w:p>
         </w:tc>
@@ -529,282 +339,93 @@
     </w:tbl>
     <w:p>
       <w:pPr>
-        <w:pBdr>
-          <w:top w:val="single" w:sz="4" w:space="4" w:color="auto"/>
-          <w:left w:val="single" w:sz="4" w:space="4" w:color="auto"/>
-          <w:bottom w:val="single" w:sz="4" w:space="4" w:color="auto"/>
-          <w:right w:val="single" w:sz="4" w:space="4" w:color="auto"/>
-        </w:pBdr>
+        <w:pStyle w:val="Heading2"/>
         <w:spacing w:line="360" w:lineRule="auto"/>
-      </w:pPr>
-      <w:r>
         <w:rPr>
-          <w:rFonts w:cs="Times New Roman"/>
+          <w:rFonts w:ascii="Times New Roman" w:hAnsi="Times New Roman" w:cs="Times New Roman"/>
+          <w:sz w:val="22"/>
+          <w:szCs w:val="22"/>
         </w:rPr>
-        <w:t xml:space="preserve">Parents often buy expensive devices or hire tutors to help their children socially. All teenagers need is one real conversation to remember the value of talking. Once they experience the warmth of genuine human connection, the cold comfort of emojis will seem far less appealing.</w:t>
-      </w:r>
-    </w:p>
-    <w:p>
-      <w:pPr>
-        <w:pStyle w:val="Heading3"/>
-        <w:spacing w:line="360" w:lineRule="auto"/>
       </w:pPr>
       <w:r>
         <w:rPr>
           <w:rFonts w:ascii="Times New Roman" w:hAnsi="Times New Roman" w:cs="Times New Roman"/>
           <w:sz w:val="22"/>
+          <w:szCs w:val="22"/>
         </w:rPr>
-        <w:t xml:space="preserve">Class question 1 (Easy): All-cleft</w:t>
+        <w:t>Part 2: Cleft sentences in formal writing</w:t>
+      </w:r>
+    </w:p>
+    <w:p/>
+    <w:p>
+      <w:pPr>
+        <w:spacing w:before="200"/>
+      </w:pPr>
+      <w:r>
+        <w:rPr>
+          <w:b/>
+          <w:color w:val="1B365D"/>
+          <w:sz w:val="28"/>
+        </w:rPr>
+        <w:lastRenderedPageBreak/>
+        <w:t>1. Why Use Cleft Sentences in DSE Writing?</w:t>
       </w:r>
     </w:p>
     <w:tbl>
       <w:tblPr>
-        <w:tblStyle w:val="TableGrid"/>
         <w:tblW w:w="0" w:type="auto"/>
+        <w:jc w:val="center"/>
         <w:tblLook w:val="04A0" w:firstRow="1" w:lastRow="0" w:firstColumn="1" w:lastColumn="0" w:noHBand="0" w:noVBand="1"/>
       </w:tblPr>
       <w:tblGrid>
-        <w:gridCol w:w="2605"/>
-        <w:gridCol w:w="6745"/>
+        <w:gridCol w:w="9792"/>
       </w:tblGrid>
       <w:tr>
+        <w:trPr>
+          <w:jc w:val="center"/>
+        </w:trPr>
         <w:tc>
           <w:tcPr>
-            <w:tcW w:w="2605" w:type="dxa"/>
+            <w:tcW w:w="9792" w:type="dxa"/>
+            <w:tcBorders>
+              <w:left w:val="single" w:sz="24" w:space="0" w:color="1B365D"/>
+            </w:tcBorders>
+            <w:shd w:val="clear" w:color="auto" w:fill="F0F4F8"/>
+            <w:tcMar>
+              <w:top w:w="120" w:type="dxa"/>
+              <w:left w:w="180" w:type="dxa"/>
+              <w:bottom w:w="120" w:type="dxa"/>
+              <w:right w:w="180" w:type="dxa"/>
+            </w:tcMar>
           </w:tcPr>
           <w:p>
+            <w:pPr>
+              <w:spacing w:before="40" w:after="40"/>
+            </w:pPr>
+            <w:r>
+              <w:t xml:space="preserve">Cleft sentences (splitting a sentence into two clauses) allow you to </w:t>
+            </w:r>
             <w:r>
               <w:rPr>
-                <w:rFonts w:cs="Times New Roman"/>
+                <w:b/>
+                <w:bCs/>
+                <w:u w:val="single"/>
               </w:rPr>
-              <w:t>Simple sentence:</w:t>
+              <w:t>emphasize</w:t>
             </w:r>
-          </w:p>
-        </w:tc>
-        <w:tc>
-          <w:tcPr>
-            <w:tcW w:w="6745" w:type="dxa"/>
-          </w:tcPr>
-          <w:p>
+            <w:r>
+              <w:t xml:space="preserve"> critical arguments in essays, speech writings, or articles</w:t>
+            </w:r>
+            <w:r>
+              <w:t xml:space="preserve">. They help to make your arguments more </w:t>
+            </w:r>
             <w:r>
               <w:rPr>
-                <w:rFonts w:cs="Times New Roman"/>
+                <w:b/>
+                <w:bCs/>
+                <w:u w:val="single"/>
               </w:rPr>
-              <w:t xml:space="preserve">Teenagers only need one supportive friend to feel understood.</w:t>
-            </w:r>
-          </w:p>
-        </w:tc>
-      </w:tr>
-      <w:tr>
-        <w:tc>
-          <w:tcPr>
-            <w:tcW w:w="2605" w:type="dxa"/>
-          </w:tcPr>
-          <w:p>
-            <w:r>
-              <w:rPr>
-                <w:rFonts w:cs="Times New Roman"/>
-              </w:rPr>
-              <w:t>Prompt:</w:t>
-            </w:r>
-          </w:p>
-        </w:tc>
-        <w:tc>
-          <w:tcPr>
-            <w:tcW w:w="6745" w:type="dxa"/>
-          </w:tcPr>
-          <w:p>
-            <w:r>
-              <w:rPr>
-                <w:rFonts w:cs="Times New Roman"/>
-                <w:i/>
-              </w:rPr>
-              <w:t xml:space="preserve">Begin with ‘All teenagers need …’.</w:t>
-            </w:r>
-          </w:p>
-        </w:tc>
-      </w:tr>
-      <w:tr>
-        <w:tc>
-          <w:tcPr>
-            <w:tcW w:w="9350" w:type="dxa"/>
-            <w:gridSpan w:val="2"/>
-          </w:tcPr>
-          <w:p/>
-          <w:p/>
-        </w:tc>
-      </w:tr>
-    </w:tbl>
-    <w:p>
-      <w:pPr>
-        <w:pStyle w:val="Heading3"/>
-        <w:spacing w:line="360" w:lineRule="auto"/>
-      </w:pPr>
-      <w:r>
-        <w:rPr>
-          <w:rFonts w:ascii="Times New Roman" w:hAnsi="Times New Roman" w:cs="Times New Roman"/>
-          <w:sz w:val="22"/>
-        </w:rPr>
-        <w:t xml:space="preserve">Class question 2 (Harder): All-cleft</w:t>
-      </w:r>
-    </w:p>
-    <w:tbl>
-      <w:tblPr>
-        <w:tblStyle w:val="TableGrid"/>
-        <w:tblW w:w="0" w:type="auto"/>
-        <w:tblLook w:val="04A0" w:firstRow="1" w:lastRow="0" w:firstColumn="1" w:lastColumn="0" w:noHBand="0" w:noVBand="1"/>
-      </w:tblPr>
-      <w:tblGrid>
-        <w:gridCol w:w="2605"/>
-        <w:gridCol w:w="6745"/>
-      </w:tblGrid>
-      <w:tr>
-        <w:tc>
-          <w:tcPr>
-            <w:tcW w:w="2605" w:type="dxa"/>
-          </w:tcPr>
-          <w:p>
-            <w:r>
-              <w:rPr>
-                <w:rFonts w:cs="Times New Roman"/>
-              </w:rPr>
-              <w:t>Simple sentence:</w:t>
-            </w:r>
-          </w:p>
-        </w:tc>
-        <w:tc>
-          <w:tcPr>
-            <w:tcW w:w="6745" w:type="dxa"/>
-          </w:tcPr>
-          <w:p>
-            <w:r>
-              <w:rPr>
-                <w:rFonts w:cs="Times New Roman"/>
-              </w:rPr>
-              <w:t xml:space="preserve">Teenagers only need to feel brave for a moment to speak to a stranger.</w:t>
-            </w:r>
-          </w:p>
-        </w:tc>
-      </w:tr>
-      <w:tr>
-        <w:tc>
-          <w:tcPr>
-            <w:tcW w:w="2605" w:type="dxa"/>
-          </w:tcPr>
-          <w:p>
-            <w:r>
-              <w:rPr>
-                <w:rFonts w:cs="Times New Roman"/>
-              </w:rPr>
-              <w:t>Prompt:</w:t>
-            </w:r>
-          </w:p>
-        </w:tc>
-        <w:tc>
-          <w:tcPr>
-            <w:tcW w:w="6745" w:type="dxa"/>
-          </w:tcPr>
-          <w:p>
-            <w:r>
-              <w:rPr>
-                <w:rFonts w:cs="Times New Roman"/>
-                <w:i/>
-              </w:rPr>
-              <w:t xml:space="preserve">Begin with ‘All teenagers need …’.</w:t>
-            </w:r>
-          </w:p>
-        </w:tc>
-      </w:tr>
-      <w:tr>
-        <w:tc>
-          <w:tcPr>
-            <w:tcW w:w="9350" w:type="dxa"/>
-            <w:gridSpan w:val="2"/>
-          </w:tcPr>
-          <w:p/>
-          <w:p/>
-        </w:tc>
-      </w:tr>
-    </w:tbl>
-    <w:p>
-      <w:pPr>
-        <w:pStyle w:val="Heading3"/>
-        <w:spacing w:line="360" w:lineRule="auto"/>
-      </w:pPr>
-      <w:r>
-        <w:rPr>
-          <w:rFonts w:ascii="Times New Roman" w:hAnsi="Times New Roman" w:cs="Times New Roman"/>
-          <w:sz w:val="22"/>
-        </w:rPr>
-        <w:t xml:space="preserve">Example 3: It-cleft – focusing on the cause</w:t>
-      </w:r>
-    </w:p>
-    <w:tbl>
-      <w:tblPr>
-        <w:tblStyle w:val="TableGrid"/>
-        <w:tblW w:w="0" w:type="auto"/>
-        <w:tblLook w:val="04A0" w:firstRow="1" w:lastRow="0" w:firstColumn="1" w:lastColumn="0" w:noHBand="0" w:noVBand="1"/>
-      </w:tblPr>
-      <w:tblGrid>
-        <w:gridCol w:w="2605"/>
-        <w:gridCol w:w="6745"/>
-      </w:tblGrid>
-      <w:tr>
-        <w:tc>
-          <w:tcPr>
-            <w:tcW w:w="2605" w:type="dxa"/>
-            <w:shd w:val="clear" w:color="auto" w:fill="DEEBF7"/>
-          </w:tcPr>
-          <w:p>
-            <w:r>
-              <w:rPr>
-                <w:rFonts w:cs="Times New Roman"/>
-              </w:rPr>
-              <w:t xml:space="preserve">Plain:</w:t>
-            </w:r>
-          </w:p>
-        </w:tc>
-        <w:tc>
-          <w:tcPr>
-            <w:tcW w:w="6745" w:type="dxa"/>
-            <w:shd w:val="clear" w:color="auto" w:fill="DEEBF7"/>
-          </w:tcPr>
-          <w:p>
-            <w:r>
-              <w:rPr>
-                <w:rFonts w:cs="Times New Roman"/>
-              </w:rPr>
-              <w:t xml:space="preserve">People communicate less because they use messaging apps.</w:t>
-            </w:r>
-          </w:p>
-        </w:tc>
-      </w:tr>
-      <w:tr>
-        <w:tc>
-          <w:tcPr>
-            <w:tcW w:w="2605" w:type="dxa"/>
-            <w:shd w:val="clear" w:color="auto" w:fill="DEEBF7"/>
-          </w:tcPr>
-          <w:p>
-            <w:r>
-              <w:rPr>
-                <w:rFonts w:cs="Times New Roman"/>
-              </w:rPr>
-              <w:t xml:space="preserve">More formal:</w:t>
-            </w:r>
-          </w:p>
-        </w:tc>
-        <w:tc>
-          <w:tcPr>
-            <w:tcW w:w="6745" w:type="dxa"/>
-            <w:shd w:val="clear" w:color="auto" w:fill="DEEBF7"/>
-          </w:tcPr>
-          <w:p>
-            <w:r>
-              <w:rPr>
-                <w:rFonts w:cs="Times New Roman"/>
-              </w:rPr>
-              <w:t xml:space="preserve">It is messaging apps that make people communicate less.</w:t>
+              <w:t>persuasive.</w:t>
             </w:r>
           </w:p>
         </w:tc>
@@ -812,282 +433,1500 @@
     </w:tbl>
     <w:p>
       <w:pPr>
-        <w:pBdr>
-          <w:top w:val="single" w:sz="4" w:space="4" w:color="auto"/>
-          <w:left w:val="single" w:sz="4" w:space="4" w:color="auto"/>
-          <w:bottom w:val="single" w:sz="4" w:space="4" w:color="auto"/>
-          <w:right w:val="single" w:sz="4" w:space="4" w:color="auto"/>
-        </w:pBdr>
-        <w:spacing w:line="360" w:lineRule="auto"/>
+        <w:spacing w:after="80"/>
+      </w:pPr>
+    </w:p>
+    <w:p>
+      <w:pPr>
+        <w:spacing w:before="200"/>
       </w:pPr>
       <w:r>
         <w:rPr>
-          <w:rFonts w:cs="Times New Roman"/>
+          <w:b/>
+          <w:color w:val="1B365D"/>
+          <w:sz w:val="28"/>
         </w:rPr>
-        <w:t xml:space="preserve">Young people used to meet at the park after school, but now everyone sends messages from their bedrooms. A quick text is easier than a real conversation, so face-to-face friendships have become rare. It is messaging apps that make people communicate less, and this change will only grow deeper as technology advances.</w:t>
-      </w:r>
-    </w:p>
-    <w:p>
-      <w:pPr>
-        <w:pStyle w:val="Heading3"/>
-        <w:spacing w:line="360" w:lineRule="auto"/>
-      </w:pPr>
-      <w:r>
-        <w:rPr>
-          <w:rFonts w:ascii="Times New Roman" w:hAnsi="Times New Roman" w:cs="Times New Roman"/>
-          <w:sz w:val="22"/>
-        </w:rPr>
-        <w:t xml:space="preserve">Class question 1 (Easy): It-cleft – the cause</w:t>
+        <w:t>2. Key Cleft Sentence Structures</w:t>
       </w:r>
     </w:p>
     <w:tbl>
       <w:tblPr>
-        <w:tblStyle w:val="TableGrid"/>
         <w:tblW w:w="0" w:type="auto"/>
+        <w:jc w:val="center"/>
         <w:tblLook w:val="04A0" w:firstRow="1" w:lastRow="0" w:firstColumn="1" w:lastColumn="0" w:noHBand="0" w:noVBand="1"/>
       </w:tblPr>
       <w:tblGrid>
-        <w:gridCol w:w="2605"/>
-        <w:gridCol w:w="6745"/>
+        <w:gridCol w:w="1080"/>
+        <w:gridCol w:w="3240"/>
+        <w:gridCol w:w="720"/>
+        <w:gridCol w:w="4752"/>
       </w:tblGrid>
       <w:tr>
+        <w:trPr>
+          <w:jc w:val="center"/>
+        </w:trPr>
         <w:tc>
           <w:tcPr>
-            <w:tcW w:w="2605" w:type="dxa"/>
+            <w:tcW w:w="1080" w:type="dxa"/>
+            <w:shd w:val="clear" w:color="auto" w:fill="1B365D"/>
           </w:tcPr>
           <w:p>
             <w:r>
               <w:rPr>
-                <w:rFonts w:cs="Times New Roman"/>
+                <w:b/>
+                <w:color w:val="FFFFFF"/>
               </w:rPr>
-              <w:t>Simple sentence:</w:t>
+              <w:t>Type</w:t>
             </w:r>
           </w:p>
         </w:tc>
         <w:tc>
           <w:tcPr>
-            <w:tcW w:w="6745" w:type="dxa"/>
+            <w:tcW w:w="3960" w:type="dxa"/>
+            <w:gridSpan w:val="2"/>
+            <w:shd w:val="clear" w:color="auto" w:fill="1B365D"/>
           </w:tcPr>
           <w:p>
             <w:r>
               <w:rPr>
-                <w:rFonts w:cs="Times New Roman"/>
+                <w:b/>
+                <w:color w:val="FFFFFF"/>
               </w:rPr>
-              <w:t xml:space="preserve">Young people forget social skills because they use messaging apps.</w:t>
+              <w:t>Formula / Pattern</w:t>
+            </w:r>
+          </w:p>
+        </w:tc>
+        <w:tc>
+          <w:tcPr>
+            <w:tcW w:w="4752" w:type="dxa"/>
+            <w:shd w:val="clear" w:color="auto" w:fill="1B365D"/>
+          </w:tcPr>
+          <w:p>
+            <w:r>
+              <w:rPr>
+                <w:b/>
+                <w:color w:val="FFFFFF"/>
+              </w:rPr>
+              <w:t>DSE Tech Example</w:t>
             </w:r>
           </w:p>
         </w:tc>
       </w:tr>
       <w:tr>
+        <w:trPr>
+          <w:jc w:val="center"/>
+        </w:trPr>
         <w:tc>
           <w:tcPr>
-            <w:tcW w:w="2605" w:type="dxa"/>
+            <w:tcW w:w="1080" w:type="dxa"/>
           </w:tcPr>
           <w:p>
+            <w:pPr>
+              <w:spacing w:before="60" w:after="60"/>
+            </w:pPr>
             <w:r>
-              <w:rPr>
-                <w:rFonts w:cs="Times New Roman"/>
-              </w:rPr>
-              <w:t>Prompt:</w:t>
+              <w:t>It-Cleft</w:t>
             </w:r>
           </w:p>
         </w:tc>
         <w:tc>
           <w:tcPr>
-            <w:tcW w:w="6745" w:type="dxa"/>
+            <w:tcW w:w="3240" w:type="dxa"/>
           </w:tcPr>
           <w:p>
+            <w:pPr>
+              <w:spacing w:before="60" w:after="60"/>
+            </w:pPr>
             <w:r>
               <w:rPr>
-                <w:rFonts w:cs="Times New Roman"/>
-                <w:i/>
+                <w:b/>
+                <w:bCs/>
               </w:rPr>
-              <w:t xml:space="preserve">Begin with ‘It is messaging apps …’.</w:t>
+              <w:t>It + is/was</w:t>
             </w:r>
-          </w:p>
-        </w:tc>
-      </w:tr>
-      <w:tr>
-        <w:tc>
-          <w:tcPr>
-            <w:tcW w:w="9350" w:type="dxa"/>
-            <w:gridSpan w:val="2"/>
-          </w:tcPr>
-          <w:p/>
-          <w:p/>
-        </w:tc>
-      </w:tr>
-    </w:tbl>
-    <w:p>
-      <w:pPr>
-        <w:pStyle w:val="Heading3"/>
-        <w:spacing w:line="360" w:lineRule="auto"/>
-      </w:pPr>
-      <w:r>
-        <w:rPr>
-          <w:rFonts w:ascii="Times New Roman" w:hAnsi="Times New Roman" w:cs="Times New Roman"/>
-          <w:sz w:val="22"/>
-        </w:rPr>
-        <w:t xml:space="preserve">Class question 2 (Harder): It-cleft – the cause</w:t>
-      </w:r>
-    </w:p>
-    <w:tbl>
-      <w:tblPr>
-        <w:tblStyle w:val="TableGrid"/>
-        <w:tblW w:w="0" w:type="auto"/>
-        <w:tblLook w:val="04A0" w:firstRow="1" w:lastRow="0" w:firstColumn="1" w:lastColumn="0" w:noHBand="0" w:noVBand="1"/>
-      </w:tblPr>
-      <w:tblGrid>
-        <w:gridCol w:w="2605"/>
-        <w:gridCol w:w="6745"/>
-      </w:tblGrid>
-      <w:tr>
-        <w:tc>
-          <w:tcPr>
-            <w:tcW w:w="2605" w:type="dxa"/>
-          </w:tcPr>
-          <w:p>
+            <w:r>
+              <w:t xml:space="preserve"> + [Focused Element] + </w:t>
+            </w:r>
             <w:r>
               <w:rPr>
-                <w:rFonts w:cs="Times New Roman"/>
+                <w:b/>
+                <w:bCs/>
               </w:rPr>
-              <w:t>Simple sentence:</w:t>
+              <w:t>that/who</w:t>
+            </w:r>
+            <w:r>
+              <w:t>...</w:t>
             </w:r>
           </w:p>
         </w:tc>
         <w:tc>
           <w:tcPr>
-            <w:tcW w:w="6745" w:type="dxa"/>
+            <w:tcW w:w="5472" w:type="dxa"/>
+            <w:gridSpan w:val="2"/>
           </w:tcPr>
           <w:p>
+            <w:pPr>
+              <w:spacing w:before="60" w:after="60"/>
+            </w:pPr>
             <w:r>
               <w:rPr>
-                <w:rFonts w:cs="Times New Roman"/>
+                <w:b/>
+                <w:bCs/>
               </w:rPr>
-              <w:t xml:space="preserve">Teenagers struggle to focus because notifications interrupt them constantly.</w:t>
+              <w:t>Original:</w:t>
             </w:r>
+            <w:r>
+              <w:t xml:space="preserve"> Social media addiction erodes face-to-face social skills among teens.</w:t>
+            </w:r>
+          </w:p>
+          <w:p>
+            <w:pPr>
+              <w:spacing w:before="60" w:after="60"/>
+            </w:pPr>
+          </w:p>
+          <w:p>
+            <w:pPr>
+              <w:spacing w:before="60" w:after="60"/>
+            </w:pPr>
+            <w:r>
+              <w:t xml:space="preserve">It is </w:t>
+            </w:r>
+            <w:r>
+              <w:rPr>
+                <w:b/>
+                <w:bCs/>
+                <w:u w:val="single"/>
+              </w:rPr>
+              <w:t>social media addiction</w:t>
+            </w:r>
+            <w:r>
+              <w:t xml:space="preserve"> that erodes face-to-face social skills among teens. </w:t>
+            </w:r>
+          </w:p>
+          <w:p>
+            <w:pPr>
+              <w:spacing w:before="60" w:after="60"/>
+            </w:pPr>
+          </w:p>
+          <w:p>
+            <w:pPr>
+              <w:spacing w:before="60" w:after="60"/>
+            </w:pPr>
+            <w:r>
+              <w:t xml:space="preserve">It is </w:t>
+            </w:r>
+            <w:r>
+              <w:rPr>
+                <w:b/>
+                <w:bCs/>
+                <w:u w:val="single"/>
+              </w:rPr>
+              <w:t>face-to-face social skills</w:t>
+            </w:r>
+            <w:r>
+              <w:t xml:space="preserve"> that social media addiction erodes among teens. </w:t>
+            </w:r>
+          </w:p>
+          <w:p>
+            <w:pPr>
+              <w:spacing w:before="60" w:after="60"/>
+            </w:pPr>
+          </w:p>
+          <w:p>
+            <w:pPr>
+              <w:spacing w:before="60" w:after="60"/>
+            </w:pPr>
+            <w:r>
+              <w:t xml:space="preserve">It is </w:t>
+            </w:r>
+            <w:r>
+              <w:rPr>
+                <w:b/>
+                <w:bCs/>
+                <w:u w:val="single"/>
+              </w:rPr>
+              <w:t>among teens</w:t>
+            </w:r>
+            <w:r>
+              <w:t xml:space="preserve"> that social media addiction erodes face-to-face social skills. </w:t>
+            </w:r>
+          </w:p>
+          <w:p>
+            <w:pPr>
+              <w:spacing w:before="60" w:after="60"/>
+            </w:pPr>
           </w:p>
         </w:tc>
       </w:tr>
       <w:tr>
+        <w:trPr>
+          <w:jc w:val="center"/>
+        </w:trPr>
         <w:tc>
           <w:tcPr>
-            <w:tcW w:w="2605" w:type="dxa"/>
+            <w:tcW w:w="1080" w:type="dxa"/>
+            <w:shd w:val="clear" w:color="auto" w:fill="F7FAFC"/>
           </w:tcPr>
           <w:p>
+            <w:pPr>
+              <w:spacing w:before="60" w:after="60"/>
+            </w:pPr>
+            <w:proofErr w:type="spellStart"/>
             <w:r>
-              <w:rPr>
-                <w:rFonts w:cs="Times New Roman"/>
-              </w:rPr>
-              <w:t>Prompt:</w:t>
+              <w:t>Wh</w:t>
+            </w:r>
+            <w:proofErr w:type="spellEnd"/>
+            <w:r>
+              <w:t>-Cleft</w:t>
             </w:r>
           </w:p>
         </w:tc>
         <w:tc>
           <w:tcPr>
-            <w:tcW w:w="6745" w:type="dxa"/>
+            <w:tcW w:w="3240" w:type="dxa"/>
+            <w:shd w:val="clear" w:color="auto" w:fill="F7FAFC"/>
           </w:tcPr>
           <w:p>
+            <w:pPr>
+              <w:spacing w:before="60" w:after="60"/>
+            </w:pPr>
             <w:r>
               <w:rPr>
-                <w:rFonts w:cs="Times New Roman"/>
-                <w:i/>
+                <w:b/>
+                <w:bCs/>
               </w:rPr>
-              <w:t xml:space="preserve">Begin with ‘It is the constant interruptions …’.</w:t>
+              <w:t xml:space="preserve">What </w:t>
             </w:r>
-          </w:p>
-        </w:tc>
-      </w:tr>
-      <w:tr>
-        <w:tc>
-          <w:tcPr>
-            <w:tcW w:w="9350" w:type="dxa"/>
-            <w:gridSpan w:val="2"/>
-          </w:tcPr>
-          <w:p/>
-          <w:p/>
-        </w:tc>
-      </w:tr>
-    </w:tbl>
-    <w:p>
-      <w:pPr>
-        <w:pStyle w:val="Heading3"/>
-        <w:spacing w:line="360" w:lineRule="auto"/>
-      </w:pPr>
-      <w:r>
-        <w:rPr>
-          <w:rFonts w:ascii="Times New Roman" w:hAnsi="Times New Roman" w:cs="Times New Roman"/>
-          <w:sz w:val="22"/>
-        </w:rPr>
-        <w:t xml:space="preserve">Example 4: It-cleft – setting up a contrast</w:t>
-      </w:r>
-    </w:p>
-    <w:tbl>
-      <w:tblPr>
-        <w:tblStyle w:val="TableGrid"/>
-        <w:tblW w:w="0" w:type="auto"/>
-        <w:tblLook w:val="04A0" w:firstRow="1" w:lastRow="0" w:firstColumn="1" w:lastColumn="0" w:noHBand="0" w:noVBand="1"/>
-      </w:tblPr>
-      <w:tblGrid>
-        <w:gridCol w:w="2605"/>
-        <w:gridCol w:w="6745"/>
-      </w:tblGrid>
-      <w:tr>
-        <w:tc>
-          <w:tcPr>
-            <w:tcW w:w="2605" w:type="dxa"/>
-            <w:shd w:val="clear" w:color="auto" w:fill="DEEBF7"/>
-          </w:tcPr>
-          <w:p>
+            <w:r>
+              <w:t xml:space="preserve">[Clause] + </w:t>
+            </w:r>
             <w:r>
               <w:rPr>
-                <w:rFonts w:cs="Times New Roman"/>
+                <w:b/>
+                <w:bCs/>
               </w:rPr>
-              <w:t xml:space="preserve">Plain:</w:t>
+              <w:t>is/</w:t>
+            </w:r>
+            <w:r>
+              <w:rPr>
+                <w:b/>
+                <w:bCs/>
+              </w:rPr>
+              <w:t>are</w:t>
+            </w:r>
+            <w:r>
+              <w:rPr>
+                <w:b/>
+                <w:bCs/>
+              </w:rPr>
+              <w:t xml:space="preserve"> </w:t>
+            </w:r>
+            <w:r>
+              <w:t>+ [Focused Element]</w:t>
             </w:r>
           </w:p>
         </w:tc>
         <w:tc>
           <w:tcPr>
-            <w:tcW w:w="6745" w:type="dxa"/>
-            <w:shd w:val="clear" w:color="auto" w:fill="DEEBF7"/>
+            <w:tcW w:w="5472" w:type="dxa"/>
+            <w:gridSpan w:val="2"/>
+            <w:shd w:val="clear" w:color="auto" w:fill="F7FAFC"/>
           </w:tcPr>
           <w:p>
+            <w:pPr>
+              <w:spacing w:before="60" w:after="60"/>
+            </w:pPr>
+            <w:r>
+              <w:t>Original: Young people need most today is a digital detox from constant notifications.</w:t>
+            </w:r>
+          </w:p>
+          <w:p>
+            <w:pPr>
+              <w:spacing w:before="60" w:after="60"/>
+            </w:pPr>
+          </w:p>
+          <w:p>
+            <w:pPr>
+              <w:spacing w:before="60" w:after="60"/>
+            </w:pPr>
+            <w:r>
+              <w:t xml:space="preserve">What young people need most today is a </w:t>
+            </w:r>
             <w:r>
               <w:rPr>
-                <w:rFonts w:cs="Times New Roman"/>
+                <w:b/>
+                <w:bCs/>
+                <w:u w:val="single"/>
               </w:rPr>
-              <w:t xml:space="preserve">Some people blame social media, but smartphones cause the real problem.</w:t>
+              <w:t>digital detox from constant notifications</w:t>
             </w:r>
+            <w:r>
+              <w:t>.</w:t>
+            </w:r>
+          </w:p>
+          <w:p>
+            <w:pPr>
+              <w:spacing w:before="60" w:after="60"/>
+            </w:pPr>
+          </w:p>
+          <w:p>
+            <w:pPr>
+              <w:spacing w:before="60" w:after="60"/>
+              <w:rPr>
+                <w:b/>
+                <w:bCs/>
+                <w:u w:val="single"/>
+              </w:rPr>
+            </w:pPr>
+            <w:r>
+              <w:t xml:space="preserve">What </w:t>
+            </w:r>
+            <w:r>
+              <w:t xml:space="preserve">young people need to do most today is </w:t>
+            </w:r>
+            <w:r>
+              <w:rPr>
+                <w:b/>
+                <w:bCs/>
+                <w:u w:val="single"/>
+              </w:rPr>
+              <w:t>take a digital detox from constant notifications.</w:t>
+            </w:r>
+          </w:p>
+          <w:p>
+            <w:pPr>
+              <w:spacing w:before="60" w:after="60"/>
+              <w:rPr>
+                <w:b/>
+                <w:bCs/>
+                <w:u w:val="single"/>
+              </w:rPr>
+            </w:pPr>
+          </w:p>
+          <w:p>
+            <w:pPr>
+              <w:spacing w:before="60" w:after="60"/>
+              <w:rPr>
+                <w:b/>
+                <w:bCs/>
+                <w:u w:val="single"/>
+              </w:rPr>
+            </w:pPr>
+            <w:r>
+              <w:t>Those/The ones who need a digital detox most today</w:t>
+            </w:r>
+            <w:r>
+              <w:rPr>
+                <w:b/>
+                <w:bCs/>
+              </w:rPr>
+              <w:t xml:space="preserve"> </w:t>
+            </w:r>
+            <w:r>
+              <w:rPr>
+                <w:b/>
+                <w:bCs/>
+                <w:u w:val="single"/>
+              </w:rPr>
+              <w:t>are young people.</w:t>
+            </w:r>
+          </w:p>
+          <w:p>
+            <w:pPr>
+              <w:spacing w:before="60" w:after="60"/>
+            </w:pPr>
           </w:p>
         </w:tc>
       </w:tr>
       <w:tr>
+        <w:trPr>
+          <w:jc w:val="center"/>
+        </w:trPr>
         <w:tc>
           <w:tcPr>
-            <w:tcW w:w="2605" w:type="dxa"/>
-            <w:shd w:val="clear" w:color="auto" w:fill="DEEBF7"/>
+            <w:tcW w:w="1080" w:type="dxa"/>
           </w:tcPr>
           <w:p>
+            <w:pPr>
+              <w:spacing w:before="60" w:after="60"/>
+            </w:pPr>
             <w:r>
-              <w:rPr>
-                <w:rFonts w:cs="Times New Roman"/>
-              </w:rPr>
-              <w:t xml:space="preserve">More formal:</w:t>
+              <w:t>All-Cleft</w:t>
             </w:r>
           </w:p>
         </w:tc>
         <w:tc>
           <w:tcPr>
-            <w:tcW w:w="6745" w:type="dxa"/>
-            <w:shd w:val="clear" w:color="auto" w:fill="DEEBF7"/>
+            <w:tcW w:w="3240" w:type="dxa"/>
           </w:tcPr>
           <w:p>
+            <w:pPr>
+              <w:spacing w:before="60" w:after="60"/>
+            </w:pPr>
             <w:r>
               <w:rPr>
-                <w:rFonts w:cs="Times New Roman"/>
+                <w:b/>
+                <w:bCs/>
               </w:rPr>
-              <w:t xml:space="preserve">While some people blame social media, it is smartphones that cause the real problem.</w:t>
+              <w:t xml:space="preserve">All </w:t>
+            </w:r>
+            <w:r>
+              <w:t xml:space="preserve">[that] [Clause] + </w:t>
+            </w:r>
+            <w:r>
+              <w:rPr>
+                <w:b/>
+                <w:bCs/>
+              </w:rPr>
+              <w:t>is/</w:t>
+            </w:r>
+            <w:r>
+              <w:rPr>
+                <w:b/>
+                <w:bCs/>
+              </w:rPr>
+              <w:t>are</w:t>
+            </w:r>
+            <w:r>
+              <w:t xml:space="preserve"> + [Focused Element]</w:t>
+            </w:r>
+          </w:p>
+        </w:tc>
+        <w:tc>
+          <w:tcPr>
+            <w:tcW w:w="5472" w:type="dxa"/>
+            <w:gridSpan w:val="2"/>
+          </w:tcPr>
+          <w:p>
+            <w:pPr>
+              <w:spacing w:before="60" w:after="60"/>
+            </w:pPr>
+            <w:r>
+              <w:rPr>
+                <w:b/>
+                <w:bCs/>
+              </w:rPr>
+              <w:t>Original:</w:t>
+            </w:r>
+            <w:r>
+              <w:t xml:space="preserve"> </w:t>
+            </w:r>
+            <w:r>
+              <w:t xml:space="preserve">Algorithms only care about </w:t>
+            </w:r>
+            <w:proofErr w:type="spellStart"/>
+            <w:r>
+              <w:t>maximi</w:t>
+            </w:r>
+            <w:r>
+              <w:t>s</w:t>
+            </w:r>
+            <w:r>
+              <w:t>ing</w:t>
+            </w:r>
+            <w:proofErr w:type="spellEnd"/>
+            <w:r>
+              <w:t xml:space="preserve"> user engagement.</w:t>
+            </w:r>
+          </w:p>
+          <w:p>
+            <w:pPr>
+              <w:spacing w:before="60" w:after="60"/>
+            </w:pPr>
+          </w:p>
+          <w:p>
+            <w:pPr>
+              <w:spacing w:before="60" w:after="60"/>
+            </w:pPr>
+            <w:r>
+              <w:t xml:space="preserve">All </w:t>
+            </w:r>
+            <w:r>
+              <w:t xml:space="preserve">(that) </w:t>
+            </w:r>
+            <w:r>
+              <w:t xml:space="preserve">algorithms care about is </w:t>
+            </w:r>
+            <w:proofErr w:type="spellStart"/>
+            <w:r>
+              <w:rPr>
+                <w:b/>
+                <w:bCs/>
+                <w:u w:val="single"/>
+              </w:rPr>
+              <w:t>maximi</w:t>
+            </w:r>
+            <w:r>
+              <w:rPr>
+                <w:b/>
+                <w:bCs/>
+                <w:u w:val="single"/>
+              </w:rPr>
+              <w:t>s</w:t>
+            </w:r>
+            <w:r>
+              <w:rPr>
+                <w:b/>
+                <w:bCs/>
+                <w:u w:val="single"/>
+              </w:rPr>
+              <w:t>ing</w:t>
+            </w:r>
+            <w:proofErr w:type="spellEnd"/>
+            <w:r>
+              <w:rPr>
+                <w:b/>
+                <w:bCs/>
+                <w:u w:val="single"/>
+              </w:rPr>
+              <w:t xml:space="preserve"> user engagement.</w:t>
+            </w:r>
+          </w:p>
+          <w:p>
+            <w:pPr>
+              <w:spacing w:before="60" w:after="60"/>
+            </w:pPr>
+          </w:p>
+          <w:p>
+            <w:pPr>
+              <w:spacing w:before="60" w:after="60"/>
+            </w:pPr>
+            <w:r>
+              <w:t xml:space="preserve">All (that) algorithms do is </w:t>
+            </w:r>
+            <w:proofErr w:type="spellStart"/>
+            <w:r>
+              <w:rPr>
+                <w:b/>
+                <w:bCs/>
+                <w:u w:val="single"/>
+              </w:rPr>
+              <w:t>ma</w:t>
+            </w:r>
+            <w:r>
+              <w:rPr>
+                <w:b/>
+                <w:bCs/>
+                <w:u w:val="single"/>
+              </w:rPr>
+              <w:t>ximise</w:t>
+            </w:r>
+            <w:proofErr w:type="spellEnd"/>
+            <w:r>
+              <w:rPr>
+                <w:b/>
+                <w:bCs/>
+                <w:u w:val="single"/>
+              </w:rPr>
+              <w:t xml:space="preserve"> user en</w:t>
+            </w:r>
+            <w:r>
+              <w:rPr>
+                <w:b/>
+                <w:bCs/>
+                <w:u w:val="single"/>
+              </w:rPr>
+              <w:t>g</w:t>
+            </w:r>
+            <w:r>
+              <w:rPr>
+                <w:b/>
+                <w:bCs/>
+                <w:u w:val="single"/>
+              </w:rPr>
+              <w:t>agement.</w:t>
+            </w:r>
+          </w:p>
+          <w:p>
+            <w:pPr>
+              <w:spacing w:before="60" w:after="60"/>
+            </w:pPr>
+          </w:p>
+        </w:tc>
+      </w:tr>
+    </w:tbl>
+    <w:p/>
+    <w:p>
+      <w:pPr>
+        <w:spacing w:before="200"/>
+        <w:rPr>
+          <w:b/>
+          <w:color w:val="1B365D"/>
+          <w:sz w:val="28"/>
+        </w:rPr>
+      </w:pPr>
+    </w:p>
+    <w:p>
+      <w:pPr>
+        <w:spacing w:before="200"/>
+        <w:rPr>
+          <w:b/>
+          <w:color w:val="1B365D"/>
+          <w:sz w:val="28"/>
+        </w:rPr>
+      </w:pPr>
+    </w:p>
+    <w:p>
+      <w:pPr>
+        <w:spacing w:before="200"/>
+        <w:rPr>
+          <w:b/>
+          <w:color w:val="1B365D"/>
+          <w:sz w:val="28"/>
+        </w:rPr>
+      </w:pPr>
+      <w:r>
+        <w:rPr>
+          <w:b/>
+          <w:color w:val="1B365D"/>
+          <w:sz w:val="28"/>
+        </w:rPr>
+        <w:lastRenderedPageBreak/>
+        <w:t xml:space="preserve">3. </w:t>
+      </w:r>
+      <w:r>
+        <w:rPr>
+          <w:b/>
+          <w:color w:val="1B365D"/>
+          <w:sz w:val="28"/>
+        </w:rPr>
+        <w:t xml:space="preserve">Practice Sets </w:t>
+      </w:r>
+      <w:r>
+        <w:rPr>
+          <w:b/>
+          <w:color w:val="1B365D"/>
+          <w:sz w:val="28"/>
+        </w:rPr>
+        <w:t xml:space="preserve">- </w:t>
+      </w:r>
+      <w:r>
+        <w:rPr>
+          <w:b/>
+          <w:color w:val="1B365D"/>
+          <w:sz w:val="24"/>
+        </w:rPr>
+        <w:t xml:space="preserve">Part A: Form It-Clefts </w:t>
+      </w:r>
+      <w:r>
+        <w:rPr>
+          <w:b/>
+          <w:color w:val="1B365D"/>
+          <w:sz w:val="24"/>
+        </w:rPr>
+        <w:br/>
+      </w:r>
+      <w:r>
+        <w:rPr>
+          <w:i/>
+        </w:rPr>
+        <w:t xml:space="preserve">Rewrite each sentence as an </w:t>
+      </w:r>
+      <w:r>
+        <w:rPr>
+          <w:b/>
+          <w:bCs/>
+          <w:i/>
+          <w:u w:val="single"/>
+        </w:rPr>
+        <w:t>It-Cleft</w:t>
+      </w:r>
+      <w:r>
+        <w:rPr>
+          <w:i/>
+        </w:rPr>
+        <w:t>.</w:t>
+      </w:r>
+    </w:p>
+    <w:p>
+      <w:pPr>
+        <w:pStyle w:val="ListParagraph"/>
+        <w:numPr>
+          <w:ilvl w:val="0"/>
+          <w:numId w:val="17"/>
+        </w:numPr>
+        <w:spacing w:after="80" w:line="360" w:lineRule="auto"/>
+        <w:rPr>
+          <w:bCs/>
+        </w:rPr>
+      </w:pPr>
+      <w:r>
+        <w:rPr>
+          <w:bCs/>
+        </w:rPr>
+        <w:t>The proliferation of smartphones has altered interpersonal communication patterns.</w:t>
+      </w:r>
+      <w:r>
+        <w:rPr>
+          <w:bCs/>
+        </w:rPr>
+        <w:t xml:space="preserve"> [Focus</w:t>
+      </w:r>
+      <w:r>
+        <w:rPr>
+          <w:bCs/>
+        </w:rPr>
+        <w:t xml:space="preserve"> on </w:t>
+      </w:r>
+      <w:r>
+        <w:rPr>
+          <w:bCs/>
+        </w:rPr>
+        <w:t>the proliferation of smartphones]</w:t>
+      </w:r>
+    </w:p>
+    <w:p>
+      <w:pPr>
+        <w:pStyle w:val="ListParagraph"/>
+        <w:spacing w:after="80" w:line="480" w:lineRule="auto"/>
+        <w:ind w:left="360"/>
+      </w:pPr>
+      <w:r>
+        <w:t>________________________________________________________________________________________</w:t>
+      </w:r>
+    </w:p>
+    <w:p>
+      <w:pPr>
+        <w:pStyle w:val="ListParagraph"/>
+        <w:spacing w:after="80" w:line="480" w:lineRule="auto"/>
+        <w:ind w:left="360"/>
+      </w:pPr>
+      <w:r>
+        <w:t>________________________________________________________________________________________</w:t>
+      </w:r>
+      <w:r>
+        <w:br/>
+      </w:r>
+    </w:p>
+    <w:p>
+      <w:pPr>
+        <w:pStyle w:val="ListParagraph"/>
+        <w:numPr>
+          <w:ilvl w:val="0"/>
+          <w:numId w:val="17"/>
+        </w:numPr>
+        <w:spacing w:after="80" w:line="480" w:lineRule="auto"/>
+      </w:pPr>
+      <w:r>
+        <w:t xml:space="preserve">Tech companies prioritize </w:t>
+      </w:r>
+      <w:r>
+        <w:rPr>
+          <w:bCs/>
+        </w:rPr>
+        <w:t>profit</w:t>
+      </w:r>
+      <w:r>
+        <w:t xml:space="preserve"> over user privacy in the digital age.</w:t>
+      </w:r>
+      <w:r>
+        <w:t xml:space="preserve"> [Focus on the profit]</w:t>
+      </w:r>
+    </w:p>
+    <w:p>
+      <w:pPr>
+        <w:pStyle w:val="ListParagraph"/>
+        <w:spacing w:after="80" w:line="480" w:lineRule="auto"/>
+        <w:ind w:left="360"/>
+      </w:pPr>
+      <w:r>
+        <w:t>________________________________________________________________________________________</w:t>
+      </w:r>
+    </w:p>
+    <w:p>
+      <w:pPr>
+        <w:pStyle w:val="ListParagraph"/>
+        <w:spacing w:after="80" w:line="480" w:lineRule="auto"/>
+        <w:ind w:left="360"/>
+      </w:pPr>
+      <w:r>
+        <w:t>________________________________________________________________________________________</w:t>
+      </w:r>
+    </w:p>
+    <w:p>
+      <w:pPr>
+        <w:spacing w:after="80"/>
+      </w:pPr>
+    </w:p>
+    <w:p>
+      <w:pPr>
+        <w:pStyle w:val="ListParagraph"/>
+        <w:numPr>
+          <w:ilvl w:val="0"/>
+          <w:numId w:val="17"/>
+        </w:numPr>
+        <w:spacing w:after="80"/>
+        <w:rPr>
+          <w:bCs/>
+        </w:rPr>
+      </w:pPr>
+      <w:r>
+        <w:rPr>
+          <w:bCs/>
+        </w:rPr>
+        <w:t>Gen Z teenagers spend most of their leisure hours on short-form video apps.</w:t>
+      </w:r>
+      <w:r>
+        <w:rPr>
+          <w:bCs/>
+        </w:rPr>
+        <w:t xml:space="preserve"> [Focus on </w:t>
+      </w:r>
+      <w:r>
+        <w:rPr>
+          <w:bCs/>
+        </w:rPr>
+        <w:t>the apps]</w:t>
+      </w:r>
+    </w:p>
+    <w:p>
+      <w:pPr>
+        <w:pStyle w:val="ListParagraph"/>
+        <w:spacing w:before="240" w:after="80" w:line="480" w:lineRule="auto"/>
+        <w:ind w:left="360"/>
+      </w:pPr>
+      <w:r>
+        <w:t>________________________________________________________________________________________</w:t>
+      </w:r>
+    </w:p>
+    <w:p>
+      <w:pPr>
+        <w:pStyle w:val="ListParagraph"/>
+        <w:spacing w:after="80" w:line="480" w:lineRule="auto"/>
+        <w:ind w:left="360"/>
+      </w:pPr>
+      <w:r>
+        <w:t>________________________________________________________________________________________</w:t>
+      </w:r>
+      <w:r>
+        <w:br/>
+      </w:r>
+    </w:p>
+    <w:p>
+      <w:pPr>
+        <w:pStyle w:val="ListParagraph"/>
+        <w:numPr>
+          <w:ilvl w:val="0"/>
+          <w:numId w:val="17"/>
+        </w:numPr>
+        <w:spacing w:after="80"/>
+      </w:pPr>
+      <w:r>
+        <w:rPr>
+          <w:bCs/>
+        </w:rPr>
+        <w:t>Generative AI tools</w:t>
+      </w:r>
+      <w:r>
+        <w:t xml:space="preserve"> created widespread concern among secondary educators last year.</w:t>
+      </w:r>
+      <w:r>
+        <w:t xml:space="preserve"> [Focus on the AI tools]</w:t>
+      </w:r>
+      <w:r>
+        <w:br/>
+      </w:r>
+    </w:p>
+    <w:p>
+      <w:pPr>
+        <w:pStyle w:val="ListParagraph"/>
+        <w:spacing w:before="240" w:after="80" w:line="480" w:lineRule="auto"/>
+        <w:ind w:left="360"/>
+      </w:pPr>
+      <w:r>
+        <w:t>________________________________________________________________________________________</w:t>
+      </w:r>
+    </w:p>
+    <w:p>
+      <w:pPr>
+        <w:pStyle w:val="ListParagraph"/>
+        <w:spacing w:after="80" w:line="480" w:lineRule="auto"/>
+        <w:ind w:left="360"/>
+      </w:pPr>
+      <w:r>
+        <w:t>________________________________________________________________________________________</w:t>
+      </w:r>
+      <w:r>
+        <w:br/>
+      </w:r>
+    </w:p>
+    <w:p>
+      <w:pPr>
+        <w:pStyle w:val="ListParagraph"/>
+        <w:numPr>
+          <w:ilvl w:val="0"/>
+          <w:numId w:val="17"/>
+        </w:numPr>
+        <w:spacing w:after="80"/>
+      </w:pPr>
+      <w:r>
+        <w:rPr>
+          <w:bCs/>
+        </w:rPr>
+        <w:t>Online anonymity</w:t>
+      </w:r>
+      <w:r>
+        <w:t xml:space="preserve"> encourages cyberbullies to post malicious comments.</w:t>
+      </w:r>
+      <w:r>
+        <w:t xml:space="preserve"> [Focus on the anonymity]</w:t>
+      </w:r>
+    </w:p>
+    <w:p>
+      <w:pPr>
+        <w:pStyle w:val="ListParagraph"/>
+        <w:spacing w:before="240" w:after="80" w:line="480" w:lineRule="auto"/>
+        <w:ind w:left="360"/>
+      </w:pPr>
+      <w:r>
+        <w:t>________________________________________________________________________________________</w:t>
+      </w:r>
+    </w:p>
+    <w:p>
+      <w:pPr>
+        <w:pStyle w:val="ListParagraph"/>
+        <w:spacing w:after="80" w:line="480" w:lineRule="auto"/>
+        <w:ind w:left="360"/>
+      </w:pPr>
+      <w:r>
+        <w:t>________________________________________________________________________________________</w:t>
+      </w:r>
+    </w:p>
+    <w:p>
+      <w:pPr>
+        <w:rPr>
+          <w:b/>
+          <w:color w:val="1B365D"/>
+          <w:sz w:val="24"/>
+        </w:rPr>
+      </w:pPr>
+    </w:p>
+    <w:p>
+      <w:pPr>
+        <w:rPr>
+          <w:i/>
+        </w:rPr>
+      </w:pPr>
+      <w:r>
+        <w:rPr>
+          <w:b/>
+          <w:color w:val="1B365D"/>
+          <w:sz w:val="24"/>
+        </w:rPr>
+        <w:t xml:space="preserve">Part B: Form </w:t>
+      </w:r>
+      <w:proofErr w:type="spellStart"/>
+      <w:r>
+        <w:rPr>
+          <w:b/>
+          <w:color w:val="1B365D"/>
+          <w:sz w:val="24"/>
+        </w:rPr>
+        <w:t>Wh</w:t>
+      </w:r>
+      <w:proofErr w:type="spellEnd"/>
+      <w:r>
+        <w:rPr>
+          <w:b/>
+          <w:color w:val="1B365D"/>
+          <w:sz w:val="24"/>
+        </w:rPr>
+        <w:t xml:space="preserve">-Clefts </w:t>
+      </w:r>
+      <w:r>
+        <w:rPr>
+          <w:b/>
+          <w:color w:val="1B365D"/>
+          <w:sz w:val="24"/>
+        </w:rPr>
+        <w:t>/ All-Clefts</w:t>
+      </w:r>
+      <w:r>
+        <w:rPr>
+          <w:b/>
+          <w:color w:val="1B365D"/>
+          <w:sz w:val="24"/>
+        </w:rPr>
+        <w:br/>
+      </w:r>
+      <w:r>
+        <w:rPr>
+          <w:i/>
+        </w:rPr>
+        <w:t xml:space="preserve">Instructions: Rewrite each sentence as a </w:t>
+      </w:r>
+      <w:proofErr w:type="spellStart"/>
+      <w:r>
+        <w:rPr>
+          <w:b/>
+          <w:bCs/>
+          <w:i/>
+          <w:u w:val="single"/>
+        </w:rPr>
+        <w:t>Wh</w:t>
+      </w:r>
+      <w:proofErr w:type="spellEnd"/>
+      <w:r>
+        <w:rPr>
+          <w:b/>
+          <w:bCs/>
+          <w:i/>
+          <w:u w:val="single"/>
+        </w:rPr>
+        <w:t xml:space="preserve">-cleft </w:t>
+      </w:r>
+      <w:r>
+        <w:rPr>
+          <w:b/>
+          <w:bCs/>
+          <w:i/>
+          <w:u w:val="single"/>
+        </w:rPr>
+        <w:t>/</w:t>
+      </w:r>
+      <w:r>
+        <w:rPr>
+          <w:b/>
+          <w:bCs/>
+          <w:i/>
+          <w:u w:val="single"/>
+        </w:rPr>
+        <w:t xml:space="preserve"> </w:t>
+      </w:r>
+      <w:proofErr w:type="gramStart"/>
+      <w:r>
+        <w:rPr>
+          <w:b/>
+          <w:bCs/>
+          <w:i/>
+          <w:u w:val="single"/>
+        </w:rPr>
+        <w:t>an All-cleft</w:t>
+      </w:r>
+      <w:proofErr w:type="gramEnd"/>
+      <w:r>
+        <w:rPr>
+          <w:i/>
+        </w:rPr>
+        <w:t>.</w:t>
+      </w:r>
+    </w:p>
+    <w:p>
+      <w:pPr>
+        <w:pStyle w:val="ListParagraph"/>
+        <w:numPr>
+          <w:ilvl w:val="0"/>
+          <w:numId w:val="20"/>
+        </w:numPr>
+      </w:pPr>
+      <w:r>
+        <w:t>Excessive screen time damages sleep quality and mental well-being. [</w:t>
+      </w:r>
+      <w:proofErr w:type="spellStart"/>
+      <w:r>
+        <w:t>Wh</w:t>
+      </w:r>
+      <w:proofErr w:type="spellEnd"/>
+      <w:r>
+        <w:t xml:space="preserve">-cleft: </w:t>
+      </w:r>
+      <w:r>
+        <w:t>Focus on what damages sleep quality...]</w:t>
+      </w:r>
+      <w:r>
+        <w:br/>
+      </w:r>
+    </w:p>
+    <w:p>
+      <w:pPr>
+        <w:pStyle w:val="ListParagraph"/>
+        <w:spacing w:before="240" w:after="80" w:line="480" w:lineRule="auto"/>
+        <w:ind w:left="360"/>
+      </w:pPr>
+      <w:r>
+        <w:t>________________________________________________________________________________________</w:t>
+      </w:r>
+    </w:p>
+    <w:p>
+      <w:pPr>
+        <w:pStyle w:val="ListParagraph"/>
+        <w:spacing w:after="80" w:line="480" w:lineRule="auto"/>
+        <w:ind w:left="360"/>
+      </w:pPr>
+      <w:r>
+        <w:t>________________________________________________________________________________________</w:t>
+      </w:r>
+    </w:p>
+    <w:p>
+      <w:pPr>
+        <w:pStyle w:val="ListParagraph"/>
+        <w:numPr>
+          <w:ilvl w:val="0"/>
+          <w:numId w:val="20"/>
+        </w:numPr>
+        <w:spacing w:after="80"/>
+      </w:pPr>
+      <w:r>
+        <w:t>The government should regulate misleading targeted advertisements on social media. [</w:t>
+      </w:r>
+      <w:proofErr w:type="spellStart"/>
+      <w:r>
+        <w:t>Wh</w:t>
+      </w:r>
+      <w:proofErr w:type="spellEnd"/>
+      <w:r>
+        <w:t xml:space="preserve">-left: </w:t>
+      </w:r>
+      <w:r>
+        <w:t>Focus on what the government should do...]</w:t>
+      </w:r>
+      <w:r>
+        <w:br/>
+      </w:r>
+    </w:p>
+    <w:p>
+      <w:pPr>
+        <w:pStyle w:val="ListParagraph"/>
+        <w:spacing w:before="240" w:after="80" w:line="480" w:lineRule="auto"/>
+        <w:ind w:left="360"/>
+      </w:pPr>
+      <w:r>
+        <w:t>________________________________________________________________________________________</w:t>
+      </w:r>
+    </w:p>
+    <w:p>
+      <w:pPr>
+        <w:pStyle w:val="ListParagraph"/>
+        <w:spacing w:before="240" w:after="80" w:line="480" w:lineRule="auto"/>
+        <w:ind w:left="360"/>
+      </w:pPr>
+      <w:r>
+        <w:t>________________________________________________________________________________________</w:t>
+      </w:r>
+    </w:p>
+    <w:p>
+      <w:pPr>
+        <w:pStyle w:val="ListParagraph"/>
+        <w:numPr>
+          <w:ilvl w:val="0"/>
+          <w:numId w:val="20"/>
+        </w:numPr>
+        <w:spacing w:after="80"/>
+      </w:pPr>
+      <w:r>
+        <w:lastRenderedPageBreak/>
+        <w:t>Modern teenagers desire instant validation through likes and comments. [</w:t>
+      </w:r>
+      <w:proofErr w:type="spellStart"/>
+      <w:r>
+        <w:t>Wh</w:t>
+      </w:r>
+      <w:proofErr w:type="spellEnd"/>
+      <w:r>
+        <w:t xml:space="preserve">-cleft: </w:t>
+      </w:r>
+      <w:r>
+        <w:t xml:space="preserve">Focus on </w:t>
+      </w:r>
+      <w:r>
+        <w:t xml:space="preserve">who desires instance </w:t>
+      </w:r>
+      <w:proofErr w:type="gramStart"/>
+      <w:r>
+        <w:t>validation</w:t>
+      </w:r>
+      <w:r>
+        <w:t>..</w:t>
+      </w:r>
+      <w:proofErr w:type="gramEnd"/>
+      <w:r>
+        <w:t>]</w:t>
+      </w:r>
+      <w:r>
+        <w:br/>
+      </w:r>
+    </w:p>
+    <w:p>
+      <w:pPr>
+        <w:pStyle w:val="ListParagraph"/>
+        <w:spacing w:before="240" w:after="80" w:line="480" w:lineRule="auto"/>
+        <w:ind w:left="360"/>
+      </w:pPr>
+      <w:r>
+        <w:t>________________________________________________________________________________________</w:t>
+      </w:r>
+    </w:p>
+    <w:p>
+      <w:pPr>
+        <w:pStyle w:val="ListParagraph"/>
+        <w:spacing w:after="80" w:line="480" w:lineRule="auto"/>
+        <w:ind w:left="360"/>
+      </w:pPr>
+      <w:r>
+        <w:t>________________________________________________________________________________________</w:t>
+      </w:r>
+      <w:r>
+        <w:br/>
+      </w:r>
+    </w:p>
+    <w:p>
+      <w:pPr>
+        <w:pStyle w:val="ListParagraph"/>
+        <w:numPr>
+          <w:ilvl w:val="0"/>
+          <w:numId w:val="20"/>
+        </w:numPr>
+        <w:spacing w:after="80"/>
+      </w:pPr>
+      <w:r>
+        <w:t>Social media platforms aim to keep users scrolling as long as possible</w:t>
+      </w:r>
+      <w:r>
+        <w:t xml:space="preserve"> [</w:t>
+      </w:r>
+      <w:r>
+        <w:t xml:space="preserve">All-cleft: </w:t>
+      </w:r>
+      <w:r>
+        <w:t xml:space="preserve">Focus on what </w:t>
+      </w:r>
+      <w:r>
+        <w:t xml:space="preserve">social </w:t>
+      </w:r>
+      <w:r>
+        <w:t xml:space="preserve">media platforms aim to </w:t>
+      </w:r>
+      <w:proofErr w:type="gramStart"/>
+      <w:r>
+        <w:t>do</w:t>
+      </w:r>
+      <w:r>
+        <w:t>..</w:t>
+      </w:r>
+      <w:proofErr w:type="gramEnd"/>
+      <w:r>
+        <w:t>]</w:t>
+      </w:r>
+      <w:r>
+        <w:br/>
+      </w:r>
+    </w:p>
+    <w:p>
+      <w:pPr>
+        <w:pStyle w:val="ListParagraph"/>
+        <w:spacing w:before="240" w:after="80" w:line="480" w:lineRule="auto"/>
+        <w:ind w:left="360"/>
+      </w:pPr>
+      <w:r>
+        <w:t>________________________________________________________________________________________</w:t>
+      </w:r>
+    </w:p>
+    <w:p>
+      <w:pPr>
+        <w:pStyle w:val="ListParagraph"/>
+        <w:spacing w:after="80" w:line="480" w:lineRule="auto"/>
+        <w:ind w:left="360"/>
+      </w:pPr>
+      <w:r>
+        <w:t>________________________________________________________________________________________</w:t>
+      </w:r>
+      <w:r>
+        <w:br/>
+      </w:r>
+    </w:p>
+    <w:p>
+      <w:pPr>
+        <w:pStyle w:val="ListParagraph"/>
+        <w:numPr>
+          <w:ilvl w:val="0"/>
+          <w:numId w:val="20"/>
+        </w:numPr>
+        <w:spacing w:after="80"/>
+      </w:pPr>
+      <w:r>
+        <w:t>Cyberbullies hide behind anonymous profile pictures to cause harm</w:t>
+      </w:r>
+      <w:r>
+        <w:t xml:space="preserve">. [Focus on </w:t>
+      </w:r>
+      <w:r>
+        <w:t>what cyberbullies</w:t>
+      </w:r>
+      <w:r>
+        <w:t xml:space="preserve"> do</w:t>
+      </w:r>
+      <w:r>
+        <w:t>...]</w:t>
+      </w:r>
+    </w:p>
+    <w:p>
+      <w:pPr>
+        <w:spacing w:before="240" w:after="80" w:line="480" w:lineRule="auto"/>
+        <w:ind w:firstLine="360"/>
+      </w:pPr>
+      <w:r>
+        <w:t>________________________________________________________________________________________</w:t>
+      </w:r>
+    </w:p>
+    <w:p>
+      <w:pPr>
+        <w:pStyle w:val="ListParagraph"/>
+        <w:spacing w:after="80" w:line="480" w:lineRule="auto"/>
+        <w:ind w:left="360"/>
+      </w:pPr>
+      <w:r>
+        <w:t>________________________________________________________________________________________</w:t>
+      </w:r>
+    </w:p>
+    <w:p>
+      <w:pPr>
+        <w:rPr>
+          <w:b/>
+          <w:color w:val="1B365D"/>
+          <w:sz w:val="24"/>
+        </w:rPr>
+      </w:pPr>
+    </w:p>
+    <w:p>
+      <w:r>
+        <w:rPr>
+          <w:b/>
+          <w:color w:val="1B365D"/>
+          <w:sz w:val="24"/>
+        </w:rPr>
+        <w:t>Part C: DSE Proofreading &amp; Sentence Transformation (Paragraph Context)</w:t>
+      </w:r>
+      <w:r>
+        <w:rPr>
+          <w:b/>
+          <w:color w:val="1B365D"/>
+          <w:sz w:val="24"/>
+        </w:rPr>
+        <w:br/>
+      </w:r>
+      <w:r>
+        <w:rPr>
+          <w:i/>
+        </w:rPr>
+        <w:t xml:space="preserve">Instructions: Read the student essay draft excerpt below. Rewrite the underlined plain sentences into cleft sentences (It-cleft, </w:t>
+      </w:r>
+      <w:proofErr w:type="spellStart"/>
+      <w:r>
+        <w:rPr>
+          <w:i/>
+        </w:rPr>
+        <w:t>Wh</w:t>
+      </w:r>
+      <w:proofErr w:type="spellEnd"/>
+      <w:r>
+        <w:rPr>
+          <w:i/>
+        </w:rPr>
+        <w:t>-cleft, or All-cleft) to enhance emphasis and argument structure.</w:t>
+      </w:r>
+    </w:p>
+    <w:tbl>
+      <w:tblPr>
+        <w:tblW w:w="0" w:type="auto"/>
+        <w:jc w:val="center"/>
+        <w:tblLook w:val="04A0" w:firstRow="1" w:lastRow="0" w:firstColumn="1" w:lastColumn="0" w:noHBand="0" w:noVBand="1"/>
+      </w:tblPr>
+      <w:tblGrid>
+        <w:gridCol w:w="9792"/>
+      </w:tblGrid>
+      <w:tr>
+        <w:trPr>
+          <w:jc w:val="center"/>
+        </w:trPr>
+        <w:tc>
+          <w:tcPr>
+            <w:tcW w:w="9792" w:type="dxa"/>
+            <w:tcBorders>
+              <w:left w:val="single" w:sz="24" w:space="0" w:color="805AD5"/>
+            </w:tcBorders>
+            <w:shd w:val="clear" w:color="auto" w:fill="FAF5FF"/>
+            <w:tcMar>
+              <w:top w:w="120" w:type="dxa"/>
+              <w:left w:w="180" w:type="dxa"/>
+              <w:bottom w:w="120" w:type="dxa"/>
+              <w:right w:w="180" w:type="dxa"/>
+            </w:tcMar>
+          </w:tcPr>
+          <w:p>
+            <w:pPr>
+              <w:spacing w:before="40" w:after="40" w:line="360" w:lineRule="auto"/>
+            </w:pPr>
+            <w:r>
+              <w:rPr>
+                <w:b/>
+                <w:color w:val="1B365D"/>
+              </w:rPr>
+              <w:t>Student Writing Draft (HKDSE Essay - Topic: Digital Well-being)</w:t>
+            </w:r>
+            <w:r>
+              <w:rPr>
+                <w:b/>
+                <w:color w:val="1B365D"/>
+              </w:rPr>
+              <w:br/>
+            </w:r>
+            <w:r>
+              <w:rPr>
+                <w:sz w:val="21"/>
+              </w:rPr>
+              <w:t xml:space="preserve">Many critics argue that technology breeds isolation. (1) </w:t>
+            </w:r>
+            <w:r>
+              <w:rPr>
+                <w:sz w:val="21"/>
+                <w:u w:val="single"/>
+              </w:rPr>
+              <w:t>Standard messaging apps lack genuine emotional warmth</w:t>
+            </w:r>
+            <w:r>
+              <w:rPr>
+                <w:sz w:val="21"/>
+              </w:rPr>
+              <w:t xml:space="preserve">. Consequently, young people feel lonely even when connected. (2) </w:t>
+            </w:r>
+            <w:r>
+              <w:rPr>
+                <w:sz w:val="21"/>
+                <w:u w:val="single"/>
+              </w:rPr>
+              <w:t>Schools need critical digital literacy education, not total phone bans</w:t>
+            </w:r>
+            <w:r>
+              <w:rPr>
+                <w:sz w:val="21"/>
+              </w:rPr>
+              <w:t xml:space="preserve">. (3) </w:t>
+            </w:r>
+            <w:r>
+              <w:rPr>
+                <w:sz w:val="21"/>
+                <w:u w:val="single"/>
+              </w:rPr>
+              <w:t>Social media algorithms exploit human psychology for financial profit</w:t>
+            </w:r>
+            <w:r>
+              <w:rPr>
+                <w:sz w:val="21"/>
+              </w:rPr>
+              <w:t xml:space="preserve">. (4) </w:t>
+            </w:r>
+            <w:r>
+              <w:rPr>
+                <w:sz w:val="21"/>
+                <w:u w:val="single"/>
+              </w:rPr>
+              <w:t>Users only require a conscious boundaries setting to regain control over their time</w:t>
+            </w:r>
+            <w:r>
+              <w:rPr>
+                <w:sz w:val="21"/>
+              </w:rPr>
+              <w:t>.</w:t>
             </w:r>
           </w:p>
         </w:tc>
@@ -1095,803 +1934,72 @@
     </w:tbl>
     <w:p>
       <w:pPr>
-        <w:pBdr>
-          <w:top w:val="single" w:sz="4" w:space="4" w:color="auto"/>
-          <w:left w:val="single" w:sz="4" w:space="4" w:color="auto"/>
-          <w:bottom w:val="single" w:sz="4" w:space="4" w:color="auto"/>
-          <w:right w:val="single" w:sz="4" w:space="4" w:color="auto"/>
-        </w:pBdr>
-        <w:spacing w:line="360" w:lineRule="auto"/>
+        <w:spacing w:after="80"/>
+      </w:pPr>
+    </w:p>
+    <w:p>
+      <w:pPr>
+        <w:pStyle w:val="ListParagraph"/>
+        <w:numPr>
+          <w:ilvl w:val="0"/>
+          <w:numId w:val="18"/>
+        </w:numPr>
+        <w:spacing w:after="0" w:line="600" w:lineRule="auto"/>
       </w:pPr>
       <w:r>
-        <w:rPr>
-          <w:rFonts w:cs="Times New Roman"/>
-        </w:rPr>
-        <w:t xml:space="preserve">Every day there are news stories about the dangers of social media. While some people blame social media, it is smartphones that cause the real problem. Without a phone in their pocket, teenagers could not check their accounts every five minutes.</w:t>
+        <w:t>________________________________________________________________________________________________________________________________________________________________________________</w:t>
       </w:r>
     </w:p>
     <w:p>
       <w:pPr>
-        <w:pStyle w:val="Heading3"/>
-        <w:spacing w:line="360" w:lineRule="auto"/>
+        <w:pStyle w:val="ListParagraph"/>
+        <w:numPr>
+          <w:ilvl w:val="0"/>
+          <w:numId w:val="18"/>
+        </w:numPr>
+        <w:spacing w:after="0" w:line="600" w:lineRule="auto"/>
       </w:pPr>
       <w:r>
-        <w:rPr>
-          <w:rFonts w:ascii="Times New Roman" w:hAnsi="Times New Roman" w:cs="Times New Roman"/>
-          <w:sz w:val="22"/>
-        </w:rPr>
-        <w:t xml:space="preserve">Class question 1 (Easy): It-cleft – the contrast</w:t>
-      </w:r>
-    </w:p>
-    <w:tbl>
-      <w:tblPr>
-        <w:tblStyle w:val="TableGrid"/>
-        <w:tblW w:w="0" w:type="auto"/>
-        <w:tblLook w:val="04A0" w:firstRow="1" w:lastRow="0" w:firstColumn="1" w:lastColumn="0" w:noHBand="0" w:noVBand="1"/>
-      </w:tblPr>
-      <w:tblGrid>
-        <w:gridCol w:w="2605"/>
-        <w:gridCol w:w="6745"/>
-      </w:tblGrid>
-      <w:tr>
-        <w:tc>
-          <w:tcPr>
-            <w:tcW w:w="2605" w:type="dxa"/>
-          </w:tcPr>
-          <w:p>
-            <w:r>
-              <w:rPr>
-                <w:rFonts w:cs="Times New Roman"/>
-              </w:rPr>
-              <w:t>Simple sentence:</w:t>
-            </w:r>
-          </w:p>
-        </w:tc>
-        <w:tc>
-          <w:tcPr>
-            <w:tcW w:w="6745" w:type="dxa"/>
-          </w:tcPr>
-          <w:p>
-            <w:r>
-              <w:rPr>
-                <w:rFonts w:cs="Times New Roman"/>
-              </w:rPr>
-              <w:t xml:space="preserve">Some blame phones for tiredness, but late-night gaming is the real cause.</w:t>
-            </w:r>
-          </w:p>
-        </w:tc>
-      </w:tr>
-      <w:tr>
-        <w:tc>
-          <w:tcPr>
-            <w:tcW w:w="2605" w:type="dxa"/>
-          </w:tcPr>
-          <w:p>
-            <w:r>
-              <w:rPr>
-                <w:rFonts w:cs="Times New Roman"/>
-              </w:rPr>
-              <w:t>Prompt:</w:t>
-            </w:r>
-          </w:p>
-        </w:tc>
-        <w:tc>
-          <w:tcPr>
-            <w:tcW w:w="6745" w:type="dxa"/>
-          </w:tcPr>
-          <w:p>
-            <w:r>
-              <w:rPr>
-                <w:rFonts w:cs="Times New Roman"/>
-                <w:i/>
-              </w:rPr>
-              <w:t xml:space="preserve">Begin with ‘While some blame phones for tiredness …’.</w:t>
-            </w:r>
-          </w:p>
-        </w:tc>
-      </w:tr>
-      <w:tr>
-        <w:tc>
-          <w:tcPr>
-            <w:tcW w:w="9350" w:type="dxa"/>
-            <w:gridSpan w:val="2"/>
-          </w:tcPr>
-          <w:p/>
-          <w:p/>
-        </w:tc>
-      </w:tr>
-    </w:tbl>
-    <w:p>
-      <w:pPr>
-        <w:pStyle w:val="Heading3"/>
-        <w:spacing w:line="360" w:lineRule="auto"/>
-      </w:pPr>
-      <w:r>
-        <w:rPr>
-          <w:rFonts w:ascii="Times New Roman" w:hAnsi="Times New Roman" w:cs="Times New Roman"/>
-          <w:sz w:val="22"/>
-        </w:rPr>
-        <w:t xml:space="preserve">Class question 2 (Harder): It-cleft – the contrast</w:t>
-      </w:r>
-    </w:p>
-    <w:tbl>
-      <w:tblPr>
-        <w:tblStyle w:val="TableGrid"/>
-        <w:tblW w:w="0" w:type="auto"/>
-        <w:tblLook w:val="04A0" w:firstRow="1" w:lastRow="0" w:firstColumn="1" w:lastColumn="0" w:noHBand="0" w:noVBand="1"/>
-      </w:tblPr>
-      <w:tblGrid>
-        <w:gridCol w:w="2605"/>
-        <w:gridCol w:w="6745"/>
-      </w:tblGrid>
-      <w:tr>
-        <w:tc>
-          <w:tcPr>
-            <w:tcW w:w="2605" w:type="dxa"/>
-          </w:tcPr>
-          <w:p>
-            <w:r>
-              <w:rPr>
-                <w:rFonts w:cs="Times New Roman"/>
-              </w:rPr>
-              <w:t>Simple sentence:</w:t>
-            </w:r>
-          </w:p>
-        </w:tc>
-        <w:tc>
-          <w:tcPr>
-            <w:tcW w:w="6745" w:type="dxa"/>
-          </w:tcPr>
-          <w:p>
-            <w:r>
-              <w:rPr>
-                <w:rFonts w:cs="Times New Roman"/>
-              </w:rPr>
-              <w:t xml:space="preserve">People say teenagers are antisocial, but they themselves avoid family dinners.</w:t>
-            </w:r>
-          </w:p>
-        </w:tc>
-      </w:tr>
-      <w:tr>
-        <w:tc>
-          <w:tcPr>
-            <w:tcW w:w="2605" w:type="dxa"/>
-          </w:tcPr>
-          <w:p>
-            <w:r>
-              <w:rPr>
-                <w:rFonts w:cs="Times New Roman"/>
-              </w:rPr>
-              <w:t>Prompt:</w:t>
-            </w:r>
-          </w:p>
-        </w:tc>
-        <w:tc>
-          <w:tcPr>
-            <w:tcW w:w="6745" w:type="dxa"/>
-          </w:tcPr>
-          <w:p>
-            <w:r>
-              <w:rPr>
-                <w:rFonts w:cs="Times New Roman"/>
-                <w:i/>
-              </w:rPr>
-              <w:t xml:space="preserve">Begin with ‘While people say teenagers are antisocial …’.</w:t>
-            </w:r>
-          </w:p>
-        </w:tc>
-      </w:tr>
-      <w:tr>
-        <w:tc>
-          <w:tcPr>
-            <w:tcW w:w="9350" w:type="dxa"/>
-            <w:gridSpan w:val="2"/>
-          </w:tcPr>
-          <w:p/>
-          <w:p/>
-        </w:tc>
-      </w:tr>
-    </w:tbl>
-    <w:p>
-      <w:pPr>
-        <w:pStyle w:val="Heading1"/>
-        <w:spacing w:line="360" w:lineRule="auto"/>
-        <w:rPr>
-          <w:sz w:val="22"/>
-          <w:szCs w:val="22"/>
-        </w:rPr>
-      </w:pPr>
-      <w:r>
-        <w:rPr>
-          <w:rFonts w:ascii="Times New Roman" w:hAnsi="Times New Roman" w:cs="Times New Roman"/>
-          <w:sz w:val="22"/>
-          <w:szCs w:val="22"/>
-        </w:rPr>
-        <w:t xml:space="preserve">Part 3: Practice sets</w:t>
+        <w:t>________________________________________________________________________________________________________________________________________________________________________________</w:t>
       </w:r>
     </w:p>
     <w:p>
       <w:pPr>
-        <w:spacing w:line="360" w:lineRule="auto"/>
+        <w:pStyle w:val="ListParagraph"/>
+        <w:numPr>
+          <w:ilvl w:val="0"/>
+          <w:numId w:val="18"/>
+        </w:numPr>
+        <w:spacing w:after="0" w:line="600" w:lineRule="auto"/>
       </w:pPr>
       <w:r>
-        <w:rPr>
-          <w:rFonts w:cs="Times New Roman"/>
-        </w:rPr>
-        <w:t xml:space="preserve">Rewrite each sentence as a cleft sentence. The type of cleft to use is shown in brackets.</w:t>
+        <w:t>________________________________________________________________________________________________________________________________________________________________________________</w:t>
       </w:r>
     </w:p>
     <w:p>
       <w:pPr>
-        <w:pStyle w:val="Heading3"/>
-        <w:spacing w:line="360" w:lineRule="auto"/>
+        <w:pStyle w:val="ListParagraph"/>
+        <w:numPr>
+          <w:ilvl w:val="0"/>
+          <w:numId w:val="18"/>
+        </w:numPr>
+        <w:spacing w:after="0" w:line="600" w:lineRule="auto"/>
       </w:pPr>
       <w:r>
-        <w:rPr>
-          <w:rFonts w:ascii="Times New Roman" w:hAnsi="Times New Roman" w:cs="Times New Roman"/>
-          <w:sz w:val="22"/>
-        </w:rPr>
-        <w:t xml:space="preserve">Set 1: It-cleft – the cause</w:t>
-      </w:r>
-    </w:p>
-    <w:tbl>
-      <w:tblPr>
-        <w:tblStyle w:val="TableGrid"/>
-        <w:tblW w:w="0" w:type="auto"/>
-        <w:tblLook w:val="04A0" w:firstRow="1" w:lastRow="0" w:firstColumn="1" w:lastColumn="0" w:noHBand="0" w:noVBand="1"/>
-      </w:tblPr>
-      <w:tblGrid>
-        <w:gridCol w:w="2605"/>
-        <w:gridCol w:w="6745"/>
-      </w:tblGrid>
-      <w:tr>
-        <w:tc>
-          <w:tcPr>
-            <w:tcW w:w="2605" w:type="dxa"/>
-          </w:tcPr>
-          <w:p>
-            <w:r>
-              <w:rPr>
-                <w:rFonts w:cs="Times New Roman"/>
-              </w:rPr>
-              <w:t>Simple sentence:</w:t>
-            </w:r>
-          </w:p>
-        </w:tc>
-        <w:tc>
-          <w:tcPr>
-            <w:tcW w:w="6745" w:type="dxa"/>
-          </w:tcPr>
-          <w:p>
-            <w:r>
-              <w:rPr>
-                <w:rFonts w:cs="Times New Roman"/>
-              </w:rPr>
-              <w:t xml:space="preserve">Teenagers send short messages because they are afraid of real conversations.</w:t>
-            </w:r>
-          </w:p>
-        </w:tc>
-      </w:tr>
-      <w:tr>
-        <w:tc>
-          <w:tcPr>
-            <w:tcW w:w="2605" w:type="dxa"/>
-          </w:tcPr>
-          <w:p>
-            <w:r>
-              <w:rPr>
-                <w:rFonts w:cs="Times New Roman"/>
-              </w:rPr>
-              <w:t>Prompt:</w:t>
-            </w:r>
-          </w:p>
-        </w:tc>
-        <w:tc>
-          <w:tcPr>
-            <w:tcW w:w="6745" w:type="dxa"/>
-          </w:tcPr>
-          <w:p>
-            <w:r>
-              <w:rPr>
-                <w:rFonts w:cs="Times New Roman"/>
-                <w:i/>
-              </w:rPr>
-              <w:t xml:space="preserve">Use an IT-cleft.</w:t>
-            </w:r>
-          </w:p>
-        </w:tc>
-      </w:tr>
-      <w:tr>
-        <w:tc>
-          <w:tcPr>
-            <w:tcW w:w="9350" w:type="dxa"/>
-            <w:gridSpan w:val="2"/>
-          </w:tcPr>
-          <w:p/>
-          <w:p/>
-        </w:tc>
-      </w:tr>
-    </w:tbl>
-    <w:p>
-      <w:pPr>
-        <w:pStyle w:val="Heading3"/>
-        <w:spacing w:line="360" w:lineRule="auto"/>
-      </w:pPr>
-      <w:r>
-        <w:rPr>
-          <w:rFonts w:ascii="Times New Roman" w:hAnsi="Times New Roman" w:cs="Times New Roman"/>
-          <w:sz w:val="22"/>
-        </w:rPr>
-        <w:t xml:space="preserve">Set 2: Wh-cleft – the recommendation</w:t>
-      </w:r>
-    </w:p>
-    <w:tbl>
-      <w:tblPr>
-        <w:tblStyle w:val="TableGrid"/>
-        <w:tblW w:w="0" w:type="auto"/>
-        <w:tblLook w:val="04A0" w:firstRow="1" w:lastRow="0" w:firstColumn="1" w:lastColumn="0" w:noHBand="0" w:noVBand="1"/>
-      </w:tblPr>
-      <w:tblGrid>
-        <w:gridCol w:w="2605"/>
-        <w:gridCol w:w="6745"/>
-      </w:tblGrid>
-      <w:tr>
-        <w:tc>
-          <w:tcPr>
-            <w:tcW w:w="2605" w:type="dxa"/>
-          </w:tcPr>
-          <w:p>
-            <w:r>
-              <w:rPr>
-                <w:rFonts w:cs="Times New Roman"/>
-              </w:rPr>
-              <w:t>Simple sentence:</w:t>
-            </w:r>
-          </w:p>
-        </w:tc>
-        <w:tc>
-          <w:tcPr>
-            <w:tcW w:w="6745" w:type="dxa"/>
-          </w:tcPr>
-          <w:p>
-            <w:r>
-              <w:rPr>
-                <w:rFonts w:cs="Times New Roman"/>
-              </w:rPr>
-              <w:t xml:space="preserve">Students need to practise face-to-face communication.</w:t>
-            </w:r>
-          </w:p>
-        </w:tc>
-      </w:tr>
-      <w:tr>
-        <w:tc>
-          <w:tcPr>
-            <w:tcW w:w="2605" w:type="dxa"/>
-          </w:tcPr>
-          <w:p>
-            <w:r>
-              <w:rPr>
-                <w:rFonts w:cs="Times New Roman"/>
-              </w:rPr>
-              <w:t>Prompt:</w:t>
-            </w:r>
-          </w:p>
-        </w:tc>
-        <w:tc>
-          <w:tcPr>
-            <w:tcW w:w="6745" w:type="dxa"/>
-          </w:tcPr>
-          <w:p>
-            <w:r>
-              <w:rPr>
-                <w:rFonts w:cs="Times New Roman"/>
-                <w:i/>
-              </w:rPr>
-              <w:t xml:space="preserve">Use a WHAT-cleft.</w:t>
-            </w:r>
-          </w:p>
-        </w:tc>
-      </w:tr>
-      <w:tr>
-        <w:tc>
-          <w:tcPr>
-            <w:tcW w:w="9350" w:type="dxa"/>
-            <w:gridSpan w:val="2"/>
-          </w:tcPr>
-          <w:p/>
-          <w:p/>
-        </w:tc>
-      </w:tr>
-    </w:tbl>
-    <w:p>
-      <w:pPr>
-        <w:pStyle w:val="Heading3"/>
-        <w:spacing w:line="360" w:lineRule="auto"/>
-      </w:pPr>
-      <w:r>
-        <w:rPr>
-          <w:rFonts w:ascii="Times New Roman" w:hAnsi="Times New Roman" w:cs="Times New Roman"/>
-          <w:sz w:val="22"/>
-        </w:rPr>
-        <w:t xml:space="preserve">Set 3: All-cleft – the only thing needed</w:t>
-      </w:r>
-    </w:p>
-    <w:tbl>
-      <w:tblPr>
-        <w:tblStyle w:val="TableGrid"/>
-        <w:tblW w:w="0" w:type="auto"/>
-        <w:tblLook w:val="04A0" w:firstRow="1" w:lastRow="0" w:firstColumn="1" w:lastColumn="0" w:noHBand="0" w:noVBand="1"/>
-      </w:tblPr>
-      <w:tblGrid>
-        <w:gridCol w:w="2605"/>
-        <w:gridCol w:w="6745"/>
-      </w:tblGrid>
-      <w:tr>
-        <w:tc>
-          <w:tcPr>
-            <w:tcW w:w="2605" w:type="dxa"/>
-          </w:tcPr>
-          <w:p>
-            <w:r>
-              <w:rPr>
-                <w:rFonts w:cs="Times New Roman"/>
-              </w:rPr>
-              <w:t>Simple sentence:</w:t>
-            </w:r>
-          </w:p>
-        </w:tc>
-        <w:tc>
-          <w:tcPr>
-            <w:tcW w:w="6745" w:type="dxa"/>
-          </w:tcPr>
-          <w:p>
-            <w:r>
-              <w:rPr>
-                <w:rFonts w:cs="Times New Roman"/>
-              </w:rPr>
-              <w:t xml:space="preserve">Teenagers only need to be confident to start a real conversation.</w:t>
-            </w:r>
-          </w:p>
-        </w:tc>
-      </w:tr>
-      <w:tr>
-        <w:tc>
-          <w:tcPr>
-            <w:tcW w:w="2605" w:type="dxa"/>
-          </w:tcPr>
-          <w:p>
-            <w:r>
-              <w:rPr>
-                <w:rFonts w:cs="Times New Roman"/>
-              </w:rPr>
-              <w:t>Prompt:</w:t>
-            </w:r>
-          </w:p>
-        </w:tc>
-        <w:tc>
-          <w:tcPr>
-            <w:tcW w:w="6745" w:type="dxa"/>
-          </w:tcPr>
-          <w:p>
-            <w:r>
-              <w:rPr>
-                <w:rFonts w:cs="Times New Roman"/>
-                <w:i/>
-              </w:rPr>
-              <w:t xml:space="preserve">Use an ALL-cleft.</w:t>
-            </w:r>
-          </w:p>
-        </w:tc>
-      </w:tr>
-      <w:tr>
-        <w:tc>
-          <w:tcPr>
-            <w:tcW w:w="9350" w:type="dxa"/>
-            <w:gridSpan w:val="2"/>
-          </w:tcPr>
-          <w:p/>
-          <w:p/>
-        </w:tc>
-      </w:tr>
-    </w:tbl>
-    <w:p>
-      <w:pPr>
-        <w:pStyle w:val="Heading3"/>
-        <w:spacing w:line="360" w:lineRule="auto"/>
-      </w:pPr>
-      <w:r>
-        <w:rPr>
-          <w:rFonts w:ascii="Times New Roman" w:hAnsi="Times New Roman" w:cs="Times New Roman"/>
-          <w:sz w:val="22"/>
-        </w:rPr>
-        <w:t xml:space="preserve">Set 4: It-cleft – the contrast</w:t>
-      </w:r>
-    </w:p>
-    <w:tbl>
-      <w:tblPr>
-        <w:tblStyle w:val="TableGrid"/>
-        <w:tblW w:w="0" w:type="auto"/>
-        <w:tblLook w:val="04A0" w:firstRow="1" w:lastRow="0" w:firstColumn="1" w:lastColumn="0" w:noHBand="0" w:noVBand="1"/>
-      </w:tblPr>
-      <w:tblGrid>
-        <w:gridCol w:w="2605"/>
-        <w:gridCol w:w="6745"/>
-      </w:tblGrid>
-      <w:tr>
-        <w:tc>
-          <w:tcPr>
-            <w:tcW w:w="2605" w:type="dxa"/>
-          </w:tcPr>
-          <w:p>
-            <w:r>
-              <w:rPr>
-                <w:rFonts w:cs="Times New Roman"/>
-              </w:rPr>
-              <w:t>Simple sentence:</w:t>
-            </w:r>
-          </w:p>
-        </w:tc>
-        <w:tc>
-          <w:tcPr>
-            <w:tcW w:w="6745" w:type="dxa"/>
-          </w:tcPr>
-          <w:p>
-            <w:r>
-              <w:rPr>
-                <w:rFonts w:cs="Times New Roman"/>
-              </w:rPr>
-              <w:t xml:space="preserve">People think technology is convenient, but it actually destroys our patience.</w:t>
-            </w:r>
-          </w:p>
-        </w:tc>
-      </w:tr>
-      <w:tr>
-        <w:tc>
-          <w:tcPr>
-            <w:tcW w:w="2605" w:type="dxa"/>
-          </w:tcPr>
-          <w:p>
-            <w:r>
-              <w:rPr>
-                <w:rFonts w:cs="Times New Roman"/>
-              </w:rPr>
-              <w:t>Prompt:</w:t>
-            </w:r>
-          </w:p>
-        </w:tc>
-        <w:tc>
-          <w:tcPr>
-            <w:tcW w:w="6745" w:type="dxa"/>
-          </w:tcPr>
-          <w:p>
-            <w:r>
-              <w:rPr>
-                <w:rFonts w:cs="Times New Roman"/>
-                <w:i/>
-              </w:rPr>
-              <w:t xml:space="preserve">Use an IT-cleft with WHILE.</w:t>
-            </w:r>
-          </w:p>
-        </w:tc>
-      </w:tr>
-      <w:tr>
-        <w:tc>
-          <w:tcPr>
-            <w:tcW w:w="9350" w:type="dxa"/>
-            <w:gridSpan w:val="2"/>
-          </w:tcPr>
-          <w:p/>
-          <w:p/>
-        </w:tc>
-      </w:tr>
-    </w:tbl>
-    <w:p>
-      <w:pPr>
-        <w:pStyle w:val="Heading1"/>
-        <w:spacing w:line="360" w:lineRule="auto"/>
-        <w:rPr>
-          <w:sz w:val="22"/>
-          <w:szCs w:val="22"/>
-        </w:rPr>
-      </w:pPr>
-      <w:r>
-        <w:rPr>
-          <w:rFonts w:ascii="Times New Roman" w:hAnsi="Times New Roman" w:cs="Times New Roman"/>
-          <w:sz w:val="22"/>
-          <w:szCs w:val="22"/>
-        </w:rPr>
-        <w:t xml:space="preserve">Part 4: Writing Task</w:t>
-      </w:r>
-    </w:p>
-    <w:p>
-      <w:pPr>
-        <w:pBdr>
-          <w:top w:val="single" w:sz="4" w:space="4" w:color="auto"/>
-          <w:left w:val="single" w:sz="4" w:space="4" w:color="auto"/>
-          <w:bottom w:val="single" w:sz="4" w:space="4" w:color="auto"/>
-          <w:right w:val="single" w:sz="4" w:space="4" w:color="auto"/>
-        </w:pBdr>
-        <w:shd w:val="clear" w:color="auto" w:fill="E4DFEC"/>
-        <w:spacing w:line="360" w:lineRule="auto"/>
-      </w:pPr>
-      <w:r>
-        <w:rPr>
-          <w:rFonts w:cs="Times New Roman"/>
-          <w:b/>
-        </w:rPr>
-        <w:t xml:space="preserve">Instructions:</w:t>
-      </w:r>
-    </w:p>
-    <w:p>
-      <w:pPr>
-        <w:pBdr>
-          <w:top w:val="single" w:sz="4" w:space="4" w:color="auto"/>
-          <w:left w:val="single" w:sz="4" w:space="4" w:color="auto"/>
-          <w:bottom w:val="single" w:sz="4" w:space="4" w:color="auto"/>
-          <w:right w:val="single" w:sz="4" w:space="4" w:color="auto"/>
-        </w:pBdr>
-        <w:shd w:val="clear" w:color="auto" w:fill="E4DFEC"/>
-        <w:spacing w:line="360" w:lineRule="auto"/>
-        <w:rPr>
-          <w:rFonts w:cs="Times New Roman"/>
-        </w:rPr>
-      </w:pPr>
-      <w:r>
-        <w:rPr>
-          <w:rFonts w:cs="Times New Roman"/>
-        </w:rPr>
-        <w:t xml:space="preserve">1. Write ONE paragraph (about 80 words) explaining the influence of artificial intelligence on students, and suggesting ONE thing schools could do to help.</w:t>
-      </w:r>
-    </w:p>
-    <w:p>
-      <w:pPr>
-        <w:pBdr>
-          <w:top w:val="single" w:sz="4" w:space="4" w:color="auto"/>
-          <w:left w:val="single" w:sz="4" w:space="4" w:color="auto"/>
-          <w:bottom w:val="single" w:sz="4" w:space="4" w:color="auto"/>
-          <w:right w:val="single" w:sz="4" w:space="4" w:color="auto"/>
-        </w:pBdr>
-        <w:shd w:val="clear" w:color="auto" w:fill="E4DFEC"/>
-        <w:spacing w:line="360" w:lineRule="auto"/>
-        <w:rPr>
-          <w:rFonts w:cs="Times New Roman"/>
-        </w:rPr>
-      </w:pPr>
-      <w:r>
-        <w:rPr>
-          <w:rFonts w:cs="Times New Roman"/>
-        </w:rPr>
-        <w:sym w:font="Wingdings" w:char="F0E0"/>
+        <w:t>____________________________________________________________________________________________________________________________________________________________________________</w:t>
       </w:r>
       <w:r>
-        <w:rPr>
-          <w:rFonts w:cs="Times New Roman"/>
-        </w:rPr>
-        <w:t xml:space="preserve"> Use </w:t>
-      </w:r>
-      <w:r>
-        <w:rPr>
-          <w:rFonts w:cs="Times New Roman"/>
-          <w:b/>
-          <w:bCs/>
-          <w:u w:val="single"/>
-        </w:rPr>
-        <w:t xml:space="preserve">ONE cleft sentence</w:t>
-      </w:r>
-      <w:r>
-        <w:rPr>
-          <w:rFonts w:cs="Times New Roman"/>
-        </w:rPr>
-        <w:t xml:space="preserve"> (It is … that … / What … is … / All … needs to do is …).</w:t>
-      </w:r>
-      <w:r>
-        <w:rPr>
-          <w:rFonts w:cs="Times New Roman"/>
-        </w:rPr>
-        <w:br/>
-      </w:r>
-      <w:r>
-        <w:rPr>
-          <w:rFonts w:cs="Times New Roman"/>
-        </w:rPr>
-        <w:sym w:font="Wingdings" w:char="F0E0"/>
-      </w:r>
-      <w:r>
-        <w:rPr>
-          <w:rFonts w:cs="Times New Roman"/>
-        </w:rPr>
-        <w:t xml:space="preserve"> Use a relative clause or an inverted pattern e.g. Not only … / Never … / Rarely …</w:t>
-      </w:r>
-    </w:p>
-    <w:p>
-      <w:pPr>
-        <w:spacing w:line="360" w:lineRule="auto"/>
-      </w:pPr>
-    </w:p>
-    <w:p>
-      <w:pPr>
-        <w:spacing w:line="360" w:lineRule="auto"/>
-      </w:pPr>
-      <w:r>
-        <w:rPr>
-          <w:rFonts w:cs="Times New Roman"/>
-        </w:rPr>
-        <w:t>________________________________________________________________________________</w:t>
-      </w:r>
-    </w:p>
-    <w:p>
-      <w:pPr>
-        <w:spacing w:line="360" w:lineRule="auto"/>
-      </w:pPr>
-      <w:r>
-        <w:rPr>
-          <w:rFonts w:cs="Times New Roman"/>
-        </w:rPr>
-        <w:t>________________________________________________________________________________</w:t>
-      </w:r>
-    </w:p>
-    <w:p>
-      <w:pPr>
-        <w:spacing w:line="360" w:lineRule="auto"/>
-      </w:pPr>
-      <w:r>
-        <w:rPr>
-          <w:rFonts w:cs="Times New Roman"/>
-        </w:rPr>
-        <w:t>________________________________________________________________________________</w:t>
-      </w:r>
-    </w:p>
-    <w:p>
-      <w:pPr>
-        <w:spacing w:line="360" w:lineRule="auto"/>
-      </w:pPr>
-      <w:r>
-        <w:rPr>
-          <w:rFonts w:cs="Times New Roman"/>
-        </w:rPr>
-        <w:t>________________________________________________________________________________</w:t>
-      </w:r>
-    </w:p>
-    <w:p>
-      <w:pPr>
-        <w:spacing w:line="360" w:lineRule="auto"/>
-      </w:pPr>
-      <w:r>
-        <w:rPr>
-          <w:rFonts w:cs="Times New Roman"/>
-        </w:rPr>
-        <w:t>________________________________________________________________________________</w:t>
-      </w:r>
-    </w:p>
-    <w:p>
-      <w:pPr>
-        <w:spacing w:line="360" w:lineRule="auto"/>
-      </w:pPr>
-      <w:r>
-        <w:rPr>
-          <w:rFonts w:cs="Times New Roman"/>
-        </w:rPr>
-        <w:t>________________________________________________________________________________</w:t>
-      </w:r>
-    </w:p>
-    <w:p>
-      <w:pPr>
-        <w:spacing w:line="360" w:lineRule="auto"/>
-      </w:pPr>
-      <w:r>
-        <w:rPr>
-          <w:rFonts w:cs="Times New Roman"/>
-        </w:rPr>
-        <w:t>________________________________________________________________________________</w:t>
+        <w:t>____</w:t>
       </w:r>
     </w:p>
     <w:sectPr>
-      <w:headerReference w:type="default" r:id="rId8"/>
-      <w:footerReference w:type="default" r:id="rId9"/>
-      <w:pgSz w:w="12240" w:h="15840"/>
-      <w:pgMar w:top="720" w:right="1440" w:bottom="720" w:left="1440" w:header="432" w:footer="720" w:gutter="0"/>
+      <w:headerReference w:type="default" r:id="rId9"/>
+      <w:footerReference w:type="default" r:id="rId10"/>
+      <w:pgSz w:w="11920" w:h="16860"/>
+      <w:pgMar w:top="576" w:right="907" w:bottom="835" w:left="907" w:header="0" w:footer="720" w:gutter="0"/>
+      <w:pgNumType w:start="1"/>
       <w:cols w:space="720"/>
-      <w:docGrid w:linePitch="360"/>
+      <w:docGrid w:linePitch="299"/>
     </w:sectPr>
   </w:body>
 </w:document>
@@ -2225,6 +2333,95 @@
     </w:lvl>
   </w:abstractNum>
   <w:abstractNum w:abstractNumId="9" w15:restartNumberingAfterBreak="0">
+    <w:nsid w:val="092C0983"/>
+    <w:multiLevelType w:val="hybridMultilevel"/>
+    <w:tmpl w:val="FC9A27A2"/>
+    <w:lvl w:ilvl="0" w:tplc="F20E9B72">
+      <w:start w:val="1"/>
+      <w:numFmt w:val="decimal"/>
+      <w:lvlText w:val="%1."/>
+      <w:lvlJc w:val="left"/>
+      <w:pPr>
+        <w:ind w:left="360" w:hanging="360"/>
+      </w:pPr>
+      <w:rPr>
+        <w:rFonts w:hint="default"/>
+      </w:rPr>
+    </w:lvl>
+    <w:lvl w:ilvl="1" w:tplc="04090019" w:tentative="1">
+      <w:start w:val="1"/>
+      <w:numFmt w:val="lowerLetter"/>
+      <w:lvlText w:val="%2."/>
+      <w:lvlJc w:val="left"/>
+      <w:pPr>
+        <w:ind w:left="1080" w:hanging="360"/>
+      </w:pPr>
+    </w:lvl>
+    <w:lvl w:ilvl="2" w:tplc="0409001B" w:tentative="1">
+      <w:start w:val="1"/>
+      <w:numFmt w:val="lowerRoman"/>
+      <w:lvlText w:val="%3."/>
+      <w:lvlJc w:val="right"/>
+      <w:pPr>
+        <w:ind w:left="1800" w:hanging="180"/>
+      </w:pPr>
+    </w:lvl>
+    <w:lvl w:ilvl="3" w:tplc="0409000F" w:tentative="1">
+      <w:start w:val="1"/>
+      <w:numFmt w:val="decimal"/>
+      <w:lvlText w:val="%4."/>
+      <w:lvlJc w:val="left"/>
+      <w:pPr>
+        <w:ind w:left="2520" w:hanging="360"/>
+      </w:pPr>
+    </w:lvl>
+    <w:lvl w:ilvl="4" w:tplc="04090019" w:tentative="1">
+      <w:start w:val="1"/>
+      <w:numFmt w:val="lowerLetter"/>
+      <w:lvlText w:val="%5."/>
+      <w:lvlJc w:val="left"/>
+      <w:pPr>
+        <w:ind w:left="3240" w:hanging="360"/>
+      </w:pPr>
+    </w:lvl>
+    <w:lvl w:ilvl="5" w:tplc="0409001B" w:tentative="1">
+      <w:start w:val="1"/>
+      <w:numFmt w:val="lowerRoman"/>
+      <w:lvlText w:val="%6."/>
+      <w:lvlJc w:val="right"/>
+      <w:pPr>
+        <w:ind w:left="3960" w:hanging="180"/>
+      </w:pPr>
+    </w:lvl>
+    <w:lvl w:ilvl="6" w:tplc="0409000F" w:tentative="1">
+      <w:start w:val="1"/>
+      <w:numFmt w:val="decimal"/>
+      <w:lvlText w:val="%7."/>
+      <w:lvlJc w:val="left"/>
+      <w:pPr>
+        <w:ind w:left="4680" w:hanging="360"/>
+      </w:pPr>
+    </w:lvl>
+    <w:lvl w:ilvl="7" w:tplc="04090019" w:tentative="1">
+      <w:start w:val="1"/>
+      <w:numFmt w:val="lowerLetter"/>
+      <w:lvlText w:val="%8."/>
+      <w:lvlJc w:val="left"/>
+      <w:pPr>
+        <w:ind w:left="5400" w:hanging="360"/>
+      </w:pPr>
+    </w:lvl>
+    <w:lvl w:ilvl="8" w:tplc="0409001B" w:tentative="1">
+      <w:start w:val="1"/>
+      <w:numFmt w:val="lowerRoman"/>
+      <w:lvlText w:val="%9."/>
+      <w:lvlJc w:val="right"/>
+      <w:pPr>
+        <w:ind w:left="6120" w:hanging="180"/>
+      </w:pPr>
+    </w:lvl>
+  </w:abstractNum>
+  <w:abstractNum w:abstractNumId="10" w15:restartNumberingAfterBreak="0">
     <w:nsid w:val="0FB24A9D"/>
     <w:multiLevelType w:val="hybridMultilevel"/>
     <w:tmpl w:val="7E5064E4"/>
@@ -2310,7 +2507,488 @@
       </w:pPr>
     </w:lvl>
   </w:abstractNum>
-  <w:abstractNum w:abstractNumId="10" w15:restartNumberingAfterBreak="0">
+  <w:abstractNum w:abstractNumId="11" w15:restartNumberingAfterBreak="0">
+    <w:nsid w:val="27483EED"/>
+    <w:multiLevelType w:val="hybridMultilevel"/>
+    <w:tmpl w:val="3280A514"/>
+    <w:lvl w:ilvl="0" w:tplc="4C749414">
+      <w:start w:val="1"/>
+      <w:numFmt w:val="decimal"/>
+      <w:lvlText w:val="%1."/>
+      <w:lvlJc w:val="left"/>
+      <w:pPr>
+        <w:ind w:left="360" w:hanging="360"/>
+      </w:pPr>
+      <w:rPr>
+        <w:rFonts w:hint="default"/>
+        <w:b/>
+      </w:rPr>
+    </w:lvl>
+    <w:lvl w:ilvl="1" w:tplc="04090019" w:tentative="1">
+      <w:start w:val="1"/>
+      <w:numFmt w:val="lowerLetter"/>
+      <w:lvlText w:val="%2."/>
+      <w:lvlJc w:val="left"/>
+      <w:pPr>
+        <w:ind w:left="1080" w:hanging="360"/>
+      </w:pPr>
+    </w:lvl>
+    <w:lvl w:ilvl="2" w:tplc="0409001B" w:tentative="1">
+      <w:start w:val="1"/>
+      <w:numFmt w:val="lowerRoman"/>
+      <w:lvlText w:val="%3."/>
+      <w:lvlJc w:val="right"/>
+      <w:pPr>
+        <w:ind w:left="1800" w:hanging="180"/>
+      </w:pPr>
+    </w:lvl>
+    <w:lvl w:ilvl="3" w:tplc="0409000F" w:tentative="1">
+      <w:start w:val="1"/>
+      <w:numFmt w:val="decimal"/>
+      <w:lvlText w:val="%4."/>
+      <w:lvlJc w:val="left"/>
+      <w:pPr>
+        <w:ind w:left="2520" w:hanging="360"/>
+      </w:pPr>
+    </w:lvl>
+    <w:lvl w:ilvl="4" w:tplc="04090019" w:tentative="1">
+      <w:start w:val="1"/>
+      <w:numFmt w:val="lowerLetter"/>
+      <w:lvlText w:val="%5."/>
+      <w:lvlJc w:val="left"/>
+      <w:pPr>
+        <w:ind w:left="3240" w:hanging="360"/>
+      </w:pPr>
+    </w:lvl>
+    <w:lvl w:ilvl="5" w:tplc="0409001B" w:tentative="1">
+      <w:start w:val="1"/>
+      <w:numFmt w:val="lowerRoman"/>
+      <w:lvlText w:val="%6."/>
+      <w:lvlJc w:val="right"/>
+      <w:pPr>
+        <w:ind w:left="3960" w:hanging="180"/>
+      </w:pPr>
+    </w:lvl>
+    <w:lvl w:ilvl="6" w:tplc="0409000F" w:tentative="1">
+      <w:start w:val="1"/>
+      <w:numFmt w:val="decimal"/>
+      <w:lvlText w:val="%7."/>
+      <w:lvlJc w:val="left"/>
+      <w:pPr>
+        <w:ind w:left="4680" w:hanging="360"/>
+      </w:pPr>
+    </w:lvl>
+    <w:lvl w:ilvl="7" w:tplc="04090019" w:tentative="1">
+      <w:start w:val="1"/>
+      <w:numFmt w:val="lowerLetter"/>
+      <w:lvlText w:val="%8."/>
+      <w:lvlJc w:val="left"/>
+      <w:pPr>
+        <w:ind w:left="5400" w:hanging="360"/>
+      </w:pPr>
+    </w:lvl>
+    <w:lvl w:ilvl="8" w:tplc="0409001B" w:tentative="1">
+      <w:start w:val="1"/>
+      <w:numFmt w:val="lowerRoman"/>
+      <w:lvlText w:val="%9."/>
+      <w:lvlJc w:val="right"/>
+      <w:pPr>
+        <w:ind w:left="6120" w:hanging="180"/>
+      </w:pPr>
+    </w:lvl>
+  </w:abstractNum>
+  <w:abstractNum w:abstractNumId="12" w15:restartNumberingAfterBreak="0">
+    <w:nsid w:val="2B396291"/>
+    <w:multiLevelType w:val="hybridMultilevel"/>
+    <w:tmpl w:val="2EDAA58C"/>
+    <w:lvl w:ilvl="0" w:tplc="F20E9B72">
+      <w:start w:val="1"/>
+      <w:numFmt w:val="decimal"/>
+      <w:lvlText w:val="%1."/>
+      <w:lvlJc w:val="left"/>
+      <w:pPr>
+        <w:ind w:left="360" w:hanging="360"/>
+      </w:pPr>
+      <w:rPr>
+        <w:rFonts w:hint="default"/>
+      </w:rPr>
+    </w:lvl>
+    <w:lvl w:ilvl="1" w:tplc="04090019" w:tentative="1">
+      <w:start w:val="1"/>
+      <w:numFmt w:val="lowerLetter"/>
+      <w:lvlText w:val="%2."/>
+      <w:lvlJc w:val="left"/>
+      <w:pPr>
+        <w:ind w:left="1440" w:hanging="360"/>
+      </w:pPr>
+    </w:lvl>
+    <w:lvl w:ilvl="2" w:tplc="0409001B" w:tentative="1">
+      <w:start w:val="1"/>
+      <w:numFmt w:val="lowerRoman"/>
+      <w:lvlText w:val="%3."/>
+      <w:lvlJc w:val="right"/>
+      <w:pPr>
+        <w:ind w:left="2160" w:hanging="180"/>
+      </w:pPr>
+    </w:lvl>
+    <w:lvl w:ilvl="3" w:tplc="0409000F" w:tentative="1">
+      <w:start w:val="1"/>
+      <w:numFmt w:val="decimal"/>
+      <w:lvlText w:val="%4."/>
+      <w:lvlJc w:val="left"/>
+      <w:pPr>
+        <w:ind w:left="2880" w:hanging="360"/>
+      </w:pPr>
+    </w:lvl>
+    <w:lvl w:ilvl="4" w:tplc="04090019" w:tentative="1">
+      <w:start w:val="1"/>
+      <w:numFmt w:val="lowerLetter"/>
+      <w:lvlText w:val="%5."/>
+      <w:lvlJc w:val="left"/>
+      <w:pPr>
+        <w:ind w:left="3600" w:hanging="360"/>
+      </w:pPr>
+    </w:lvl>
+    <w:lvl w:ilvl="5" w:tplc="0409001B" w:tentative="1">
+      <w:start w:val="1"/>
+      <w:numFmt w:val="lowerRoman"/>
+      <w:lvlText w:val="%6."/>
+      <w:lvlJc w:val="right"/>
+      <w:pPr>
+        <w:ind w:left="4320" w:hanging="180"/>
+      </w:pPr>
+    </w:lvl>
+    <w:lvl w:ilvl="6" w:tplc="0409000F" w:tentative="1">
+      <w:start w:val="1"/>
+      <w:numFmt w:val="decimal"/>
+      <w:lvlText w:val="%7."/>
+      <w:lvlJc w:val="left"/>
+      <w:pPr>
+        <w:ind w:left="5040" w:hanging="360"/>
+      </w:pPr>
+    </w:lvl>
+    <w:lvl w:ilvl="7" w:tplc="04090019" w:tentative="1">
+      <w:start w:val="1"/>
+      <w:numFmt w:val="lowerLetter"/>
+      <w:lvlText w:val="%8."/>
+      <w:lvlJc w:val="left"/>
+      <w:pPr>
+        <w:ind w:left="5760" w:hanging="360"/>
+      </w:pPr>
+    </w:lvl>
+    <w:lvl w:ilvl="8" w:tplc="0409001B" w:tentative="1">
+      <w:start w:val="1"/>
+      <w:numFmt w:val="lowerRoman"/>
+      <w:lvlText w:val="%9."/>
+      <w:lvlJc w:val="right"/>
+      <w:pPr>
+        <w:ind w:left="6480" w:hanging="180"/>
+      </w:pPr>
+    </w:lvl>
+  </w:abstractNum>
+  <w:abstractNum w:abstractNumId="13" w15:restartNumberingAfterBreak="0">
+    <w:nsid w:val="3DC1588F"/>
+    <w:multiLevelType w:val="hybridMultilevel"/>
+    <w:tmpl w:val="97AABB98"/>
+    <w:lvl w:ilvl="0" w:tplc="63182EAA">
+      <w:start w:val="1"/>
+      <w:numFmt w:val="decimal"/>
+      <w:lvlText w:val="(%1)"/>
+      <w:lvlJc w:val="left"/>
+      <w:pPr>
+        <w:ind w:left="360" w:hanging="360"/>
+      </w:pPr>
+      <w:rPr>
+        <w:rFonts w:hint="default"/>
+      </w:rPr>
+    </w:lvl>
+    <w:lvl w:ilvl="1" w:tplc="04090019" w:tentative="1">
+      <w:start w:val="1"/>
+      <w:numFmt w:val="lowerLetter"/>
+      <w:lvlText w:val="%2."/>
+      <w:lvlJc w:val="left"/>
+      <w:pPr>
+        <w:ind w:left="1080" w:hanging="360"/>
+      </w:pPr>
+    </w:lvl>
+    <w:lvl w:ilvl="2" w:tplc="0409001B" w:tentative="1">
+      <w:start w:val="1"/>
+      <w:numFmt w:val="lowerRoman"/>
+      <w:lvlText w:val="%3."/>
+      <w:lvlJc w:val="right"/>
+      <w:pPr>
+        <w:ind w:left="1800" w:hanging="180"/>
+      </w:pPr>
+    </w:lvl>
+    <w:lvl w:ilvl="3" w:tplc="0409000F" w:tentative="1">
+      <w:start w:val="1"/>
+      <w:numFmt w:val="decimal"/>
+      <w:lvlText w:val="%4."/>
+      <w:lvlJc w:val="left"/>
+      <w:pPr>
+        <w:ind w:left="2520" w:hanging="360"/>
+      </w:pPr>
+    </w:lvl>
+    <w:lvl w:ilvl="4" w:tplc="04090019" w:tentative="1">
+      <w:start w:val="1"/>
+      <w:numFmt w:val="lowerLetter"/>
+      <w:lvlText w:val="%5."/>
+      <w:lvlJc w:val="left"/>
+      <w:pPr>
+        <w:ind w:left="3240" w:hanging="360"/>
+      </w:pPr>
+    </w:lvl>
+    <w:lvl w:ilvl="5" w:tplc="0409001B" w:tentative="1">
+      <w:start w:val="1"/>
+      <w:numFmt w:val="lowerRoman"/>
+      <w:lvlText w:val="%6."/>
+      <w:lvlJc w:val="right"/>
+      <w:pPr>
+        <w:ind w:left="3960" w:hanging="180"/>
+      </w:pPr>
+    </w:lvl>
+    <w:lvl w:ilvl="6" w:tplc="0409000F" w:tentative="1">
+      <w:start w:val="1"/>
+      <w:numFmt w:val="decimal"/>
+      <w:lvlText w:val="%7."/>
+      <w:lvlJc w:val="left"/>
+      <w:pPr>
+        <w:ind w:left="4680" w:hanging="360"/>
+      </w:pPr>
+    </w:lvl>
+    <w:lvl w:ilvl="7" w:tplc="04090019" w:tentative="1">
+      <w:start w:val="1"/>
+      <w:numFmt w:val="lowerLetter"/>
+      <w:lvlText w:val="%8."/>
+      <w:lvlJc w:val="left"/>
+      <w:pPr>
+        <w:ind w:left="5400" w:hanging="360"/>
+      </w:pPr>
+    </w:lvl>
+    <w:lvl w:ilvl="8" w:tplc="0409001B" w:tentative="1">
+      <w:start w:val="1"/>
+      <w:numFmt w:val="lowerRoman"/>
+      <w:lvlText w:val="%9."/>
+      <w:lvlJc w:val="right"/>
+      <w:pPr>
+        <w:ind w:left="6120" w:hanging="180"/>
+      </w:pPr>
+    </w:lvl>
+  </w:abstractNum>
+  <w:abstractNum w:abstractNumId="14" w15:restartNumberingAfterBreak="0">
+    <w:nsid w:val="53E703C1"/>
+    <w:multiLevelType w:val="hybridMultilevel"/>
+    <w:tmpl w:val="6382D94C"/>
+    <w:lvl w:ilvl="0" w:tplc="63182EAA">
+      <w:start w:val="1"/>
+      <w:numFmt w:val="decimal"/>
+      <w:lvlText w:val="(%1)"/>
+      <w:lvlJc w:val="left"/>
+      <w:pPr>
+        <w:ind w:left="360" w:hanging="360"/>
+      </w:pPr>
+      <w:rPr>
+        <w:rFonts w:hint="default"/>
+      </w:rPr>
+    </w:lvl>
+    <w:lvl w:ilvl="1" w:tplc="04090019" w:tentative="1">
+      <w:start w:val="1"/>
+      <w:numFmt w:val="lowerLetter"/>
+      <w:lvlText w:val="%2."/>
+      <w:lvlJc w:val="left"/>
+      <w:pPr>
+        <w:ind w:left="1440" w:hanging="360"/>
+      </w:pPr>
+    </w:lvl>
+    <w:lvl w:ilvl="2" w:tplc="0409001B" w:tentative="1">
+      <w:start w:val="1"/>
+      <w:numFmt w:val="lowerRoman"/>
+      <w:lvlText w:val="%3."/>
+      <w:lvlJc w:val="right"/>
+      <w:pPr>
+        <w:ind w:left="2160" w:hanging="180"/>
+      </w:pPr>
+    </w:lvl>
+    <w:lvl w:ilvl="3" w:tplc="0409000F" w:tentative="1">
+      <w:start w:val="1"/>
+      <w:numFmt w:val="decimal"/>
+      <w:lvlText w:val="%4."/>
+      <w:lvlJc w:val="left"/>
+      <w:pPr>
+        <w:ind w:left="2880" w:hanging="360"/>
+      </w:pPr>
+    </w:lvl>
+    <w:lvl w:ilvl="4" w:tplc="04090019" w:tentative="1">
+      <w:start w:val="1"/>
+      <w:numFmt w:val="lowerLetter"/>
+      <w:lvlText w:val="%5."/>
+      <w:lvlJc w:val="left"/>
+      <w:pPr>
+        <w:ind w:left="3600" w:hanging="360"/>
+      </w:pPr>
+    </w:lvl>
+    <w:lvl w:ilvl="5" w:tplc="0409001B" w:tentative="1">
+      <w:start w:val="1"/>
+      <w:numFmt w:val="lowerRoman"/>
+      <w:lvlText w:val="%6."/>
+      <w:lvlJc w:val="right"/>
+      <w:pPr>
+        <w:ind w:left="4320" w:hanging="180"/>
+      </w:pPr>
+    </w:lvl>
+    <w:lvl w:ilvl="6" w:tplc="0409000F" w:tentative="1">
+      <w:start w:val="1"/>
+      <w:numFmt w:val="decimal"/>
+      <w:lvlText w:val="%7."/>
+      <w:lvlJc w:val="left"/>
+      <w:pPr>
+        <w:ind w:left="5040" w:hanging="360"/>
+      </w:pPr>
+    </w:lvl>
+    <w:lvl w:ilvl="7" w:tplc="04090019" w:tentative="1">
+      <w:start w:val="1"/>
+      <w:numFmt w:val="lowerLetter"/>
+      <w:lvlText w:val="%8."/>
+      <w:lvlJc w:val="left"/>
+      <w:pPr>
+        <w:ind w:left="5760" w:hanging="360"/>
+      </w:pPr>
+    </w:lvl>
+    <w:lvl w:ilvl="8" w:tplc="0409001B" w:tentative="1">
+      <w:start w:val="1"/>
+      <w:numFmt w:val="lowerRoman"/>
+      <w:lvlText w:val="%9."/>
+      <w:lvlJc w:val="right"/>
+      <w:pPr>
+        <w:ind w:left="6480" w:hanging="180"/>
+      </w:pPr>
+    </w:lvl>
+  </w:abstractNum>
+  <w:abstractNum w:abstractNumId="15" w15:restartNumberingAfterBreak="0">
+    <w:nsid w:val="5B89671E"/>
+    <w:multiLevelType w:val="hybridMultilevel"/>
+    <w:tmpl w:val="678617B6"/>
+    <w:lvl w:ilvl="0" w:tplc="20A24BC0">
+      <w:start w:val="1"/>
+      <w:numFmt w:val="decimal"/>
+      <w:lvlText w:val="%1."/>
+      <w:lvlJc w:val="left"/>
+      <w:pPr>
+        <w:ind w:left="331" w:hanging="212"/>
+        <w:jc w:val="left"/>
+      </w:pPr>
+      <w:rPr>
+        <w:rFonts w:ascii="Arial" w:eastAsia="Arial" w:hAnsi="Arial" w:cs="Arial" w:hint="default"/>
+        <w:b w:val="0"/>
+        <w:bCs w:val="0"/>
+        <w:i w:val="0"/>
+        <w:iCs w:val="0"/>
+        <w:color w:val="334054"/>
+        <w:spacing w:val="-1"/>
+        <w:w w:val="105"/>
+        <w:sz w:val="18"/>
+        <w:szCs w:val="18"/>
+        <w:lang w:val="en-US" w:eastAsia="en-US" w:bidi="ar-SA"/>
+      </w:rPr>
+    </w:lvl>
+    <w:lvl w:ilvl="1" w:tplc="881C164E">
+      <w:numFmt w:val="bullet"/>
+      <w:lvlText w:val="•"/>
+      <w:lvlJc w:val="left"/>
+      <w:pPr>
+        <w:ind w:left="1317" w:hanging="212"/>
+      </w:pPr>
+      <w:rPr>
+        <w:rFonts w:hint="default"/>
+        <w:lang w:val="en-US" w:eastAsia="en-US" w:bidi="ar-SA"/>
+      </w:rPr>
+    </w:lvl>
+    <w:lvl w:ilvl="2" w:tplc="3496BA04">
+      <w:numFmt w:val="bullet"/>
+      <w:lvlText w:val="•"/>
+      <w:lvlJc w:val="left"/>
+      <w:pPr>
+        <w:ind w:left="2295" w:hanging="212"/>
+      </w:pPr>
+      <w:rPr>
+        <w:rFonts w:hint="default"/>
+        <w:lang w:val="en-US" w:eastAsia="en-US" w:bidi="ar-SA"/>
+      </w:rPr>
+    </w:lvl>
+    <w:lvl w:ilvl="3" w:tplc="A75E32B0">
+      <w:numFmt w:val="bullet"/>
+      <w:lvlText w:val="•"/>
+      <w:lvlJc w:val="left"/>
+      <w:pPr>
+        <w:ind w:left="3273" w:hanging="212"/>
+      </w:pPr>
+      <w:rPr>
+        <w:rFonts w:hint="default"/>
+        <w:lang w:val="en-US" w:eastAsia="en-US" w:bidi="ar-SA"/>
+      </w:rPr>
+    </w:lvl>
+    <w:lvl w:ilvl="4" w:tplc="F2680AD6">
+      <w:numFmt w:val="bullet"/>
+      <w:lvlText w:val="•"/>
+      <w:lvlJc w:val="left"/>
+      <w:pPr>
+        <w:ind w:left="4251" w:hanging="212"/>
+      </w:pPr>
+      <w:rPr>
+        <w:rFonts w:hint="default"/>
+        <w:lang w:val="en-US" w:eastAsia="en-US" w:bidi="ar-SA"/>
+      </w:rPr>
+    </w:lvl>
+    <w:lvl w:ilvl="5" w:tplc="29E6B51A">
+      <w:numFmt w:val="bullet"/>
+      <w:lvlText w:val="•"/>
+      <w:lvlJc w:val="left"/>
+      <w:pPr>
+        <w:ind w:left="5229" w:hanging="212"/>
+      </w:pPr>
+      <w:rPr>
+        <w:rFonts w:hint="default"/>
+        <w:lang w:val="en-US" w:eastAsia="en-US" w:bidi="ar-SA"/>
+      </w:rPr>
+    </w:lvl>
+    <w:lvl w:ilvl="6" w:tplc="5B4E2CE6">
+      <w:numFmt w:val="bullet"/>
+      <w:lvlText w:val="•"/>
+      <w:lvlJc w:val="left"/>
+      <w:pPr>
+        <w:ind w:left="6207" w:hanging="212"/>
+      </w:pPr>
+      <w:rPr>
+        <w:rFonts w:hint="default"/>
+        <w:lang w:val="en-US" w:eastAsia="en-US" w:bidi="ar-SA"/>
+      </w:rPr>
+    </w:lvl>
+    <w:lvl w:ilvl="7" w:tplc="FD5C5CAE">
+      <w:numFmt w:val="bullet"/>
+      <w:lvlText w:val="•"/>
+      <w:lvlJc w:val="left"/>
+      <w:pPr>
+        <w:ind w:left="7184" w:hanging="212"/>
+      </w:pPr>
+      <w:rPr>
+        <w:rFonts w:hint="default"/>
+        <w:lang w:val="en-US" w:eastAsia="en-US" w:bidi="ar-SA"/>
+      </w:rPr>
+    </w:lvl>
+    <w:lvl w:ilvl="8" w:tplc="D6C25DCE">
+      <w:numFmt w:val="bullet"/>
+      <w:lvlText w:val="•"/>
+      <w:lvlJc w:val="left"/>
+      <w:pPr>
+        <w:ind w:left="8162" w:hanging="212"/>
+      </w:pPr>
+      <w:rPr>
+        <w:rFonts w:hint="default"/>
+        <w:lang w:val="en-US" w:eastAsia="en-US" w:bidi="ar-SA"/>
+      </w:rPr>
+    </w:lvl>
+  </w:abstractNum>
+  <w:abstractNum w:abstractNumId="16" w15:restartNumberingAfterBreak="0">
     <w:nsid w:val="67C3684C"/>
     <w:multiLevelType w:val="hybridMultilevel"/>
     <w:tmpl w:val="095209C8"/>
@@ -2322,6 +3000,343 @@
       <w:pPr>
         <w:ind w:left="360" w:hanging="360"/>
       </w:pPr>
+    </w:lvl>
+    <w:lvl w:ilvl="1" w:tplc="04090019" w:tentative="1">
+      <w:start w:val="1"/>
+      <w:numFmt w:val="lowerLetter"/>
+      <w:lvlText w:val="%2."/>
+      <w:lvlJc w:val="left"/>
+      <w:pPr>
+        <w:ind w:left="1080" w:hanging="360"/>
+      </w:pPr>
+    </w:lvl>
+    <w:lvl w:ilvl="2" w:tplc="0409001B" w:tentative="1">
+      <w:start w:val="1"/>
+      <w:numFmt w:val="lowerRoman"/>
+      <w:lvlText w:val="%3."/>
+      <w:lvlJc w:val="right"/>
+      <w:pPr>
+        <w:ind w:left="1800" w:hanging="180"/>
+      </w:pPr>
+    </w:lvl>
+    <w:lvl w:ilvl="3" w:tplc="0409000F" w:tentative="1">
+      <w:start w:val="1"/>
+      <w:numFmt w:val="decimal"/>
+      <w:lvlText w:val="%4."/>
+      <w:lvlJc w:val="left"/>
+      <w:pPr>
+        <w:ind w:left="2520" w:hanging="360"/>
+      </w:pPr>
+    </w:lvl>
+    <w:lvl w:ilvl="4" w:tplc="04090019" w:tentative="1">
+      <w:start w:val="1"/>
+      <w:numFmt w:val="lowerLetter"/>
+      <w:lvlText w:val="%5."/>
+      <w:lvlJc w:val="left"/>
+      <w:pPr>
+        <w:ind w:left="3240" w:hanging="360"/>
+      </w:pPr>
+    </w:lvl>
+    <w:lvl w:ilvl="5" w:tplc="0409001B" w:tentative="1">
+      <w:start w:val="1"/>
+      <w:numFmt w:val="lowerRoman"/>
+      <w:lvlText w:val="%6."/>
+      <w:lvlJc w:val="right"/>
+      <w:pPr>
+        <w:ind w:left="3960" w:hanging="180"/>
+      </w:pPr>
+    </w:lvl>
+    <w:lvl w:ilvl="6" w:tplc="0409000F" w:tentative="1">
+      <w:start w:val="1"/>
+      <w:numFmt w:val="decimal"/>
+      <w:lvlText w:val="%7."/>
+      <w:lvlJc w:val="left"/>
+      <w:pPr>
+        <w:ind w:left="4680" w:hanging="360"/>
+      </w:pPr>
+    </w:lvl>
+    <w:lvl w:ilvl="7" w:tplc="04090019" w:tentative="1">
+      <w:start w:val="1"/>
+      <w:numFmt w:val="lowerLetter"/>
+      <w:lvlText w:val="%8."/>
+      <w:lvlJc w:val="left"/>
+      <w:pPr>
+        <w:ind w:left="5400" w:hanging="360"/>
+      </w:pPr>
+    </w:lvl>
+    <w:lvl w:ilvl="8" w:tplc="0409001B" w:tentative="1">
+      <w:start w:val="1"/>
+      <w:numFmt w:val="lowerRoman"/>
+      <w:lvlText w:val="%9."/>
+      <w:lvlJc w:val="right"/>
+      <w:pPr>
+        <w:ind w:left="6120" w:hanging="180"/>
+      </w:pPr>
+    </w:lvl>
+  </w:abstractNum>
+  <w:abstractNum w:abstractNumId="17" w15:restartNumberingAfterBreak="0">
+    <w:nsid w:val="6CC8118D"/>
+    <w:multiLevelType w:val="hybridMultilevel"/>
+    <w:tmpl w:val="1EF86DDA"/>
+    <w:lvl w:ilvl="0" w:tplc="A34E504E">
+      <w:start w:val="1"/>
+      <w:numFmt w:val="decimal"/>
+      <w:lvlText w:val="%1."/>
+      <w:lvlJc w:val="left"/>
+      <w:pPr>
+        <w:ind w:left="331" w:hanging="212"/>
+        <w:jc w:val="left"/>
+      </w:pPr>
+      <w:rPr>
+        <w:rFonts w:ascii="Arial" w:eastAsia="Arial" w:hAnsi="Arial" w:cs="Arial" w:hint="default"/>
+        <w:b w:val="0"/>
+        <w:bCs w:val="0"/>
+        <w:i w:val="0"/>
+        <w:iCs w:val="0"/>
+        <w:color w:val="334054"/>
+        <w:spacing w:val="-1"/>
+        <w:w w:val="105"/>
+        <w:sz w:val="18"/>
+        <w:szCs w:val="18"/>
+        <w:lang w:val="en-US" w:eastAsia="en-US" w:bidi="ar-SA"/>
+      </w:rPr>
+    </w:lvl>
+    <w:lvl w:ilvl="1" w:tplc="40C8B0B8">
+      <w:numFmt w:val="bullet"/>
+      <w:lvlText w:val="•"/>
+      <w:lvlJc w:val="left"/>
+      <w:pPr>
+        <w:ind w:left="1317" w:hanging="212"/>
+      </w:pPr>
+      <w:rPr>
+        <w:rFonts w:hint="default"/>
+        <w:lang w:val="en-US" w:eastAsia="en-US" w:bidi="ar-SA"/>
+      </w:rPr>
+    </w:lvl>
+    <w:lvl w:ilvl="2" w:tplc="306E6C96">
+      <w:numFmt w:val="bullet"/>
+      <w:lvlText w:val="•"/>
+      <w:lvlJc w:val="left"/>
+      <w:pPr>
+        <w:ind w:left="2295" w:hanging="212"/>
+      </w:pPr>
+      <w:rPr>
+        <w:rFonts w:hint="default"/>
+        <w:lang w:val="en-US" w:eastAsia="en-US" w:bidi="ar-SA"/>
+      </w:rPr>
+    </w:lvl>
+    <w:lvl w:ilvl="3" w:tplc="51660EBE">
+      <w:numFmt w:val="bullet"/>
+      <w:lvlText w:val="•"/>
+      <w:lvlJc w:val="left"/>
+      <w:pPr>
+        <w:ind w:left="3273" w:hanging="212"/>
+      </w:pPr>
+      <w:rPr>
+        <w:rFonts w:hint="default"/>
+        <w:lang w:val="en-US" w:eastAsia="en-US" w:bidi="ar-SA"/>
+      </w:rPr>
+    </w:lvl>
+    <w:lvl w:ilvl="4" w:tplc="03D2DFF2">
+      <w:numFmt w:val="bullet"/>
+      <w:lvlText w:val="•"/>
+      <w:lvlJc w:val="left"/>
+      <w:pPr>
+        <w:ind w:left="4251" w:hanging="212"/>
+      </w:pPr>
+      <w:rPr>
+        <w:rFonts w:hint="default"/>
+        <w:lang w:val="en-US" w:eastAsia="en-US" w:bidi="ar-SA"/>
+      </w:rPr>
+    </w:lvl>
+    <w:lvl w:ilvl="5" w:tplc="D578D320">
+      <w:numFmt w:val="bullet"/>
+      <w:lvlText w:val="•"/>
+      <w:lvlJc w:val="left"/>
+      <w:pPr>
+        <w:ind w:left="5229" w:hanging="212"/>
+      </w:pPr>
+      <w:rPr>
+        <w:rFonts w:hint="default"/>
+        <w:lang w:val="en-US" w:eastAsia="en-US" w:bidi="ar-SA"/>
+      </w:rPr>
+    </w:lvl>
+    <w:lvl w:ilvl="6" w:tplc="1E6EDF88">
+      <w:numFmt w:val="bullet"/>
+      <w:lvlText w:val="•"/>
+      <w:lvlJc w:val="left"/>
+      <w:pPr>
+        <w:ind w:left="6207" w:hanging="212"/>
+      </w:pPr>
+      <w:rPr>
+        <w:rFonts w:hint="default"/>
+        <w:lang w:val="en-US" w:eastAsia="en-US" w:bidi="ar-SA"/>
+      </w:rPr>
+    </w:lvl>
+    <w:lvl w:ilvl="7" w:tplc="E9E0D994">
+      <w:numFmt w:val="bullet"/>
+      <w:lvlText w:val="•"/>
+      <w:lvlJc w:val="left"/>
+      <w:pPr>
+        <w:ind w:left="7184" w:hanging="212"/>
+      </w:pPr>
+      <w:rPr>
+        <w:rFonts w:hint="default"/>
+        <w:lang w:val="en-US" w:eastAsia="en-US" w:bidi="ar-SA"/>
+      </w:rPr>
+    </w:lvl>
+    <w:lvl w:ilvl="8" w:tplc="A40AB740">
+      <w:numFmt w:val="bullet"/>
+      <w:lvlText w:val="•"/>
+      <w:lvlJc w:val="left"/>
+      <w:pPr>
+        <w:ind w:left="8162" w:hanging="212"/>
+      </w:pPr>
+      <w:rPr>
+        <w:rFonts w:hint="default"/>
+        <w:lang w:val="en-US" w:eastAsia="en-US" w:bidi="ar-SA"/>
+      </w:rPr>
+    </w:lvl>
+  </w:abstractNum>
+  <w:abstractNum w:abstractNumId="18" w15:restartNumberingAfterBreak="0">
+    <w:nsid w:val="72D659F3"/>
+    <w:multiLevelType w:val="hybridMultilevel"/>
+    <w:tmpl w:val="F4587CA6"/>
+    <w:lvl w:ilvl="0" w:tplc="934A00CA">
+      <w:start w:val="1"/>
+      <w:numFmt w:val="decimal"/>
+      <w:lvlText w:val="%1."/>
+      <w:lvlJc w:val="left"/>
+      <w:pPr>
+        <w:ind w:left="441" w:hanging="281"/>
+        <w:jc w:val="left"/>
+      </w:pPr>
+      <w:rPr>
+        <w:rFonts w:ascii="Arial" w:eastAsia="Arial" w:hAnsi="Arial" w:cs="Arial" w:hint="default"/>
+        <w:b/>
+        <w:bCs/>
+        <w:i w:val="0"/>
+        <w:iCs w:val="0"/>
+        <w:color w:val="0E1729"/>
+        <w:spacing w:val="0"/>
+        <w:w w:val="104"/>
+        <w:sz w:val="23"/>
+        <w:szCs w:val="23"/>
+        <w:lang w:val="en-US" w:eastAsia="en-US" w:bidi="ar-SA"/>
+      </w:rPr>
+    </w:lvl>
+    <w:lvl w:ilvl="1" w:tplc="A0369FB6">
+      <w:numFmt w:val="bullet"/>
+      <w:lvlText w:val="•"/>
+      <w:lvlJc w:val="left"/>
+      <w:pPr>
+        <w:ind w:left="1394" w:hanging="281"/>
+      </w:pPr>
+      <w:rPr>
+        <w:rFonts w:hint="default"/>
+        <w:lang w:val="en-US" w:eastAsia="en-US" w:bidi="ar-SA"/>
+      </w:rPr>
+    </w:lvl>
+    <w:lvl w:ilvl="2" w:tplc="7F36E0C0">
+      <w:numFmt w:val="bullet"/>
+      <w:lvlText w:val="•"/>
+      <w:lvlJc w:val="left"/>
+      <w:pPr>
+        <w:ind w:left="2348" w:hanging="281"/>
+      </w:pPr>
+      <w:rPr>
+        <w:rFonts w:hint="default"/>
+        <w:lang w:val="en-US" w:eastAsia="en-US" w:bidi="ar-SA"/>
+      </w:rPr>
+    </w:lvl>
+    <w:lvl w:ilvl="3" w:tplc="CC3C97C4">
+      <w:numFmt w:val="bullet"/>
+      <w:lvlText w:val="•"/>
+      <w:lvlJc w:val="left"/>
+      <w:pPr>
+        <w:ind w:left="3302" w:hanging="281"/>
+      </w:pPr>
+      <w:rPr>
+        <w:rFonts w:hint="default"/>
+        <w:lang w:val="en-US" w:eastAsia="en-US" w:bidi="ar-SA"/>
+      </w:rPr>
+    </w:lvl>
+    <w:lvl w:ilvl="4" w:tplc="D452DE90">
+      <w:numFmt w:val="bullet"/>
+      <w:lvlText w:val="•"/>
+      <w:lvlJc w:val="left"/>
+      <w:pPr>
+        <w:ind w:left="4256" w:hanging="281"/>
+      </w:pPr>
+      <w:rPr>
+        <w:rFonts w:hint="default"/>
+        <w:lang w:val="en-US" w:eastAsia="en-US" w:bidi="ar-SA"/>
+      </w:rPr>
+    </w:lvl>
+    <w:lvl w:ilvl="5" w:tplc="D0C49BBA">
+      <w:numFmt w:val="bullet"/>
+      <w:lvlText w:val="•"/>
+      <w:lvlJc w:val="left"/>
+      <w:pPr>
+        <w:ind w:left="5210" w:hanging="281"/>
+      </w:pPr>
+      <w:rPr>
+        <w:rFonts w:hint="default"/>
+        <w:lang w:val="en-US" w:eastAsia="en-US" w:bidi="ar-SA"/>
+      </w:rPr>
+    </w:lvl>
+    <w:lvl w:ilvl="6" w:tplc="A7B09E7E">
+      <w:numFmt w:val="bullet"/>
+      <w:lvlText w:val="•"/>
+      <w:lvlJc w:val="left"/>
+      <w:pPr>
+        <w:ind w:left="6164" w:hanging="281"/>
+      </w:pPr>
+      <w:rPr>
+        <w:rFonts w:hint="default"/>
+        <w:lang w:val="en-US" w:eastAsia="en-US" w:bidi="ar-SA"/>
+      </w:rPr>
+    </w:lvl>
+    <w:lvl w:ilvl="7" w:tplc="E16C96BE">
+      <w:numFmt w:val="bullet"/>
+      <w:lvlText w:val="•"/>
+      <w:lvlJc w:val="left"/>
+      <w:pPr>
+        <w:ind w:left="7117" w:hanging="281"/>
+      </w:pPr>
+      <w:rPr>
+        <w:rFonts w:hint="default"/>
+        <w:lang w:val="en-US" w:eastAsia="en-US" w:bidi="ar-SA"/>
+      </w:rPr>
+    </w:lvl>
+    <w:lvl w:ilvl="8" w:tplc="9F3074B8">
+      <w:numFmt w:val="bullet"/>
+      <w:lvlText w:val="•"/>
+      <w:lvlJc w:val="left"/>
+      <w:pPr>
+        <w:ind w:left="8071" w:hanging="281"/>
+      </w:pPr>
+      <w:rPr>
+        <w:rFonts w:hint="default"/>
+        <w:lang w:val="en-US" w:eastAsia="en-US" w:bidi="ar-SA"/>
+      </w:rPr>
+    </w:lvl>
+  </w:abstractNum>
+  <w:abstractNum w:abstractNumId="19" w15:restartNumberingAfterBreak="0">
+    <w:nsid w:val="7AD51623"/>
+    <w:multiLevelType w:val="hybridMultilevel"/>
+    <w:tmpl w:val="E6D65FD2"/>
+    <w:lvl w:ilvl="0" w:tplc="0E229BE0">
+      <w:start w:val="1"/>
+      <w:numFmt w:val="decimal"/>
+      <w:lvlText w:val="%1."/>
+      <w:lvlJc w:val="left"/>
+      <w:pPr>
+        <w:ind w:left="360" w:hanging="360"/>
+      </w:pPr>
+      <w:rPr>
+        <w:rFonts w:hint="default"/>
+      </w:rPr>
     </w:lvl>
     <w:lvl w:ilvl="1" w:tplc="04090019" w:tentative="1">
       <w:start w:val="1"/>
@@ -2424,10 +3439,37 @@
     <w:abstractNumId w:val="0"/>
   </w:num>
   <w:num w:numId="10" w16cid:durableId="1082023911">
+    <w:abstractNumId w:val="16"/>
+  </w:num>
+  <w:num w:numId="11" w16cid:durableId="1455516362">
     <w:abstractNumId w:val="10"/>
   </w:num>
-  <w:num w:numId="11" w16cid:durableId="1455516362">
+  <w:num w:numId="12" w16cid:durableId="1467889932">
+    <w:abstractNumId w:val="17"/>
+  </w:num>
+  <w:num w:numId="13" w16cid:durableId="1660846015">
+    <w:abstractNumId w:val="15"/>
+  </w:num>
+  <w:num w:numId="14" w16cid:durableId="1417359090">
+    <w:abstractNumId w:val="18"/>
+  </w:num>
+  <w:num w:numId="15" w16cid:durableId="348141585">
+    <w:abstractNumId w:val="11"/>
+  </w:num>
+  <w:num w:numId="16" w16cid:durableId="1321691836">
     <w:abstractNumId w:val="9"/>
+  </w:num>
+  <w:num w:numId="17" w16cid:durableId="1045567967">
+    <w:abstractNumId w:val="12"/>
+  </w:num>
+  <w:num w:numId="18" w16cid:durableId="664093814">
+    <w:abstractNumId w:val="13"/>
+  </w:num>
+  <w:num w:numId="19" w16cid:durableId="305472392">
+    <w:abstractNumId w:val="14"/>
+  </w:num>
+  <w:num w:numId="20" w16cid:durableId="923226267">
+    <w:abstractNumId w:val="19"/>
   </w:num>
 </w:numbering>
 </file>
@@ -2629,7 +3671,7 @@
     <w:lsdException w:name="Medium Shading 2 Accent 1" w:uiPriority="64"/>
     <w:lsdException w:name="Medium List 1 Accent 1" w:uiPriority="65"/>
     <w:lsdException w:name="Revision" w:semiHidden="1"/>
-    <w:lsdException w:name="List Paragraph" w:uiPriority="34" w:qFormat="1"/>
+    <w:lsdException w:name="List Paragraph" w:uiPriority="1" w:qFormat="1"/>
     <w:lsdException w:name="Quote" w:uiPriority="29" w:qFormat="1"/>
     <w:lsdException w:name="Intense Quote" w:uiPriority="30" w:qFormat="1"/>
     <w:lsdException w:name="Medium List 2 Accent 1" w:uiPriority="66"/>
@@ -3243,7 +4285,7 @@
   <w:style w:type="paragraph" w:styleId="ListParagraph">
     <w:name w:val="List Paragraph"/>
     <w:basedOn w:val="Normal"/>
-    <w:uiPriority w:val="34"/>
+    <w:uiPriority w:val="1"/>
     <w:qFormat/>
     <w:rsid w:val="00FC693F"/>
     <w:pPr>
@@ -13811,6 +14853,24 @@
     <w:name w:val="apple-converted-space"/>
     <w:basedOn w:val="DefaultParagraphFont"/>
     <w:rsid w:val="009F4D9E"/>
+  </w:style>
+  <w:style w:type="paragraph" w:customStyle="1" w:styleId="TableParagraph">
+    <w:name w:val="Table Paragraph"/>
+    <w:basedOn w:val="Normal"/>
+    <w:uiPriority w:val="1"/>
+    <w:qFormat/>
+    <w:rsid w:val="001806D6"/>
+    <w:pPr>
+      <w:widowControl w:val="0"/>
+      <w:autoSpaceDE w:val="0"/>
+      <w:autoSpaceDN w:val="0"/>
+      <w:spacing w:before="95" w:after="0" w:line="240" w:lineRule="auto"/>
+      <w:ind w:left="156"/>
+    </w:pPr>
+    <w:rPr>
+      <w:rFonts w:ascii="Arial" w:eastAsia="Arial" w:hAnsi="Arial" w:cs="Arial"/>
+      <w:color w:val="auto"/>
+    </w:rPr>
   </w:style>
 </w:styles>
 </file>

</xml_diff>

<commit_message>
v6: Helen's final edits
- Part 1: Single proofreading paragraph (Argument for: Technology has made us lazier)
- Part 2: Cleft structures table + popular culture examples (teacher reference)
- Part 3A: 5 It-cleft practice sets
- Part 3B: 5 Wh/All-cleft practice sets
- Part 3C: Enhanced paragraph transformation with multiple sample answers per item
</commit_message>
<xml_diff>
--- a/Lesson 4 - Cleft sentences (Student's).docx
+++ b/Lesson 4 - Cleft sentences (Student's).docx
@@ -22,7 +22,7 @@
           <w:lang w:eastAsia="zh-TW"/>
         </w:rPr>
         <w:drawing>
-          <wp:anchor distT="0" distB="0" distL="114300" distR="114300" simplePos="0" relativeHeight="251659264" behindDoc="0" locked="0" layoutInCell="1" allowOverlap="1" wp14:anchorId="7570E6DD" wp14:editId="6B8AC110">
+          <wp:anchor distT="0" distB="0" distL="114300" distR="114300" simplePos="0" relativeHeight="251658240" behindDoc="0" locked="0" layoutInCell="1" allowOverlap="1" wp14:anchorId="7570E6DD" wp14:editId="6B8AC110">
             <wp:simplePos x="0" y="0"/>
             <wp:positionH relativeFrom="column">
               <wp:posOffset>4621161</wp:posOffset>
@@ -173,7 +173,13 @@
         <w:rPr>
           <w:rFonts w:cs="Times New Roman"/>
         </w:rPr>
-        <w:t xml:space="preserve">Each paragraph contains FIVE errors. The errors include </w:t>
+        <w:t>The following</w:t>
+      </w:r>
+      <w:r>
+        <w:rPr>
+          <w:rFonts w:cs="Times New Roman"/>
+        </w:rPr>
+        <w:t xml:space="preserve"> paragraph contains FIVE errors. The errors include </w:t>
       </w:r>
       <w:r>
         <w:rPr>
@@ -273,69 +279,6 @@
           </w:p>
         </w:tc>
       </w:tr>
-      <w:tr>
-        <w:tc>
-          <w:tcPr>
-            <w:tcW w:w="9350" w:type="dxa"/>
-          </w:tcPr>
-          <w:p>
-            <w:pPr>
-              <w:spacing w:before="240" w:line="600" w:lineRule="auto"/>
-              <w:rPr>
-                <w:rFonts w:cs="Times New Roman"/>
-              </w:rPr>
-            </w:pPr>
-            <w:r>
-              <w:rPr>
-                <w:rFonts w:cs="Times New Roman"/>
-              </w:rPr>
-              <w:t>Argument against: Technology has made us lazier. (5 errors)</w:t>
-            </w:r>
-          </w:p>
-          <w:p>
-            <w:pPr>
-              <w:spacing w:before="240" w:line="600" w:lineRule="auto"/>
-              <w:rPr>
-                <w:rFonts w:cs="Times New Roman"/>
-              </w:rPr>
-            </w:pPr>
-            <w:r>
-              <w:rPr>
-                <w:rFonts w:cs="Times New Roman"/>
-              </w:rPr>
-              <w:t xml:space="preserve">Critics argue that technology has destroyed our generation. Nevertheless, the truth is that adults have simply misunderstood how we work. What they refuse to accept is that digital tools have allowed young people to accomplish more than the previous generation, for who technology was not available. The believe that real work must involve physical sweat ignores the fact that running a website demands just as much effort. Seldom critics acknowledge that a teenager editing videos is working just as hard as someone lifting boxes. The reason why teenagers seem distracted is not lazy but the creative work they are doing on their phones. Only when adults look at the results of their </w:t>
-            </w:r>
-            <w:proofErr w:type="gramStart"/>
-            <w:r>
-              <w:rPr>
-                <w:rFonts w:cs="Times New Roman"/>
-              </w:rPr>
-              <w:t>work</w:t>
-            </w:r>
-            <w:proofErr w:type="gramEnd"/>
-            <w:r>
-              <w:rPr>
-                <w:rFonts w:cs="Times New Roman"/>
-              </w:rPr>
-              <w:t xml:space="preserve"> they can understand what teenagers </w:t>
-            </w:r>
-            <w:proofErr w:type="gramStart"/>
-            <w:r>
-              <w:rPr>
-                <w:rFonts w:cs="Times New Roman"/>
-              </w:rPr>
-              <w:t>actually achieve</w:t>
-            </w:r>
-            <w:proofErr w:type="gramEnd"/>
-            <w:r>
-              <w:rPr>
-                <w:rFonts w:cs="Times New Roman"/>
-              </w:rPr>
-              <w:t>.</w:t>
-            </w:r>
-          </w:p>
-        </w:tc>
-      </w:tr>
     </w:tbl>
     <w:p>
       <w:pPr>
@@ -356,7 +299,6 @@
         <w:t>Part 2: Cleft sentences in formal writing</w:t>
       </w:r>
     </w:p>
-    <w:p/>
     <w:p>
       <w:pPr>
         <w:spacing w:before="200"/>
@@ -367,7 +309,6 @@
           <w:color w:val="1B365D"/>
           <w:sz w:val="28"/>
         </w:rPr>
-        <w:lastRenderedPageBreak/>
         <w:t>1. Why Use Cleft Sentences in DSE Writing?</w:t>
       </w:r>
     </w:p>
@@ -457,8 +398,8 @@
       </w:tblPr>
       <w:tblGrid>
         <w:gridCol w:w="1080"/>
-        <w:gridCol w:w="3240"/>
-        <w:gridCol w:w="720"/>
+        <w:gridCol w:w="2070"/>
+        <w:gridCol w:w="1890"/>
         <w:gridCol w:w="4752"/>
       </w:tblGrid>
       <w:tr>
@@ -531,7 +472,7 @@
         </w:tc>
         <w:tc>
           <w:tcPr>
-            <w:tcW w:w="3240" w:type="dxa"/>
+            <w:tcW w:w="2070" w:type="dxa"/>
           </w:tcPr>
           <w:p>
             <w:pPr>
@@ -561,7 +502,7 @@
         </w:tc>
         <w:tc>
           <w:tcPr>
-            <w:tcW w:w="5472" w:type="dxa"/>
+            <w:tcW w:w="6642" w:type="dxa"/>
             <w:gridSpan w:val="2"/>
           </w:tcPr>
           <w:p>
@@ -673,6 +614,7 @@
             </w:pPr>
             <w:proofErr w:type="spellStart"/>
             <w:r>
+              <w:lastRenderedPageBreak/>
               <w:t>Wh</w:t>
             </w:r>
             <w:proofErr w:type="spellEnd"/>
@@ -683,7 +625,7 @@
         </w:tc>
         <w:tc>
           <w:tcPr>
-            <w:tcW w:w="3240" w:type="dxa"/>
+            <w:tcW w:w="2070" w:type="dxa"/>
             <w:shd w:val="clear" w:color="auto" w:fill="F7FAFC"/>
           </w:tcPr>
           <w:p>
@@ -728,7 +670,7 @@
         </w:tc>
         <w:tc>
           <w:tcPr>
-            <w:tcW w:w="5472" w:type="dxa"/>
+            <w:tcW w:w="6642" w:type="dxa"/>
             <w:gridSpan w:val="2"/>
             <w:shd w:val="clear" w:color="auto" w:fill="F7FAFC"/>
           </w:tcPr>
@@ -857,7 +799,7 @@
         </w:tc>
         <w:tc>
           <w:tcPr>
-            <w:tcW w:w="3240" w:type="dxa"/>
+            <w:tcW w:w="2070" w:type="dxa"/>
           </w:tcPr>
           <w:p>
             <w:pPr>
@@ -894,7 +836,7 @@
         </w:tc>
         <w:tc>
           <w:tcPr>
-            <w:tcW w:w="5472" w:type="dxa"/>
+            <w:tcW w:w="6642" w:type="dxa"/>
             <w:gridSpan w:val="2"/>
           </w:tcPr>
           <w:p>
@@ -990,6 +932,11 @@
           <w:p>
             <w:pPr>
               <w:spacing w:before="60" w:after="60"/>
+              <w:rPr>
+                <w:b/>
+                <w:bCs/>
+                <w:u w:val="single"/>
+              </w:rPr>
             </w:pPr>
             <w:r>
               <w:t xml:space="preserve">All (that) algorithms do is </w:t>
@@ -1045,7 +992,6 @@
         </w:tc>
       </w:tr>
     </w:tbl>
-    <w:p/>
     <w:p>
       <w:pPr>
         <w:spacing w:before="200"/>
@@ -1055,33 +1001,12 @@
           <w:sz w:val="28"/>
         </w:rPr>
       </w:pPr>
-    </w:p>
-    <w:p>
-      <w:pPr>
-        <w:spacing w:before="200"/>
-        <w:rPr>
-          <w:b/>
-          <w:color w:val="1B365D"/>
-          <w:sz w:val="28"/>
-        </w:rPr>
-      </w:pPr>
-    </w:p>
-    <w:p>
-      <w:pPr>
-        <w:spacing w:before="200"/>
-        <w:rPr>
-          <w:b/>
-          <w:color w:val="1B365D"/>
-          <w:sz w:val="28"/>
-        </w:rPr>
-      </w:pPr>
       <w:r>
         <w:rPr>
           <w:b/>
           <w:color w:val="1B365D"/>
           <w:sz w:val="28"/>
         </w:rPr>
-        <w:lastRenderedPageBreak/>
         <w:t xml:space="preserve">3. </w:t>
       </w:r>
       <w:r>
@@ -1363,6 +1288,7 @@
         <w:rPr>
           <w:bCs/>
         </w:rPr>
+        <w:lastRenderedPageBreak/>
         <w:t>Online anonymity</w:t>
       </w:r>
       <w:r>
@@ -1614,7 +1540,6 @@
         <w:spacing w:after="80"/>
       </w:pPr>
       <w:r>
-        <w:lastRenderedPageBreak/>
         <w:t>Modern teenagers desire instant validation through likes and comments. [</w:t>
       </w:r>
       <w:proofErr w:type="spellStart"/>
@@ -1788,12 +1713,49 @@
       </w:pPr>
     </w:p>
     <w:p>
+      <w:pPr>
+        <w:rPr>
+          <w:b/>
+          <w:color w:val="1B365D"/>
+          <w:sz w:val="24"/>
+        </w:rPr>
+      </w:pPr>
+    </w:p>
+    <w:p>
+      <w:pPr>
+        <w:rPr>
+          <w:b/>
+          <w:color w:val="1B365D"/>
+          <w:sz w:val="24"/>
+        </w:rPr>
+      </w:pPr>
+    </w:p>
+    <w:p>
+      <w:pPr>
+        <w:rPr>
+          <w:b/>
+          <w:color w:val="1B365D"/>
+          <w:sz w:val="24"/>
+        </w:rPr>
+      </w:pPr>
+    </w:p>
+    <w:p>
+      <w:pPr>
+        <w:rPr>
+          <w:b/>
+          <w:color w:val="1B365D"/>
+          <w:sz w:val="24"/>
+        </w:rPr>
+      </w:pPr>
+    </w:p>
+    <w:p>
       <w:r>
         <w:rPr>
           <w:b/>
           <w:color w:val="1B365D"/>
           <w:sz w:val="24"/>
         </w:rPr>
+        <w:lastRenderedPageBreak/>
         <w:t>Part C: DSE Proofreading &amp; Sentence Transformation (Paragraph Context)</w:t>
       </w:r>
       <w:r>
@@ -1855,6 +1817,10 @@
           <w:p>
             <w:pPr>
               <w:spacing w:before="40" w:after="40" w:line="360" w:lineRule="auto"/>
+              <w:rPr>
+                <w:b/>
+                <w:color w:val="1B365D"/>
+              </w:rPr>
             </w:pPr>
             <w:r>
               <w:rPr>
@@ -1863,21 +1829,48 @@
               </w:rPr>
               <w:t>Student Writing Draft (HKDSE Essay - Topic: Digital Well-being)</w:t>
             </w:r>
-            <w:r>
+          </w:p>
+          <w:p>
+            <w:pPr>
+              <w:spacing w:before="40" w:after="40" w:line="360" w:lineRule="auto"/>
               <w:rPr>
                 <w:b/>
                 <w:color w:val="1B365D"/>
               </w:rPr>
-              <w:br/>
-            </w:r>
+            </w:pPr>
+          </w:p>
+          <w:p>
+            <w:pPr>
+              <w:spacing w:before="40" w:after="40" w:line="360" w:lineRule="auto"/>
+              <w:rPr>
+                <w:b/>
+                <w:color w:val="1B365D"/>
+              </w:rPr>
+            </w:pPr>
             <w:r>
               <w:rPr>
                 <w:sz w:val="21"/>
               </w:rPr>
-              <w:t xml:space="preserve">Many critics argue that technology breeds isolation. (1) </w:t>
+              <w:t xml:space="preserve">While digital platforms promise seamless connectivity across global boundaries, many sociologists argue that hyper-connectivity </w:t>
+            </w:r>
+            <w:proofErr w:type="gramStart"/>
+            <w:r>
+              <w:rPr>
+                <w:sz w:val="21"/>
+              </w:rPr>
+              <w:t>actually breeds</w:t>
+            </w:r>
+            <w:proofErr w:type="gramEnd"/>
+            <w:r>
+              <w:rPr>
+                <w:sz w:val="21"/>
+              </w:rPr>
+              <w:t xml:space="preserve"> unprecedented emotional isolation. (1) </w:t>
             </w:r>
             <w:r>
               <w:rPr>
+                <w:b/>
+                <w:bCs/>
                 <w:sz w:val="21"/>
                 <w:u w:val="single"/>
               </w:rPr>
@@ -1887,10 +1880,12 @@
               <w:rPr>
                 <w:sz w:val="21"/>
               </w:rPr>
-              <w:t xml:space="preserve">. Consequently, young people feel lonely even when connected. (2) </w:t>
+              <w:t xml:space="preserve">. As a result, online interactions often feel superficial, leaving young people feeling increasingly isolated despite being constantly reached by peers. To address this growing digital crisis, measures like banning mobile phones in schools are inadequate and fail to address the root cause. (2) </w:t>
             </w:r>
             <w:r>
               <w:rPr>
+                <w:b/>
+                <w:bCs/>
                 <w:sz w:val="21"/>
                 <w:u w:val="single"/>
               </w:rPr>
@@ -1900,27 +1895,49 @@
               <w:rPr>
                 <w:sz w:val="21"/>
               </w:rPr>
-              <w:t xml:space="preserve">. (3) </w:t>
+              <w:t xml:space="preserve">. Furthermore, tech monopolies intentionally design algorithms to keep users hooked for as long as possible. (3) </w:t>
             </w:r>
             <w:r>
               <w:rPr>
+                <w:b/>
+                <w:bCs/>
                 <w:sz w:val="21"/>
                 <w:u w:val="single"/>
               </w:rPr>
-              <w:t>Social media algorithms exploit human psychology for financial profit</w:t>
+              <w:t xml:space="preserve">Social media algorithms </w:t>
+            </w:r>
+            <w:r>
+              <w:rPr>
+                <w:b/>
+                <w:bCs/>
+                <w:sz w:val="21"/>
+                <w:u w:val="single"/>
+              </w:rPr>
+              <w:t>only care about</w:t>
+            </w:r>
+            <w:r>
+              <w:rPr>
+                <w:b/>
+                <w:bCs/>
+                <w:sz w:val="21"/>
+                <w:u w:val="single"/>
+              </w:rPr>
+              <w:t xml:space="preserve"> financial profit</w:t>
             </w:r>
             <w:r>
               <w:rPr>
                 <w:sz w:val="21"/>
               </w:rPr>
-              <w:t xml:space="preserve">. (4) </w:t>
+              <w:t xml:space="preserve">. Ultimately, technology itself is neither inherently good nor evil; the key lies in how mindfully we choose to navigate the digital realm. (4) </w:t>
             </w:r>
             <w:r>
               <w:rPr>
+                <w:b/>
+                <w:bCs/>
                 <w:sz w:val="21"/>
                 <w:u w:val="single"/>
               </w:rPr>
-              <w:t>Users only require a conscious boundaries setting to regain control over their time</w:t>
+              <w:t>Users require a conscious boundaries setting to regain control over their time</w:t>
             </w:r>
             <w:r>
               <w:rPr>
@@ -1929,9 +1946,19 @@
               <w:t>.</w:t>
             </w:r>
           </w:p>
+          <w:p>
+            <w:pPr>
+              <w:spacing w:before="40" w:after="40" w:line="360" w:lineRule="auto"/>
+            </w:pPr>
+          </w:p>
         </w:tc>
       </w:tr>
     </w:tbl>
+    <w:p>
+      <w:pPr>
+        <w:spacing w:after="80"/>
+      </w:pPr>
+    </w:p>
     <w:p>
       <w:pPr>
         <w:spacing w:after="80"/>
@@ -1949,6 +1976,9 @@
       <w:r>
         <w:t>________________________________________________________________________________________________________________________________________________________________________________</w:t>
       </w:r>
+      <w:r>
+        <w:br/>
+      </w:r>
     </w:p>
     <w:p>
       <w:pPr>
@@ -1962,6 +1992,9 @@
       <w:r>
         <w:t>________________________________________________________________________________________________________________________________________________________________________________</w:t>
       </w:r>
+      <w:r>
+        <w:br/>
+      </w:r>
     </w:p>
     <w:p>
       <w:pPr>
@@ -1974,6 +2007,9 @@
       </w:pPr>
       <w:r>
         <w:t>________________________________________________________________________________________________________________________________________________________________________________</w:t>
+      </w:r>
+      <w:r>
+        <w:br/>
       </w:r>
     </w:p>
     <w:p>

</xml_diff>